<commit_message>
Edited Review 1 Report
</commit_message>
<xml_diff>
--- a/docs/Review 1 Report.docx
+++ b/docs/Review 1 Report.docx
@@ -143,16 +143,8 @@
               <w:rPr>
                 <w:rFonts w:ascii="Times New Roman" w:hAnsi="Times New Roman" w:cs="Times New Roman"/>
               </w:rPr>
-              <w:t xml:space="preserve">Guided </w:t>
+              <w:t>Guided By:-</w:t>
             </w:r>
-            <w:proofErr w:type="gramStart"/>
-            <w:r>
-              <w:rPr>
-                <w:rFonts w:ascii="Times New Roman" w:hAnsi="Times New Roman" w:cs="Times New Roman"/>
-              </w:rPr>
-              <w:t>By:-</w:t>
-            </w:r>
-            <w:proofErr w:type="gramEnd"/>
           </w:p>
         </w:tc>
       </w:tr>
@@ -204,25 +196,7 @@
                 <w:sz w:val="24"/>
                 <w:szCs w:val="24"/>
               </w:rPr>
-              <w:t xml:space="preserve">Prof. Umesh </w:t>
-            </w:r>
-            <w:proofErr w:type="spellStart"/>
-            <w:r>
-              <w:rPr>
-                <w:bCs/>
-                <w:sz w:val="24"/>
-                <w:szCs w:val="24"/>
-              </w:rPr>
-              <w:t>Lakhtariya</w:t>
-            </w:r>
-            <w:proofErr w:type="spellEnd"/>
-            <w:r>
-              <w:rPr>
-                <w:bCs/>
-                <w:sz w:val="24"/>
-                <w:szCs w:val="24"/>
-              </w:rPr>
-              <w:t xml:space="preserve"> (Internal)</w:t>
+              <w:t>Prof. Umesh Lakhtariya (Internal)</w:t>
             </w:r>
           </w:p>
         </w:tc>
@@ -1495,17 +1469,8 @@
                 <w:sz w:val="28"/>
                 <w:szCs w:val="28"/>
               </w:rPr>
-              <w:t xml:space="preserve">odel </w:t>
+              <w:t>odel Maintainence</w:t>
             </w:r>
-            <w:proofErr w:type="spellStart"/>
-            <w:r>
-              <w:rPr>
-                <w:sz w:val="28"/>
-                <w:szCs w:val="28"/>
-              </w:rPr>
-              <w:t>Maintainence</w:t>
-            </w:r>
-            <w:proofErr w:type="spellEnd"/>
           </w:p>
         </w:tc>
         <w:tc>
@@ -1719,23 +1684,7 @@
                 <w:sz w:val="28"/>
                 <w:szCs w:val="28"/>
               </w:rPr>
-              <w:t xml:space="preserve">              5.1 List </w:t>
-            </w:r>
-            <w:proofErr w:type="gramStart"/>
-            <w:r>
-              <w:rPr>
-                <w:sz w:val="28"/>
-                <w:szCs w:val="28"/>
-              </w:rPr>
-              <w:t>Of</w:t>
-            </w:r>
-            <w:proofErr w:type="gramEnd"/>
-            <w:r>
-              <w:rPr>
-                <w:sz w:val="28"/>
-                <w:szCs w:val="28"/>
-              </w:rPr>
-              <w:t xml:space="preserve"> Major Activities </w:t>
+              <w:t xml:space="preserve">              5.1 List Of Major Activities </w:t>
             </w:r>
           </w:p>
         </w:tc>
@@ -1893,21 +1842,7 @@
                 <w:sz w:val="28"/>
                 <w:szCs w:val="28"/>
               </w:rPr>
-              <w:t xml:space="preserve">              6.1 </w:t>
-            </w:r>
-            <w:r>
-              <w:rPr>
-                <w:sz w:val="28"/>
-                <w:szCs w:val="28"/>
-              </w:rPr>
-              <w:t>P</w:t>
-            </w:r>
-            <w:r>
-              <w:rPr>
-                <w:sz w:val="28"/>
-                <w:szCs w:val="28"/>
-              </w:rPr>
-              <w:t>roject Execution Workflow</w:t>
+              <w:t xml:space="preserve">              6.1 Project Execution Workflow</w:t>
             </w:r>
           </w:p>
         </w:tc>
@@ -1950,14 +1885,7 @@
                 <w:sz w:val="28"/>
                 <w:szCs w:val="28"/>
               </w:rPr>
-              <w:t xml:space="preserve">                    6.1.1 </w:t>
-            </w:r>
-            <w:r>
-              <w:rPr>
-                <w:sz w:val="28"/>
-                <w:szCs w:val="28"/>
-              </w:rPr>
-              <w:t>Sequential Execution Steps</w:t>
+              <w:t xml:space="preserve">                    6.1.1 Sequential Execution Steps</w:t>
             </w:r>
           </w:p>
         </w:tc>
@@ -2236,14 +2164,7 @@
                 <w:sz w:val="28"/>
                 <w:szCs w:val="28"/>
               </w:rPr>
-              <w:t xml:space="preserve">6.3.2 </w:t>
-            </w:r>
-            <w:r>
-              <w:rPr>
-                <w:sz w:val="28"/>
-                <w:szCs w:val="28"/>
-              </w:rPr>
-              <w:t>System Performance Metrics</w:t>
+              <w:t>6.3.2 System Performance Metrics</w:t>
             </w:r>
           </w:p>
         </w:tc>
@@ -2394,14 +2315,7 @@
                 <w:sz w:val="28"/>
                 <w:szCs w:val="28"/>
               </w:rPr>
-              <w:t xml:space="preserve">6.4.1 </w:t>
-            </w:r>
-            <w:r>
-              <w:rPr>
-                <w:sz w:val="28"/>
-                <w:szCs w:val="28"/>
-              </w:rPr>
-              <w:t>Core System Capabilities</w:t>
+              <w:t>6.4.1 Core System Capabilities</w:t>
             </w:r>
           </w:p>
         </w:tc>
@@ -2451,17 +2365,8 @@
                 <w:sz w:val="28"/>
                 <w:szCs w:val="28"/>
               </w:rPr>
-              <w:t xml:space="preserve">6.5 Coding </w:t>
+              <w:t>6.5 Coding Explaination</w:t>
             </w:r>
-            <w:proofErr w:type="spellStart"/>
-            <w:r>
-              <w:rPr>
-                <w:sz w:val="28"/>
-                <w:szCs w:val="28"/>
-              </w:rPr>
-              <w:t>Explaination</w:t>
-            </w:r>
-            <w:proofErr w:type="spellEnd"/>
           </w:p>
         </w:tc>
         <w:tc>
@@ -2620,6 +2525,13 @@
                 <w:szCs w:val="28"/>
               </w:rPr>
             </w:pPr>
+            <w:r>
+              <w:rPr>
+                <w:sz w:val="28"/>
+                <w:szCs w:val="28"/>
+              </w:rPr>
+              <w:t>32</w:t>
+            </w:r>
           </w:p>
         </w:tc>
       </w:tr>
@@ -3343,21 +3255,12 @@
                 <w:szCs w:val="28"/>
               </w:rPr>
             </w:pPr>
-            <w:proofErr w:type="spellStart"/>
             <w:r>
               <w:rPr>
                 <w:sz w:val="28"/>
                 <w:szCs w:val="28"/>
               </w:rPr>
-              <w:t>Jupyter</w:t>
-            </w:r>
-            <w:proofErr w:type="spellEnd"/>
-            <w:r>
-              <w:rPr>
-                <w:sz w:val="28"/>
-                <w:szCs w:val="28"/>
-              </w:rPr>
-              <w:t xml:space="preserve"> Notebook</w:t>
+              <w:t>Jupyter Notebook</w:t>
             </w:r>
           </w:p>
         </w:tc>
@@ -3484,21 +3387,12 @@
                 <w:szCs w:val="28"/>
               </w:rPr>
             </w:pPr>
-            <w:proofErr w:type="spellStart"/>
             <w:r>
               <w:rPr>
                 <w:sz w:val="28"/>
                 <w:szCs w:val="28"/>
               </w:rPr>
-              <w:t>Supabase</w:t>
-            </w:r>
-            <w:proofErr w:type="spellEnd"/>
-            <w:r>
-              <w:rPr>
-                <w:sz w:val="28"/>
-                <w:szCs w:val="28"/>
-              </w:rPr>
-              <w:t xml:space="preserve"> Storage</w:t>
+              <w:t>Supabase Storage</w:t>
             </w:r>
           </w:p>
         </w:tc>
@@ -3537,21 +3431,12 @@
                 <w:szCs w:val="28"/>
               </w:rPr>
             </w:pPr>
-            <w:proofErr w:type="spellStart"/>
             <w:r>
               <w:rPr>
                 <w:sz w:val="28"/>
                 <w:szCs w:val="28"/>
               </w:rPr>
-              <w:t>Supabase</w:t>
-            </w:r>
-            <w:proofErr w:type="spellEnd"/>
-            <w:r>
-              <w:rPr>
-                <w:sz w:val="28"/>
-                <w:szCs w:val="28"/>
-              </w:rPr>
-              <w:t xml:space="preserve"> PostgreSQL</w:t>
+              <w:t>Supabase PostgreSQL</w:t>
             </w:r>
           </w:p>
         </w:tc>
@@ -3590,21 +3475,12 @@
                 <w:szCs w:val="28"/>
               </w:rPr>
             </w:pPr>
-            <w:proofErr w:type="spellStart"/>
             <w:r>
               <w:rPr>
                 <w:sz w:val="28"/>
                 <w:szCs w:val="28"/>
               </w:rPr>
-              <w:t>Supabase</w:t>
-            </w:r>
-            <w:proofErr w:type="spellEnd"/>
-            <w:r>
-              <w:rPr>
-                <w:sz w:val="28"/>
-                <w:szCs w:val="28"/>
-              </w:rPr>
-              <w:t xml:space="preserve"> Auth</w:t>
+              <w:t>Supabase Auth</w:t>
             </w:r>
           </w:p>
         </w:tc>
@@ -4287,18 +4163,8 @@
           <w:sz w:val="32"/>
           <w:szCs w:val="32"/>
         </w:rPr>
-        <w:t xml:space="preserve">Model </w:t>
-      </w:r>
-      <w:proofErr w:type="spellStart"/>
-      <w:r>
-        <w:rPr>
-          <w:rFonts w:ascii="Times New Roman" w:hAnsi="Times New Roman" w:cs="Times New Roman"/>
-          <w:sz w:val="32"/>
-          <w:szCs w:val="32"/>
-        </w:rPr>
-        <w:t>Inforamtion</w:t>
-      </w:r>
-      <w:proofErr w:type="spellEnd"/>
+        <w:t>Model Inforamtion</w:t>
+      </w:r>
     </w:p>
     <w:p>
       <w:pPr>
@@ -4363,18 +4229,8 @@
           <w:sz w:val="28"/>
           <w:szCs w:val="28"/>
         </w:rPr>
-        <w:t>Framework: TensorFlow/</w:t>
-      </w:r>
-      <w:proofErr w:type="spellStart"/>
-      <w:r>
-        <w:rPr>
-          <w:rFonts w:ascii="Times New Roman" w:hAnsi="Times New Roman" w:cs="Times New Roman"/>
-          <w:sz w:val="28"/>
-          <w:szCs w:val="28"/>
-        </w:rPr>
-        <w:t>Keras</w:t>
-      </w:r>
-      <w:proofErr w:type="spellEnd"/>
+        <w:t>Framework: TensorFlow/Keras</w:t>
+      </w:r>
     </w:p>
     <w:p>
       <w:pPr>
@@ -4739,25 +4595,7 @@
           <w:sz w:val="28"/>
           <w:szCs w:val="28"/>
         </w:rPr>
-        <w:t xml:space="preserve">Vibration (mm/s) - </w:t>
-      </w:r>
-      <w:proofErr w:type="gramStart"/>
-      <w:r>
-        <w:rPr>
-          <w:rFonts w:ascii="Times New Roman" w:hAnsi="Times New Roman" w:cs="Times New Roman"/>
-          <w:sz w:val="28"/>
-          <w:szCs w:val="28"/>
-        </w:rPr>
-        <w:t>Multi-axis</w:t>
-      </w:r>
-      <w:proofErr w:type="gramEnd"/>
-      <w:r>
-        <w:rPr>
-          <w:rFonts w:ascii="Times New Roman" w:hAnsi="Times New Roman" w:cs="Times New Roman"/>
-          <w:sz w:val="28"/>
-          <w:szCs w:val="28"/>
-        </w:rPr>
-        <w:t xml:space="preserve"> vibration measurements</w:t>
+        <w:t>Vibration (mm/s) - Multi-axis vibration measurements</w:t>
       </w:r>
     </w:p>
     <w:p>
@@ -4982,25 +4820,7 @@
           <w:sz w:val="28"/>
           <w:szCs w:val="28"/>
         </w:rPr>
-        <w:t xml:space="preserve">Read CSV files from </w:t>
-      </w:r>
-      <w:proofErr w:type="spellStart"/>
-      <w:r>
-        <w:rPr>
-          <w:rFonts w:ascii="Times New Roman" w:hAnsi="Times New Roman" w:cs="Times New Roman"/>
-          <w:sz w:val="28"/>
-          <w:szCs w:val="28"/>
-        </w:rPr>
-        <w:t>Supabase</w:t>
-      </w:r>
-      <w:proofErr w:type="spellEnd"/>
-      <w:r>
-        <w:rPr>
-          <w:rFonts w:ascii="Times New Roman" w:hAnsi="Times New Roman" w:cs="Times New Roman"/>
-          <w:sz w:val="28"/>
-          <w:szCs w:val="28"/>
-        </w:rPr>
-        <w:t xml:space="preserve"> storage</w:t>
+        <w:t>Read CSV files from Supabase storage</w:t>
       </w:r>
     </w:p>
     <w:p>
@@ -5019,18 +4839,8 @@
           <w:sz w:val="28"/>
           <w:szCs w:val="28"/>
         </w:rPr>
-        <w:t xml:space="preserve">Merge multiple datasets by timestamp and </w:t>
-      </w:r>
-      <w:proofErr w:type="spellStart"/>
-      <w:r>
-        <w:rPr>
-          <w:rFonts w:ascii="Times New Roman" w:hAnsi="Times New Roman" w:cs="Times New Roman"/>
-          <w:sz w:val="28"/>
-          <w:szCs w:val="28"/>
-        </w:rPr>
-        <w:t>motor_id</w:t>
-      </w:r>
-      <w:proofErr w:type="spellEnd"/>
+        <w:t>Merge multiple datasets by timestamp and motor_id</w:t>
+      </w:r>
     </w:p>
     <w:p>
       <w:pPr>
@@ -5346,25 +5156,7 @@
           <w:sz w:val="28"/>
           <w:szCs w:val="28"/>
         </w:rPr>
-        <w:t xml:space="preserve">Sequence Length: </w:t>
-      </w:r>
-      <w:proofErr w:type="gramStart"/>
-      <w:r>
-        <w:rPr>
-          <w:rFonts w:ascii="Times New Roman" w:hAnsi="Times New Roman" w:cs="Times New Roman"/>
-          <w:sz w:val="28"/>
-          <w:szCs w:val="28"/>
-        </w:rPr>
-        <w:t>30 time</w:t>
-      </w:r>
-      <w:proofErr w:type="gramEnd"/>
-      <w:r>
-        <w:rPr>
-          <w:rFonts w:ascii="Times New Roman" w:hAnsi="Times New Roman" w:cs="Times New Roman"/>
-          <w:sz w:val="28"/>
-          <w:szCs w:val="28"/>
-        </w:rPr>
-        <w:t xml:space="preserve"> steps (30 minutes of data)</w:t>
+        <w:t>Sequence Length: 30 time steps (30 minutes of data)</w:t>
       </w:r>
     </w:p>
     <w:p>
@@ -5730,18 +5522,8 @@
           <w:sz w:val="28"/>
           <w:szCs w:val="28"/>
         </w:rPr>
-        <w:t xml:space="preserve">Loss Function: Binary </w:t>
-      </w:r>
-      <w:proofErr w:type="spellStart"/>
-      <w:r>
-        <w:rPr>
-          <w:rFonts w:ascii="Times New Roman" w:hAnsi="Times New Roman" w:cs="Times New Roman"/>
-          <w:sz w:val="28"/>
-          <w:szCs w:val="28"/>
-        </w:rPr>
-        <w:t>Crossentropy</w:t>
-      </w:r>
-      <w:proofErr w:type="spellEnd"/>
+        <w:t>Loss Function: Binary Crossentropy</w:t>
+      </w:r>
     </w:p>
     <w:p>
       <w:pPr>
@@ -6166,25 +5948,7 @@
           <w:sz w:val="28"/>
           <w:szCs w:val="28"/>
         </w:rPr>
-        <w:t xml:space="preserve">Calculate binary </w:t>
-      </w:r>
-      <w:proofErr w:type="spellStart"/>
-      <w:r>
-        <w:rPr>
-          <w:rFonts w:ascii="Times New Roman" w:hAnsi="Times New Roman" w:cs="Times New Roman"/>
-          <w:sz w:val="28"/>
-          <w:szCs w:val="28"/>
-        </w:rPr>
-        <w:t>crossentropy</w:t>
-      </w:r>
-      <w:proofErr w:type="spellEnd"/>
-      <w:r>
-        <w:rPr>
-          <w:rFonts w:ascii="Times New Roman" w:hAnsi="Times New Roman" w:cs="Times New Roman"/>
-          <w:sz w:val="28"/>
-          <w:szCs w:val="28"/>
-        </w:rPr>
-        <w:t xml:space="preserve"> loss</w:t>
+        <w:t>Calculate binary crossentropy loss</w:t>
       </w:r>
     </w:p>
     <w:p>
@@ -8417,25 +8181,7 @@
           <w:sz w:val="28"/>
           <w:szCs w:val="28"/>
         </w:rPr>
-        <w:t xml:space="preserve">Install required software (Python, VS Code, </w:t>
-      </w:r>
-      <w:proofErr w:type="spellStart"/>
-      <w:r>
-        <w:rPr>
-          <w:rFonts w:ascii="Times New Roman" w:hAnsi="Times New Roman" w:cs="Times New Roman"/>
-          <w:sz w:val="28"/>
-          <w:szCs w:val="28"/>
-        </w:rPr>
-        <w:t>Jupyter</w:t>
-      </w:r>
-      <w:proofErr w:type="spellEnd"/>
-      <w:r>
-        <w:rPr>
-          <w:rFonts w:ascii="Times New Roman" w:hAnsi="Times New Roman" w:cs="Times New Roman"/>
-          <w:sz w:val="28"/>
-          <w:szCs w:val="28"/>
-        </w:rPr>
-        <w:t>, Tableau)</w:t>
+        <w:t>Install required software (Python, VS Code, Jupyter, Tableau)</w:t>
       </w:r>
     </w:p>
     <w:p>
@@ -8557,25 +8303,7 @@
           <w:sz w:val="28"/>
           <w:szCs w:val="28"/>
         </w:rPr>
-        <w:t xml:space="preserve">Create and configure </w:t>
-      </w:r>
-      <w:proofErr w:type="spellStart"/>
-      <w:r>
-        <w:rPr>
-          <w:rFonts w:ascii="Times New Roman" w:hAnsi="Times New Roman" w:cs="Times New Roman"/>
-          <w:sz w:val="28"/>
-          <w:szCs w:val="28"/>
-        </w:rPr>
-        <w:t>Supabase</w:t>
-      </w:r>
-      <w:proofErr w:type="spellEnd"/>
-      <w:r>
-        <w:rPr>
-          <w:rFonts w:ascii="Times New Roman" w:hAnsi="Times New Roman" w:cs="Times New Roman"/>
-          <w:sz w:val="28"/>
-          <w:szCs w:val="28"/>
-        </w:rPr>
-        <w:t xml:space="preserve"> project</w:t>
+        <w:t>Create and configure Supabase project</w:t>
       </w:r>
     </w:p>
     <w:p>
@@ -8619,43 +8347,7 @@
           <w:sz w:val="28"/>
           <w:szCs w:val="28"/>
         </w:rPr>
-        <w:t>Design database tables (</w:t>
-      </w:r>
-      <w:proofErr w:type="spellStart"/>
-      <w:r>
-        <w:rPr>
-          <w:rFonts w:ascii="Times New Roman" w:hAnsi="Times New Roman" w:cs="Times New Roman"/>
-          <w:sz w:val="28"/>
-          <w:szCs w:val="28"/>
-        </w:rPr>
-        <w:t>login_logs</w:t>
-      </w:r>
-      <w:proofErr w:type="spellEnd"/>
-      <w:r>
-        <w:rPr>
-          <w:rFonts w:ascii="Times New Roman" w:hAnsi="Times New Roman" w:cs="Times New Roman"/>
-          <w:sz w:val="28"/>
-          <w:szCs w:val="28"/>
-        </w:rPr>
-        <w:t xml:space="preserve">, </w:t>
-      </w:r>
-      <w:proofErr w:type="spellStart"/>
-      <w:r>
-        <w:rPr>
-          <w:rFonts w:ascii="Times New Roman" w:hAnsi="Times New Roman" w:cs="Times New Roman"/>
-          <w:sz w:val="28"/>
-          <w:szCs w:val="28"/>
-        </w:rPr>
-        <w:t>model_predictions</w:t>
-      </w:r>
-      <w:proofErr w:type="spellEnd"/>
-      <w:r>
-        <w:rPr>
-          <w:rFonts w:ascii="Times New Roman" w:hAnsi="Times New Roman" w:cs="Times New Roman"/>
-          <w:sz w:val="28"/>
-          <w:szCs w:val="28"/>
-        </w:rPr>
-        <w:t>)</w:t>
+        <w:t>Design database tables (login_logs, model_predictions)</w:t>
       </w:r>
     </w:p>
     <w:p>
@@ -8733,25 +8425,7 @@
           <w:sz w:val="28"/>
           <w:szCs w:val="28"/>
         </w:rPr>
-        <w:t xml:space="preserve">Develop </w:t>
-      </w:r>
-      <w:proofErr w:type="spellStart"/>
-      <w:r>
-        <w:rPr>
-          <w:rFonts w:ascii="Times New Roman" w:hAnsi="Times New Roman" w:cs="Times New Roman"/>
-          <w:sz w:val="28"/>
-          <w:szCs w:val="28"/>
-        </w:rPr>
-        <w:t>Supabase</w:t>
-      </w:r>
-      <w:proofErr w:type="spellEnd"/>
-      <w:r>
-        <w:rPr>
-          <w:rFonts w:ascii="Times New Roman" w:hAnsi="Times New Roman" w:cs="Times New Roman"/>
-          <w:sz w:val="28"/>
-          <w:szCs w:val="28"/>
-        </w:rPr>
-        <w:t xml:space="preserve"> connection module</w:t>
+        <w:t>Develop Supabase connection module</w:t>
       </w:r>
     </w:p>
     <w:p>
@@ -9202,18 +8876,8 @@
           <w:sz w:val="28"/>
           <w:szCs w:val="28"/>
         </w:rPr>
-        <w:t xml:space="preserve">Implement authentication using </w:t>
-      </w:r>
-      <w:proofErr w:type="spellStart"/>
-      <w:r>
-        <w:rPr>
-          <w:rFonts w:ascii="Times New Roman" w:hAnsi="Times New Roman" w:cs="Times New Roman"/>
-          <w:sz w:val="28"/>
-          <w:szCs w:val="28"/>
-        </w:rPr>
-        <w:t>Supabase</w:t>
-      </w:r>
-      <w:proofErr w:type="spellEnd"/>
+        <w:t>Implement authentication using Supabase</w:t>
+      </w:r>
     </w:p>
     <w:p>
       <w:pPr>
@@ -9268,25 +8932,7 @@
           <w:szCs w:val="32"/>
           <w:lang w:bidi="en-US"/>
         </w:rPr>
-        <w:t>Logging</w:t>
-      </w:r>
-      <w:r>
-        <w:rPr>
-          <w:rFonts w:ascii="Times New Roman" w:hAnsi="Times New Roman" w:cs="Times New Roman"/>
-          <w:sz w:val="32"/>
-          <w:szCs w:val="32"/>
-          <w:lang w:bidi="en-US"/>
-        </w:rPr>
-        <w:t xml:space="preserve"> &amp;</w:t>
-      </w:r>
-      <w:r>
-        <w:rPr>
-          <w:rFonts w:ascii="Times New Roman" w:hAnsi="Times New Roman" w:cs="Times New Roman"/>
-          <w:sz w:val="32"/>
-          <w:szCs w:val="32"/>
-          <w:lang w:bidi="en-US"/>
-        </w:rPr>
-        <w:t xml:space="preserve"> Monitoring </w:t>
+        <w:t xml:space="preserve">Logging &amp; Monitoring </w:t>
       </w:r>
     </w:p>
     <w:p>
@@ -9330,25 +8976,7 @@
           <w:sz w:val="28"/>
           <w:szCs w:val="28"/>
         </w:rPr>
-        <w:t xml:space="preserve">Store logs in </w:t>
-      </w:r>
-      <w:proofErr w:type="spellStart"/>
-      <w:r>
-        <w:rPr>
-          <w:rFonts w:ascii="Times New Roman" w:hAnsi="Times New Roman" w:cs="Times New Roman"/>
-          <w:sz w:val="28"/>
-          <w:szCs w:val="28"/>
-        </w:rPr>
-        <w:t>Supabase</w:t>
-      </w:r>
-      <w:proofErr w:type="spellEnd"/>
-      <w:r>
-        <w:rPr>
-          <w:rFonts w:ascii="Times New Roman" w:hAnsi="Times New Roman" w:cs="Times New Roman"/>
-          <w:sz w:val="28"/>
-          <w:szCs w:val="28"/>
-        </w:rPr>
-        <w:t xml:space="preserve"> database</w:t>
+        <w:t>Store logs in Supabase database</w:t>
       </w:r>
     </w:p>
     <w:p>
@@ -9553,15 +9181,7 @@
           <w:szCs w:val="32"/>
         </w:rPr>
         <w:lastRenderedPageBreak/>
-        <w:t xml:space="preserve">5.2 </w:t>
-      </w:r>
-      <w:r>
-        <w:rPr>
-          <w:rFonts w:ascii="Times New Roman" w:hAnsi="Times New Roman" w:cs="Times New Roman"/>
-          <w:sz w:val="32"/>
-          <w:szCs w:val="32"/>
-        </w:rPr>
-        <w:t>Estimated Time Durations</w:t>
+        <w:t>5.2 Estimated Time Durations</w:t>
       </w:r>
     </w:p>
     <w:p>
@@ -9884,117 +9504,7 @@
           <w:sz w:val="28"/>
           <w:szCs w:val="28"/>
         </w:rPr>
-        <w:t xml:space="preserve"> like </w:t>
-      </w:r>
-      <w:r>
-        <w:rPr>
-          <w:rFonts w:ascii="Times New Roman" w:hAnsi="Times New Roman" w:cs="Times New Roman"/>
-          <w:sz w:val="28"/>
-          <w:szCs w:val="28"/>
-        </w:rPr>
-        <w:t xml:space="preserve">Pandas, </w:t>
-      </w:r>
-      <w:proofErr w:type="gramStart"/>
-      <w:r>
-        <w:rPr>
-          <w:rFonts w:ascii="Times New Roman" w:hAnsi="Times New Roman" w:cs="Times New Roman"/>
-          <w:sz w:val="28"/>
-          <w:szCs w:val="28"/>
-        </w:rPr>
-        <w:t>NumPy</w:t>
-      </w:r>
-      <w:r>
-        <w:rPr>
-          <w:rFonts w:ascii="Times New Roman" w:hAnsi="Times New Roman" w:cs="Times New Roman"/>
-          <w:sz w:val="28"/>
-          <w:szCs w:val="28"/>
-        </w:rPr>
-        <w:t xml:space="preserve"> ,</w:t>
-      </w:r>
-      <w:r>
-        <w:rPr>
-          <w:rFonts w:ascii="Times New Roman" w:hAnsi="Times New Roman" w:cs="Times New Roman"/>
-          <w:sz w:val="28"/>
-          <w:szCs w:val="28"/>
-        </w:rPr>
-        <w:t>TensorFlow</w:t>
-      </w:r>
-      <w:proofErr w:type="gramEnd"/>
-      <w:r>
-        <w:rPr>
-          <w:rFonts w:ascii="Times New Roman" w:hAnsi="Times New Roman" w:cs="Times New Roman"/>
-          <w:sz w:val="28"/>
-          <w:szCs w:val="28"/>
-        </w:rPr>
-        <w:t>/</w:t>
-      </w:r>
-      <w:proofErr w:type="spellStart"/>
-      <w:r>
-        <w:rPr>
-          <w:rFonts w:ascii="Times New Roman" w:hAnsi="Times New Roman" w:cs="Times New Roman"/>
-          <w:sz w:val="28"/>
-          <w:szCs w:val="28"/>
-        </w:rPr>
-        <w:t>Keras</w:t>
-      </w:r>
-      <w:proofErr w:type="spellEnd"/>
-      <w:r>
-        <w:rPr>
-          <w:rFonts w:ascii="Times New Roman" w:hAnsi="Times New Roman" w:cs="Times New Roman"/>
-          <w:sz w:val="28"/>
-          <w:szCs w:val="28"/>
-        </w:rPr>
-        <w:t xml:space="preserve">, </w:t>
-      </w:r>
-      <w:proofErr w:type="spellStart"/>
-      <w:r>
-        <w:rPr>
-          <w:rFonts w:ascii="Times New Roman" w:hAnsi="Times New Roman" w:cs="Times New Roman"/>
-          <w:sz w:val="28"/>
-          <w:szCs w:val="28"/>
-        </w:rPr>
-        <w:t>Supabase</w:t>
-      </w:r>
-      <w:proofErr w:type="spellEnd"/>
-      <w:r>
-        <w:rPr>
-          <w:rFonts w:ascii="Times New Roman" w:hAnsi="Times New Roman" w:cs="Times New Roman"/>
-          <w:sz w:val="28"/>
-          <w:szCs w:val="28"/>
-        </w:rPr>
-        <w:t xml:space="preserve"> client</w:t>
-      </w:r>
-      <w:r>
-        <w:rPr>
-          <w:rFonts w:ascii="Times New Roman" w:hAnsi="Times New Roman" w:cs="Times New Roman"/>
-          <w:sz w:val="28"/>
-          <w:szCs w:val="28"/>
-        </w:rPr>
-        <w:t xml:space="preserve">, </w:t>
-      </w:r>
-      <w:r>
-        <w:rPr>
-          <w:rFonts w:ascii="Times New Roman" w:hAnsi="Times New Roman" w:cs="Times New Roman"/>
-          <w:sz w:val="28"/>
-          <w:szCs w:val="28"/>
-        </w:rPr>
-        <w:t>Flask</w:t>
-      </w:r>
-      <w:r>
-        <w:rPr>
-          <w:rFonts w:ascii="Times New Roman" w:hAnsi="Times New Roman" w:cs="Times New Roman"/>
-          <w:sz w:val="28"/>
-          <w:szCs w:val="28"/>
-        </w:rPr>
-        <w:t xml:space="preserve">, </w:t>
-      </w:r>
-      <w:r>
-        <w:rPr>
-          <w:rFonts w:ascii="Times New Roman" w:hAnsi="Times New Roman" w:cs="Times New Roman"/>
-          <w:sz w:val="28"/>
-          <w:szCs w:val="28"/>
-        </w:rPr>
-        <w:t>Scikit-learn</w:t>
+        <w:t xml:space="preserve"> like Pandas, NumPy ,TensorFlow/Keras, Supabase client, Flask, Scikit-learn</w:t>
       </w:r>
     </w:p>
     <w:p>
@@ -10027,23 +9537,7 @@
           <w:sz w:val="28"/>
           <w:szCs w:val="28"/>
         </w:rPr>
-        <w:t>Step 2: Configure Environment Variables</w:t>
-      </w:r>
-      <w:r>
-        <w:rPr>
-          <w:rFonts w:ascii="Times New Roman" w:hAnsi="Times New Roman" w:cs="Times New Roman"/>
-          <w:sz w:val="28"/>
-          <w:szCs w:val="28"/>
-        </w:rPr>
-        <w:t xml:space="preserve"> </w:t>
-      </w:r>
-      <w:r>
-        <w:rPr>
-          <w:rFonts w:ascii="Times New Roman" w:hAnsi="Times New Roman" w:cs="Times New Roman"/>
-          <w:sz w:val="28"/>
-          <w:szCs w:val="28"/>
-        </w:rPr>
-        <w:t>Required Variables:</w:t>
+        <w:t>Step 2: Configure Environment Variables Required Variables:</w:t>
       </w:r>
     </w:p>
     <w:p>
@@ -10062,25 +9556,7 @@
           <w:sz w:val="28"/>
           <w:szCs w:val="28"/>
         </w:rPr>
-        <w:t xml:space="preserve">- SUPABASE_URL: Your </w:t>
-      </w:r>
-      <w:proofErr w:type="spellStart"/>
-      <w:r>
-        <w:rPr>
-          <w:rFonts w:ascii="Times New Roman" w:hAnsi="Times New Roman" w:cs="Times New Roman"/>
-          <w:sz w:val="28"/>
-          <w:szCs w:val="28"/>
-        </w:rPr>
-        <w:t>Supabase</w:t>
-      </w:r>
-      <w:proofErr w:type="spellEnd"/>
-      <w:r>
-        <w:rPr>
-          <w:rFonts w:ascii="Times New Roman" w:hAnsi="Times New Roman" w:cs="Times New Roman"/>
-          <w:sz w:val="28"/>
-          <w:szCs w:val="28"/>
-        </w:rPr>
-        <w:t xml:space="preserve"> project URL</w:t>
+        <w:t>- SUPABASE_URL: Your Supabase project URL</w:t>
       </w:r>
     </w:p>
     <w:p>
@@ -10099,25 +9575,7 @@
           <w:sz w:val="28"/>
           <w:szCs w:val="28"/>
         </w:rPr>
-        <w:t xml:space="preserve">- SUPABASE_KEY: Your </w:t>
-      </w:r>
-      <w:proofErr w:type="spellStart"/>
-      <w:r>
-        <w:rPr>
-          <w:rFonts w:ascii="Times New Roman" w:hAnsi="Times New Roman" w:cs="Times New Roman"/>
-          <w:sz w:val="28"/>
-          <w:szCs w:val="28"/>
-        </w:rPr>
-        <w:t>Supabase</w:t>
-      </w:r>
-      <w:proofErr w:type="spellEnd"/>
-      <w:r>
-        <w:rPr>
-          <w:rFonts w:ascii="Times New Roman" w:hAnsi="Times New Roman" w:cs="Times New Roman"/>
-          <w:sz w:val="28"/>
-          <w:szCs w:val="28"/>
-        </w:rPr>
-        <w:t xml:space="preserve"> anon/service key</w:t>
+        <w:t>- SUPABASE_KEY: Your Supabase anon/service key</w:t>
       </w:r>
     </w:p>
     <w:p>
@@ -10188,25 +9646,7 @@
           <w:sz w:val="28"/>
           <w:szCs w:val="28"/>
         </w:rPr>
-        <w:t xml:space="preserve">Action: Create </w:t>
-      </w:r>
-      <w:proofErr w:type="spellStart"/>
-      <w:r>
-        <w:rPr>
-          <w:rFonts w:ascii="Times New Roman" w:hAnsi="Times New Roman" w:cs="Times New Roman"/>
-          <w:sz w:val="28"/>
-          <w:szCs w:val="28"/>
-        </w:rPr>
-        <w:t>Supabase</w:t>
-      </w:r>
-      <w:proofErr w:type="spellEnd"/>
-      <w:r>
-        <w:rPr>
-          <w:rFonts w:ascii="Times New Roman" w:hAnsi="Times New Roman" w:cs="Times New Roman"/>
-          <w:sz w:val="28"/>
-          <w:szCs w:val="28"/>
-        </w:rPr>
-        <w:t xml:space="preserve"> database tables using provided SQL scripts</w:t>
+        <w:t>Action: Create Supabase database tables using provided SQL scripts</w:t>
       </w:r>
     </w:p>
     <w:p>
@@ -10244,181 +9684,15 @@
           <w:sz w:val="28"/>
           <w:szCs w:val="28"/>
         </w:rPr>
-        <w:t xml:space="preserve">a) </w:t>
-      </w:r>
-      <w:proofErr w:type="spellStart"/>
-      <w:r>
-        <w:rPr>
-          <w:rFonts w:ascii="Times New Roman" w:hAnsi="Times New Roman" w:cs="Times New Roman"/>
-          <w:sz w:val="28"/>
-          <w:szCs w:val="28"/>
-        </w:rPr>
-        <w:t>login_logs</w:t>
-      </w:r>
-      <w:proofErr w:type="spellEnd"/>
-      <w:r>
-        <w:rPr>
-          <w:rFonts w:ascii="Times New Roman" w:hAnsi="Times New Roman" w:cs="Times New Roman"/>
-          <w:sz w:val="28"/>
-          <w:szCs w:val="28"/>
-        </w:rPr>
-        <w:t xml:space="preserve"> table:</w:t>
-      </w:r>
-      <w:r>
-        <w:rPr>
-          <w:rFonts w:ascii="Times New Roman" w:hAnsi="Times New Roman" w:cs="Times New Roman"/>
-          <w:sz w:val="28"/>
-          <w:szCs w:val="28"/>
-        </w:rPr>
-        <w:t xml:space="preserve"> </w:t>
-      </w:r>
-      <w:r>
-        <w:rPr>
-          <w:rFonts w:ascii="Times New Roman" w:hAnsi="Times New Roman" w:cs="Times New Roman"/>
-          <w:sz w:val="28"/>
-          <w:szCs w:val="28"/>
-        </w:rPr>
-        <w:t>id (</w:t>
-      </w:r>
-      <w:proofErr w:type="spellStart"/>
-      <w:r>
-        <w:rPr>
-          <w:rFonts w:ascii="Times New Roman" w:hAnsi="Times New Roman" w:cs="Times New Roman"/>
-          <w:sz w:val="28"/>
-          <w:szCs w:val="28"/>
-        </w:rPr>
-        <w:t>uuid</w:t>
-      </w:r>
-      <w:proofErr w:type="spellEnd"/>
-      <w:r>
-        <w:rPr>
-          <w:rFonts w:ascii="Times New Roman" w:hAnsi="Times New Roman" w:cs="Times New Roman"/>
-          <w:sz w:val="28"/>
-          <w:szCs w:val="28"/>
-        </w:rPr>
-        <w:t>, primary key)</w:t>
-      </w:r>
-      <w:r>
-        <w:rPr>
-          <w:rFonts w:ascii="Times New Roman" w:hAnsi="Times New Roman" w:cs="Times New Roman"/>
-          <w:sz w:val="28"/>
-          <w:szCs w:val="28"/>
-        </w:rPr>
-        <w:t xml:space="preserve">, </w:t>
-      </w:r>
-      <w:proofErr w:type="spellStart"/>
-      <w:r>
-        <w:rPr>
-          <w:rFonts w:ascii="Times New Roman" w:hAnsi="Times New Roman" w:cs="Times New Roman"/>
-          <w:sz w:val="28"/>
-          <w:szCs w:val="28"/>
-        </w:rPr>
-        <w:t>user_email</w:t>
-      </w:r>
-      <w:proofErr w:type="spellEnd"/>
-      <w:r>
-        <w:rPr>
-          <w:rFonts w:ascii="Times New Roman" w:hAnsi="Times New Roman" w:cs="Times New Roman"/>
-          <w:sz w:val="28"/>
-          <w:szCs w:val="28"/>
-        </w:rPr>
-        <w:t xml:space="preserve"> (text</w:t>
-      </w:r>
-      <w:proofErr w:type="gramStart"/>
-      <w:r>
-        <w:rPr>
-          <w:rFonts w:ascii="Times New Roman" w:hAnsi="Times New Roman" w:cs="Times New Roman"/>
-          <w:sz w:val="28"/>
-          <w:szCs w:val="28"/>
-        </w:rPr>
-        <w:t>)</w:t>
-      </w:r>
-      <w:r>
-        <w:rPr>
-          <w:rFonts w:ascii="Times New Roman" w:hAnsi="Times New Roman" w:cs="Times New Roman"/>
-          <w:sz w:val="28"/>
-          <w:szCs w:val="28"/>
-        </w:rPr>
-        <w:t>,</w:t>
-      </w:r>
-      <w:proofErr w:type="spellStart"/>
-      <w:r>
-        <w:rPr>
-          <w:rFonts w:ascii="Times New Roman" w:hAnsi="Times New Roman" w:cs="Times New Roman"/>
-          <w:sz w:val="28"/>
-          <w:szCs w:val="28"/>
-        </w:rPr>
-        <w:t>login</w:t>
-      </w:r>
-      <w:proofErr w:type="gramEnd"/>
-      <w:r>
-        <w:rPr>
-          <w:rFonts w:ascii="Times New Roman" w:hAnsi="Times New Roman" w:cs="Times New Roman"/>
-          <w:sz w:val="28"/>
-          <w:szCs w:val="28"/>
-        </w:rPr>
-        <w:t>_time</w:t>
-      </w:r>
-      <w:proofErr w:type="spellEnd"/>
-      <w:r>
-        <w:rPr>
-          <w:rFonts w:ascii="Times New Roman" w:hAnsi="Times New Roman" w:cs="Times New Roman"/>
-          <w:sz w:val="28"/>
-          <w:szCs w:val="28"/>
-        </w:rPr>
-        <w:t xml:space="preserve"> (timestamp)</w:t>
-      </w:r>
-      <w:r>
-        <w:rPr>
-          <w:rFonts w:ascii="Times New Roman" w:hAnsi="Times New Roman" w:cs="Times New Roman"/>
-          <w:sz w:val="28"/>
-          <w:szCs w:val="28"/>
-        </w:rPr>
-        <w:t xml:space="preserve">, </w:t>
-      </w:r>
-      <w:proofErr w:type="spellStart"/>
-      <w:r>
-        <w:rPr>
-          <w:rFonts w:ascii="Times New Roman" w:hAnsi="Times New Roman" w:cs="Times New Roman"/>
-          <w:sz w:val="28"/>
-          <w:szCs w:val="28"/>
-        </w:rPr>
-        <w:t>ip_address</w:t>
-      </w:r>
-      <w:proofErr w:type="spellEnd"/>
-      <w:r>
-        <w:rPr>
-          <w:rFonts w:ascii="Times New Roman" w:hAnsi="Times New Roman" w:cs="Times New Roman"/>
-          <w:sz w:val="28"/>
-          <w:szCs w:val="28"/>
-        </w:rPr>
-        <w:t xml:space="preserve"> (text)</w:t>
-      </w:r>
-      <w:r>
-        <w:rPr>
-          <w:rFonts w:ascii="Times New Roman" w:hAnsi="Times New Roman" w:cs="Times New Roman"/>
-          <w:sz w:val="28"/>
-          <w:szCs w:val="28"/>
-        </w:rPr>
-        <w:t xml:space="preserve">, </w:t>
-      </w:r>
-      <w:proofErr w:type="spellStart"/>
-      <w:r>
-        <w:rPr>
-          <w:rFonts w:ascii="Times New Roman" w:hAnsi="Times New Roman" w:cs="Times New Roman"/>
-          <w:sz w:val="28"/>
-          <w:szCs w:val="28"/>
-        </w:rPr>
-        <w:t>dashboard_accessed</w:t>
-      </w:r>
-      <w:proofErr w:type="spellEnd"/>
-      <w:r>
-        <w:rPr>
-          <w:rFonts w:ascii="Times New Roman" w:hAnsi="Times New Roman" w:cs="Times New Roman"/>
-          <w:sz w:val="28"/>
-          <w:szCs w:val="28"/>
-        </w:rPr>
-        <w:t xml:space="preserve"> (text)   </w:t>
+        <w:t>a) login_logs table:</w:t>
+      </w:r>
+      <w:r>
+        <w:rPr>
+          <w:rFonts w:ascii="Times New Roman" w:hAnsi="Times New Roman" w:cs="Times New Roman"/>
+          <w:sz w:val="28"/>
+          <w:szCs w:val="28"/>
+        </w:rPr>
+        <w:t xml:space="preserve"> id (uuid, primary key), user_email (text),login_time (timestamp), ip_address (text), dashboard_accessed (text)   </w:t>
       </w:r>
     </w:p>
     <w:p>
@@ -10448,93 +9722,15 @@
           <w:sz w:val="28"/>
           <w:szCs w:val="28"/>
         </w:rPr>
-        <w:t xml:space="preserve">b) </w:t>
-      </w:r>
-      <w:proofErr w:type="spellStart"/>
-      <w:r>
-        <w:rPr>
-          <w:rFonts w:ascii="Times New Roman" w:hAnsi="Times New Roman" w:cs="Times New Roman"/>
-          <w:sz w:val="28"/>
-          <w:szCs w:val="28"/>
-        </w:rPr>
-        <w:t>model_predictions</w:t>
-      </w:r>
-      <w:proofErr w:type="spellEnd"/>
-      <w:r>
-        <w:rPr>
-          <w:rFonts w:ascii="Times New Roman" w:hAnsi="Times New Roman" w:cs="Times New Roman"/>
-          <w:sz w:val="28"/>
-          <w:szCs w:val="28"/>
-        </w:rPr>
-        <w:t xml:space="preserve"> table:</w:t>
-      </w:r>
-      <w:r>
-        <w:rPr>
-          <w:rFonts w:ascii="Times New Roman" w:hAnsi="Times New Roman" w:cs="Times New Roman"/>
-          <w:sz w:val="28"/>
-          <w:szCs w:val="28"/>
-        </w:rPr>
-        <w:t xml:space="preserve"> t</w:t>
-      </w:r>
-      <w:r>
-        <w:rPr>
-          <w:rFonts w:ascii="Times New Roman" w:hAnsi="Times New Roman" w:cs="Times New Roman"/>
-          <w:sz w:val="28"/>
-          <w:szCs w:val="28"/>
-        </w:rPr>
-        <w:t>imestamp (timestamp)</w:t>
-      </w:r>
-      <w:r>
-        <w:rPr>
-          <w:rFonts w:ascii="Times New Roman" w:hAnsi="Times New Roman" w:cs="Times New Roman"/>
-          <w:sz w:val="28"/>
-          <w:szCs w:val="28"/>
-        </w:rPr>
-        <w:t xml:space="preserve">, </w:t>
-      </w:r>
-      <w:proofErr w:type="spellStart"/>
-      <w:r>
-        <w:rPr>
-          <w:rFonts w:ascii="Times New Roman" w:hAnsi="Times New Roman" w:cs="Times New Roman"/>
-          <w:sz w:val="28"/>
-          <w:szCs w:val="28"/>
-        </w:rPr>
-        <w:t>motor_id</w:t>
-      </w:r>
-      <w:proofErr w:type="spellEnd"/>
-      <w:r>
-        <w:rPr>
-          <w:rFonts w:ascii="Times New Roman" w:hAnsi="Times New Roman" w:cs="Times New Roman"/>
-          <w:sz w:val="28"/>
-          <w:szCs w:val="28"/>
-        </w:rPr>
-        <w:t xml:space="preserve"> (text)</w:t>
-      </w:r>
-      <w:r>
-        <w:rPr>
-          <w:rFonts w:ascii="Times New Roman" w:hAnsi="Times New Roman" w:cs="Times New Roman"/>
-          <w:sz w:val="28"/>
-          <w:szCs w:val="28"/>
-        </w:rPr>
-        <w:t xml:space="preserve">, </w:t>
-      </w:r>
-      <w:proofErr w:type="spellStart"/>
-      <w:r>
-        <w:rPr>
-          <w:rFonts w:ascii="Times New Roman" w:hAnsi="Times New Roman" w:cs="Times New Roman"/>
-          <w:sz w:val="28"/>
-          <w:szCs w:val="28"/>
-        </w:rPr>
-        <w:t>failure_probability</w:t>
-      </w:r>
-      <w:proofErr w:type="spellEnd"/>
-      <w:r>
-        <w:rPr>
-          <w:rFonts w:ascii="Times New Roman" w:hAnsi="Times New Roman" w:cs="Times New Roman"/>
-          <w:sz w:val="28"/>
-          <w:szCs w:val="28"/>
-        </w:rPr>
-        <w:t xml:space="preserve"> (float)</w:t>
+        <w:t>b) model_predictions table:</w:t>
+      </w:r>
+      <w:r>
+        <w:rPr>
+          <w:rFonts w:ascii="Times New Roman" w:hAnsi="Times New Roman" w:cs="Times New Roman"/>
+          <w:sz w:val="28"/>
+          <w:szCs w:val="28"/>
+        </w:rPr>
+        <w:t xml:space="preserve"> timestamp (timestamp), motor_id (text), failure_probability (float)</w:t>
       </w:r>
     </w:p>
     <w:p>
@@ -10575,25 +9771,7 @@
           <w:sz w:val="28"/>
           <w:szCs w:val="28"/>
         </w:rPr>
-        <w:t xml:space="preserve">Purpose: Download motor sensor data from </w:t>
-      </w:r>
-      <w:proofErr w:type="spellStart"/>
-      <w:r>
-        <w:rPr>
-          <w:rFonts w:ascii="Times New Roman" w:hAnsi="Times New Roman" w:cs="Times New Roman"/>
-          <w:sz w:val="28"/>
-          <w:szCs w:val="28"/>
-        </w:rPr>
-        <w:t>Supabase</w:t>
-      </w:r>
-      <w:proofErr w:type="spellEnd"/>
-      <w:r>
-        <w:rPr>
-          <w:rFonts w:ascii="Times New Roman" w:hAnsi="Times New Roman" w:cs="Times New Roman"/>
-          <w:sz w:val="28"/>
-          <w:szCs w:val="28"/>
-        </w:rPr>
-        <w:t xml:space="preserve"> storage</w:t>
+        <w:t>Purpose: Download motor sensor data from Supabase storage</w:t>
       </w:r>
     </w:p>
     <w:p>
@@ -10626,25 +9804,7 @@
           <w:sz w:val="28"/>
           <w:szCs w:val="28"/>
         </w:rPr>
-        <w:t xml:space="preserve">Step 5: Execute </w:t>
-      </w:r>
-      <w:proofErr w:type="spellStart"/>
-      <w:r>
-        <w:rPr>
-          <w:rFonts w:ascii="Times New Roman" w:hAnsi="Times New Roman" w:cs="Times New Roman"/>
-          <w:sz w:val="28"/>
-          <w:szCs w:val="28"/>
-        </w:rPr>
-        <w:t>Jupyter</w:t>
-      </w:r>
-      <w:proofErr w:type="spellEnd"/>
-      <w:r>
-        <w:rPr>
-          <w:rFonts w:ascii="Times New Roman" w:hAnsi="Times New Roman" w:cs="Times New Roman"/>
-          <w:sz w:val="28"/>
-          <w:szCs w:val="28"/>
-        </w:rPr>
-        <w:t xml:space="preserve"> Notebooks in Sequence</w:t>
+        <w:t>Step 5: Execute Jupyter Notebooks in Sequence</w:t>
       </w:r>
     </w:p>
     <w:p>
@@ -10758,18 +9918,8 @@
           <w:sz w:val="28"/>
           <w:szCs w:val="28"/>
         </w:rPr>
-        <w:t xml:space="preserve">- Output: Unified </w:t>
-      </w:r>
-      <w:proofErr w:type="spellStart"/>
-      <w:r>
-        <w:rPr>
-          <w:rFonts w:ascii="Times New Roman" w:hAnsi="Times New Roman" w:cs="Times New Roman"/>
-          <w:sz w:val="28"/>
-          <w:szCs w:val="28"/>
-        </w:rPr>
-        <w:t>DataFrame</w:t>
-      </w:r>
-      <w:proofErr w:type="spellEnd"/>
+        <w:t>- Output: Unified DataFrame</w:t>
+      </w:r>
     </w:p>
     <w:p>
       <w:pPr>
@@ -11495,25 +10645,7 @@
           <w:szCs w:val="28"/>
         </w:rPr>
         <w:lastRenderedPageBreak/>
-        <w:t xml:space="preserve">- Logs entry to </w:t>
-      </w:r>
-      <w:proofErr w:type="spellStart"/>
-      <w:r>
-        <w:rPr>
-          <w:rFonts w:ascii="Times New Roman" w:hAnsi="Times New Roman" w:cs="Times New Roman"/>
-          <w:sz w:val="28"/>
-          <w:szCs w:val="28"/>
-        </w:rPr>
-        <w:t>login_logs</w:t>
-      </w:r>
-      <w:proofErr w:type="spellEnd"/>
-      <w:r>
-        <w:rPr>
-          <w:rFonts w:ascii="Times New Roman" w:hAnsi="Times New Roman" w:cs="Times New Roman"/>
-          <w:sz w:val="28"/>
-          <w:szCs w:val="28"/>
-        </w:rPr>
-        <w:t xml:space="preserve"> table</w:t>
+        <w:t>- Logs entry to login_logs table</w:t>
       </w:r>
     </w:p>
     <w:p>
@@ -11612,27 +10744,7 @@
           <w:szCs w:val="28"/>
           <w:lang w:bidi="en-US"/>
         </w:rPr>
-        <w:t xml:space="preserve">- Check </w:t>
-      </w:r>
-      <w:proofErr w:type="spellStart"/>
-      <w:r>
-        <w:rPr>
-          <w:rFonts w:ascii="Times New Roman" w:hAnsi="Times New Roman" w:cs="Times New Roman"/>
-          <w:sz w:val="28"/>
-          <w:szCs w:val="28"/>
-          <w:lang w:bidi="en-US"/>
-        </w:rPr>
-        <w:t>login_logs</w:t>
-      </w:r>
-      <w:proofErr w:type="spellEnd"/>
-      <w:r>
-        <w:rPr>
-          <w:rFonts w:ascii="Times New Roman" w:hAnsi="Times New Roman" w:cs="Times New Roman"/>
-          <w:sz w:val="28"/>
-          <w:szCs w:val="28"/>
-          <w:lang w:bidi="en-US"/>
-        </w:rPr>
-        <w:t xml:space="preserve"> table for user activity</w:t>
+        <w:t>- Check login_logs table for user activity</w:t>
       </w:r>
     </w:p>
     <w:p>
@@ -11651,15 +10763,7 @@
           <w:sz w:val="28"/>
           <w:szCs w:val="28"/>
         </w:rPr>
-        <w:t xml:space="preserve">- </w:t>
-      </w:r>
-      <w:r>
-        <w:rPr>
-          <w:rFonts w:ascii="Times New Roman" w:hAnsi="Times New Roman" w:cs="Times New Roman"/>
-          <w:sz w:val="28"/>
-          <w:szCs w:val="28"/>
-        </w:rPr>
-        <w:t>Review error logs</w:t>
+        <w:t>- Review error logs</w:t>
       </w:r>
     </w:p>
     <w:p>
@@ -11733,23 +10837,7 @@
           <w:sz w:val="28"/>
           <w:szCs w:val="28"/>
         </w:rPr>
-        <w:t>Risk 1:</w:t>
-      </w:r>
-      <w:r>
-        <w:rPr>
-          <w:rFonts w:ascii="Times New Roman" w:hAnsi="Times New Roman" w:cs="Times New Roman"/>
-          <w:sz w:val="28"/>
-          <w:szCs w:val="28"/>
-        </w:rPr>
-        <w:t xml:space="preserve"> </w:t>
-      </w:r>
-      <w:r>
-        <w:rPr>
-          <w:rFonts w:ascii="Times New Roman" w:hAnsi="Times New Roman" w:cs="Times New Roman"/>
-          <w:sz w:val="28"/>
-          <w:szCs w:val="28"/>
-        </w:rPr>
-        <w:t>Data Quality Issues Affecting Model Accuracy</w:t>
+        <w:t>Risk 1: Data Quality Issues Affecting Model Accuracy</w:t>
       </w:r>
     </w:p>
     <w:p>
@@ -11793,18 +10881,8 @@
           <w:sz w:val="28"/>
           <w:szCs w:val="28"/>
         </w:rPr>
-        <w:t xml:space="preserve">Risk 3: API Rate Limits or Connectivity Issues with </w:t>
-      </w:r>
-      <w:proofErr w:type="spellStart"/>
-      <w:r>
-        <w:rPr>
-          <w:rFonts w:ascii="Times New Roman" w:hAnsi="Times New Roman" w:cs="Times New Roman"/>
-          <w:sz w:val="28"/>
-          <w:szCs w:val="28"/>
-        </w:rPr>
-        <w:t>Supabase</w:t>
-      </w:r>
-      <w:proofErr w:type="spellEnd"/>
+        <w:t>Risk 3: API Rate Limits or Connectivity Issues with Supabase</w:t>
+      </w:r>
     </w:p>
     <w:p>
       <w:pPr>
@@ -12383,27 +11461,7 @@
           <w:szCs w:val="28"/>
           <w:lang w:bidi="en-US"/>
         </w:rPr>
-        <w:t xml:space="preserve">Target: &lt; 5 </w:t>
-      </w:r>
-      <w:proofErr w:type="gramStart"/>
-      <w:r>
-        <w:rPr>
-          <w:rFonts w:ascii="Times New Roman" w:hAnsi="Times New Roman" w:cs="Times New Roman"/>
-          <w:sz w:val="28"/>
-          <w:szCs w:val="28"/>
-          <w:lang w:bidi="en-US"/>
-        </w:rPr>
-        <w:t>seconds</w:t>
-      </w:r>
-      <w:proofErr w:type="gramEnd"/>
-      <w:r>
-        <w:rPr>
-          <w:rFonts w:ascii="Times New Roman" w:hAnsi="Times New Roman" w:cs="Times New Roman"/>
-          <w:sz w:val="28"/>
-          <w:szCs w:val="28"/>
-          <w:lang w:bidi="en-US"/>
-        </w:rPr>
-        <w:t xml:space="preserve"> initial load</w:t>
+        <w:t>Target: &lt; 5 seconds initial load</w:t>
       </w:r>
     </w:p>
     <w:p>
@@ -12517,23 +11575,13 @@
           <w:szCs w:val="32"/>
         </w:rPr>
       </w:pPr>
-      <w:proofErr w:type="spellStart"/>
-      <w:r>
-        <w:rPr>
-          <w:rFonts w:ascii="Times New Roman" w:hAnsi="Times New Roman" w:cs="Times New Roman"/>
-          <w:sz w:val="32"/>
-          <w:szCs w:val="32"/>
-        </w:rPr>
-        <w:t>Buisness</w:t>
-      </w:r>
-      <w:proofErr w:type="spellEnd"/>
-      <w:r>
-        <w:rPr>
-          <w:rFonts w:ascii="Times New Roman" w:hAnsi="Times New Roman" w:cs="Times New Roman"/>
-          <w:sz w:val="32"/>
-          <w:szCs w:val="32"/>
-        </w:rPr>
-        <w:t xml:space="preserve"> metrices</w:t>
+      <w:r>
+        <w:rPr>
+          <w:rFonts w:ascii="Times New Roman" w:hAnsi="Times New Roman" w:cs="Times New Roman"/>
+          <w:sz w:val="32"/>
+          <w:szCs w:val="32"/>
+        </w:rPr>
+        <w:t>Buisness metrices</w:t>
       </w:r>
     </w:p>
     <w:p>
@@ -12939,6 +11987,7 @@
       <w:r>
         <w:rPr>
           <w:rFonts w:ascii="Times New Roman" w:hAnsi="Times New Roman" w:cs="Times New Roman"/>
+          <w:noProof/>
           <w:sz w:val="32"/>
           <w:szCs w:val="32"/>
         </w:rPr>
@@ -12991,6 +12040,7 @@
       <w:r>
         <w:rPr>
           <w:rFonts w:ascii="Times New Roman" w:hAnsi="Times New Roman" w:cs="Times New Roman"/>
+          <w:noProof/>
           <w:sz w:val="32"/>
           <w:szCs w:val="32"/>
         </w:rPr>
@@ -13044,6 +12094,7 @@
       <w:r>
         <w:rPr>
           <w:rFonts w:ascii="Times New Roman" w:hAnsi="Times New Roman" w:cs="Times New Roman"/>
+          <w:noProof/>
           <w:sz w:val="32"/>
           <w:szCs w:val="32"/>
         </w:rPr>
@@ -13096,6 +12147,7 @@
       <w:r>
         <w:rPr>
           <w:rFonts w:ascii="Times New Roman" w:hAnsi="Times New Roman" w:cs="Times New Roman"/>
+          <w:noProof/>
           <w:sz w:val="32"/>
           <w:szCs w:val="32"/>
         </w:rPr>
@@ -13149,6 +12201,7 @@
       <w:r>
         <w:rPr>
           <w:rFonts w:ascii="Times New Roman" w:hAnsi="Times New Roman" w:cs="Times New Roman"/>
+          <w:noProof/>
           <w:sz w:val="32"/>
           <w:szCs w:val="32"/>
         </w:rPr>
@@ -13201,6 +12254,7 @@
       <w:r>
         <w:rPr>
           <w:rFonts w:ascii="Times New Roman" w:hAnsi="Times New Roman" w:cs="Times New Roman"/>
+          <w:noProof/>
           <w:sz w:val="32"/>
           <w:szCs w:val="32"/>
         </w:rPr>
@@ -13254,6 +12308,7 @@
       <w:r>
         <w:rPr>
           <w:rFonts w:ascii="Times New Roman" w:hAnsi="Times New Roman" w:cs="Times New Roman"/>
+          <w:noProof/>
           <w:sz w:val="32"/>
           <w:szCs w:val="32"/>
         </w:rPr>
@@ -13306,6 +12361,7 @@
       <w:r>
         <w:rPr>
           <w:rFonts w:ascii="Times New Roman" w:hAnsi="Times New Roman" w:cs="Times New Roman"/>
+          <w:noProof/>
           <w:sz w:val="32"/>
           <w:szCs w:val="32"/>
         </w:rPr>
@@ -13358,6 +12414,7 @@
       <w:r>
         <w:rPr>
           <w:rFonts w:ascii="Times New Roman" w:hAnsi="Times New Roman" w:cs="Times New Roman"/>
+          <w:noProof/>
           <w:sz w:val="32"/>
           <w:szCs w:val="32"/>
         </w:rPr>
@@ -13408,48 +12465,6 @@
           <w:szCs w:val="32"/>
         </w:rPr>
       </w:pPr>
-      <w:r>
-        <w:rPr>
-          <w:rFonts w:ascii="Times New Roman" w:hAnsi="Times New Roman" w:cs="Times New Roman"/>
-          <w:sz w:val="32"/>
-          <w:szCs w:val="32"/>
-        </w:rPr>
-        <w:drawing>
-          <wp:inline distT="0" distB="0" distL="0" distR="0" wp14:anchorId="534A6ACB" wp14:editId="20D6144D">
-            <wp:extent cx="5943600" cy="3139440"/>
-            <wp:effectExtent l="0" t="0" r="0" b="3810"/>
-            <wp:docPr id="1178849571" name="Picture 1"/>
-            <wp:cNvGraphicFramePr>
-              <a:graphicFrameLocks xmlns:a="http://schemas.openxmlformats.org/drawingml/2006/main" noChangeAspect="1"/>
-            </wp:cNvGraphicFramePr>
-            <a:graphic xmlns:a="http://schemas.openxmlformats.org/drawingml/2006/main">
-              <a:graphicData uri="http://schemas.openxmlformats.org/drawingml/2006/picture">
-                <pic:pic xmlns:pic="http://schemas.openxmlformats.org/drawingml/2006/picture">
-                  <pic:nvPicPr>
-                    <pic:cNvPr id="1178849571" name=""/>
-                    <pic:cNvPicPr/>
-                  </pic:nvPicPr>
-                  <pic:blipFill>
-                    <a:blip r:embed="rId23"/>
-                    <a:stretch>
-                      <a:fillRect/>
-                    </a:stretch>
-                  </pic:blipFill>
-                  <pic:spPr>
-                    <a:xfrm>
-                      <a:off x="0" y="0"/>
-                      <a:ext cx="5943600" cy="3139440"/>
-                    </a:xfrm>
-                    <a:prstGeom prst="rect">
-                      <a:avLst/>
-                    </a:prstGeom>
-                  </pic:spPr>
-                </pic:pic>
-              </a:graphicData>
-            </a:graphic>
-          </wp:inline>
-        </w:drawing>
-      </w:r>
     </w:p>
     <w:p>
       <w:pPr>
@@ -13510,25 +12525,61 @@
           <w:sz w:val="28"/>
           <w:szCs w:val="28"/>
         </w:rPr>
-        <w:t xml:space="preserve">The backend of the system is developed using the Flask framework. It initializes the application, enables CORS for frontend-backend communication, and loads environment variables securely using the </w:t>
-      </w:r>
-      <w:proofErr w:type="spellStart"/>
-      <w:r>
-        <w:rPr>
-          <w:rFonts w:ascii="Times New Roman" w:hAnsi="Times New Roman" w:cs="Times New Roman"/>
-          <w:sz w:val="28"/>
-          <w:szCs w:val="28"/>
-        </w:rPr>
-        <w:t>dotenv</w:t>
-      </w:r>
-      <w:proofErr w:type="spellEnd"/>
-      <w:r>
-        <w:rPr>
-          <w:rFonts w:ascii="Times New Roman" w:hAnsi="Times New Roman" w:cs="Times New Roman"/>
-          <w:sz w:val="28"/>
-          <w:szCs w:val="28"/>
-        </w:rPr>
-        <w:t xml:space="preserve"> library. The application provides a root route that serves the login page and a /login API </w:t>
+        <w:t>The backend of the system is developed using the Flask framework. It initializes the application, enables CORS for frontend-backend communication, and loads environment variables securely using the dotenv library. The application provides a root route that serves the login page and a /login API endpoint that handles user authentication through POST requests. User credentials are validated using a custom authentication service, and login activities are recorded along with the user’s IP address. The backend dynamically reads configuration settings such as port number and debug mode from environment variables to maintain flexibility and security.</w:t>
+      </w:r>
+    </w:p>
+    <w:p>
+      <w:pPr>
+        <w:pStyle w:val="ListParagraph"/>
+        <w:rPr>
+          <w:rFonts w:ascii="Times New Roman" w:hAnsi="Times New Roman" w:cs="Times New Roman"/>
+          <w:sz w:val="32"/>
+          <w:szCs w:val="32"/>
+        </w:rPr>
+      </w:pPr>
+    </w:p>
+    <w:p>
+      <w:pPr>
+        <w:pStyle w:val="ListParagraph"/>
+        <w:numPr>
+          <w:ilvl w:val="0"/>
+          <w:numId w:val="17"/>
+        </w:numPr>
+        <w:rPr>
+          <w:rFonts w:ascii="Times New Roman" w:hAnsi="Times New Roman" w:cs="Times New Roman"/>
+          <w:sz w:val="32"/>
+          <w:szCs w:val="32"/>
+        </w:rPr>
+      </w:pPr>
+      <w:r>
+        <w:rPr>
+          <w:rFonts w:ascii="Times New Roman" w:hAnsi="Times New Roman" w:cs="Times New Roman"/>
+          <w:sz w:val="32"/>
+          <w:szCs w:val="32"/>
+        </w:rPr>
+        <w:t>Authentication &amp; Logging Service (auth_service.py)</w:t>
+      </w:r>
+    </w:p>
+    <w:p>
+      <w:pPr>
+        <w:pStyle w:val="ListParagraph"/>
+        <w:numPr>
+          <w:ilvl w:val="0"/>
+          <w:numId w:val="40"/>
+        </w:numPr>
+        <w:rPr>
+          <w:rFonts w:ascii="Times New Roman" w:hAnsi="Times New Roman" w:cs="Times New Roman"/>
+          <w:sz w:val="28"/>
+          <w:szCs w:val="28"/>
+        </w:rPr>
+      </w:pPr>
+      <w:r>
+        <w:rPr>
+          <w:rFonts w:ascii="Times New Roman" w:hAnsi="Times New Roman" w:cs="Times New Roman"/>
+          <w:sz w:val="28"/>
+          <w:szCs w:val="28"/>
+        </w:rPr>
+        <w:t xml:space="preserve">The authentication service manages user verification and login logging. Admin credentials are securely retrieved from environment variables. Upon successful authentication, user details including role information are returned. All login </w:t>
       </w:r>
       <w:r>
         <w:rPr>
@@ -13537,7 +12588,7 @@
           <w:szCs w:val="28"/>
         </w:rPr>
         <w:lastRenderedPageBreak/>
-        <w:t>endpoint that handles user authentication through POST requests. User credentials are validated using a custom authentication service, and login activities are recorded along with the user’s IP address. The backend dynamically reads configuration settings such as port number and debug mode from environment variables to maintain flexibility and security.</w:t>
+        <w:t>attempts (success or failure) are logged into a Supabase database table. The logging mechanism captures user email, IP address, login status, and timestamp. This ensures proper monitoring, traceability, and audit control within the system.</w:t>
       </w:r>
     </w:p>
     <w:p>
@@ -13569,7 +12620,7 @@
           <w:sz w:val="32"/>
           <w:szCs w:val="32"/>
         </w:rPr>
-        <w:t>Authentication &amp; Logging Service (auth_service.py)</w:t>
+        <w:t>Data Download Module (download_raw_data.py)</w:t>
       </w:r>
     </w:p>
     <w:p>
@@ -13591,78 +12642,6 @@
           <w:sz w:val="28"/>
           <w:szCs w:val="28"/>
         </w:rPr>
-        <w:t xml:space="preserve">The authentication service manages user verification and login logging. Admin credentials are securely retrieved from environment variables. Upon successful authentication, user details including role information are returned. All login attempts (success or failure) are logged into a </w:t>
-      </w:r>
-      <w:proofErr w:type="spellStart"/>
-      <w:r>
-        <w:rPr>
-          <w:rFonts w:ascii="Times New Roman" w:hAnsi="Times New Roman" w:cs="Times New Roman"/>
-          <w:sz w:val="28"/>
-          <w:szCs w:val="28"/>
-        </w:rPr>
-        <w:t>Supabase</w:t>
-      </w:r>
-      <w:proofErr w:type="spellEnd"/>
-      <w:r>
-        <w:rPr>
-          <w:rFonts w:ascii="Times New Roman" w:hAnsi="Times New Roman" w:cs="Times New Roman"/>
-          <w:sz w:val="28"/>
-          <w:szCs w:val="28"/>
-        </w:rPr>
-        <w:t xml:space="preserve"> database table. The logging mechanism captures user email, IP address, login status, and timestamp. This ensures proper monitoring, traceability, and audit control within the system.</w:t>
-      </w:r>
-    </w:p>
-    <w:p>
-      <w:pPr>
-        <w:pStyle w:val="ListParagraph"/>
-        <w:rPr>
-          <w:rFonts w:ascii="Times New Roman" w:hAnsi="Times New Roman" w:cs="Times New Roman"/>
-          <w:sz w:val="32"/>
-          <w:szCs w:val="32"/>
-        </w:rPr>
-      </w:pPr>
-    </w:p>
-    <w:p>
-      <w:pPr>
-        <w:pStyle w:val="ListParagraph"/>
-        <w:numPr>
-          <w:ilvl w:val="0"/>
-          <w:numId w:val="17"/>
-        </w:numPr>
-        <w:rPr>
-          <w:rFonts w:ascii="Times New Roman" w:hAnsi="Times New Roman" w:cs="Times New Roman"/>
-          <w:sz w:val="32"/>
-          <w:szCs w:val="32"/>
-        </w:rPr>
-      </w:pPr>
-      <w:r>
-        <w:rPr>
-          <w:rFonts w:ascii="Times New Roman" w:hAnsi="Times New Roman" w:cs="Times New Roman"/>
-          <w:sz w:val="32"/>
-          <w:szCs w:val="32"/>
-        </w:rPr>
-        <w:t>Data Download Module (download_raw_data.py)</w:t>
-      </w:r>
-    </w:p>
-    <w:p>
-      <w:pPr>
-        <w:pStyle w:val="ListParagraph"/>
-        <w:numPr>
-          <w:ilvl w:val="0"/>
-          <w:numId w:val="40"/>
-        </w:numPr>
-        <w:rPr>
-          <w:rFonts w:ascii="Times New Roman" w:hAnsi="Times New Roman" w:cs="Times New Roman"/>
-          <w:sz w:val="28"/>
-          <w:szCs w:val="28"/>
-        </w:rPr>
-      </w:pPr>
-      <w:r>
-        <w:rPr>
-          <w:rFonts w:ascii="Times New Roman" w:hAnsi="Times New Roman" w:cs="Times New Roman"/>
-          <w:sz w:val="28"/>
-          <w:szCs w:val="28"/>
-        </w:rPr>
         <w:t>This module is responsible for downloading raw sensor data from a configured URL stored in the environment file. The script retrieves the dataset using the requests library and stores it in the designated raw data directory. It ensures directory creation if it does not exist and validates the download status before saving the file. This module automates the data acquisition process.</w:t>
       </w:r>
     </w:p>
@@ -13739,48 +12718,92 @@
           <w:sz w:val="32"/>
           <w:szCs w:val="32"/>
         </w:rPr>
+        <w:t>Data Preprocessing Notebook</w:t>
+      </w:r>
+    </w:p>
+    <w:p>
+      <w:pPr>
+        <w:pStyle w:val="ListParagraph"/>
+        <w:numPr>
+          <w:ilvl w:val="0"/>
+          <w:numId w:val="43"/>
+        </w:numPr>
+        <w:rPr>
+          <w:rFonts w:ascii="Times New Roman" w:hAnsi="Times New Roman" w:cs="Times New Roman"/>
+          <w:sz w:val="28"/>
+          <w:szCs w:val="28"/>
+        </w:rPr>
+      </w:pPr>
+      <w:r>
+        <w:rPr>
+          <w:rFonts w:ascii="Times New Roman" w:hAnsi="Times New Roman" w:cs="Times New Roman"/>
+          <w:sz w:val="28"/>
+          <w:szCs w:val="28"/>
+        </w:rPr>
+        <w:t>In this stage, the raw data is cleaned and normalized. Missing values are removed, and sensor-related numerical columns are standardized using StandardScaler from Scikit-learn. The cleaned dataset is then saved into a processed data directory. This ensures consistent scaling and improves model performance during training.</w:t>
+      </w:r>
+    </w:p>
+    <w:p>
+      <w:pPr>
+        <w:pStyle w:val="ListParagraph"/>
+        <w:rPr>
+          <w:rFonts w:ascii="Times New Roman" w:hAnsi="Times New Roman" w:cs="Times New Roman"/>
+          <w:sz w:val="32"/>
+          <w:szCs w:val="32"/>
+        </w:rPr>
+      </w:pPr>
+    </w:p>
+    <w:p>
+      <w:pPr>
+        <w:pStyle w:val="ListParagraph"/>
+        <w:numPr>
+          <w:ilvl w:val="0"/>
+          <w:numId w:val="44"/>
+        </w:numPr>
+        <w:rPr>
+          <w:rFonts w:ascii="Times New Roman" w:hAnsi="Times New Roman" w:cs="Times New Roman"/>
+          <w:sz w:val="32"/>
+          <w:szCs w:val="32"/>
+        </w:rPr>
+      </w:pPr>
+      <w:r>
+        <w:rPr>
+          <w:rFonts w:ascii="Times New Roman" w:hAnsi="Times New Roman" w:cs="Times New Roman"/>
+          <w:sz w:val="32"/>
+          <w:szCs w:val="32"/>
+        </w:rPr>
+        <w:t>Sequence Builder Module</w:t>
+      </w:r>
+    </w:p>
+    <w:p>
+      <w:pPr>
+        <w:pStyle w:val="ListParagraph"/>
+        <w:numPr>
+          <w:ilvl w:val="0"/>
+          <w:numId w:val="46"/>
+        </w:numPr>
+        <w:rPr>
+          <w:rFonts w:ascii="Times New Roman" w:hAnsi="Times New Roman" w:cs="Times New Roman"/>
+          <w:sz w:val="28"/>
+          <w:szCs w:val="28"/>
+        </w:rPr>
+      </w:pPr>
+      <w:r>
+        <w:rPr>
+          <w:rFonts w:ascii="Times New Roman" w:hAnsi="Times New Roman" w:cs="Times New Roman"/>
+          <w:sz w:val="28"/>
+          <w:szCs w:val="28"/>
+        </w:rPr>
+        <w:t xml:space="preserve">The sequence builder prepares time-series data for LSTM model training. It converts the processed dataset into fixed-length sequences (sequence length = 30). Each sequence </w:t>
+      </w:r>
+      <w:r>
+        <w:rPr>
+          <w:rFonts w:ascii="Times New Roman" w:hAnsi="Times New Roman" w:cs="Times New Roman"/>
+          <w:sz w:val="28"/>
+          <w:szCs w:val="28"/>
+        </w:rPr>
         <w:lastRenderedPageBreak/>
-        <w:t>Data Preprocessing Notebook</w:t>
-      </w:r>
-    </w:p>
-    <w:p>
-      <w:pPr>
-        <w:pStyle w:val="ListParagraph"/>
-        <w:numPr>
-          <w:ilvl w:val="0"/>
-          <w:numId w:val="43"/>
-        </w:numPr>
-        <w:rPr>
-          <w:rFonts w:ascii="Times New Roman" w:hAnsi="Times New Roman" w:cs="Times New Roman"/>
-          <w:sz w:val="28"/>
-          <w:szCs w:val="28"/>
-        </w:rPr>
-      </w:pPr>
-      <w:r>
-        <w:rPr>
-          <w:rFonts w:ascii="Times New Roman" w:hAnsi="Times New Roman" w:cs="Times New Roman"/>
-          <w:sz w:val="28"/>
-          <w:szCs w:val="28"/>
-        </w:rPr>
-        <w:t xml:space="preserve">In this stage, the raw data is cleaned and normalized. Missing values are removed, and sensor-related numerical columns are standardized using </w:t>
-      </w:r>
-      <w:proofErr w:type="spellStart"/>
-      <w:r>
-        <w:rPr>
-          <w:rFonts w:ascii="Times New Roman" w:hAnsi="Times New Roman" w:cs="Times New Roman"/>
-          <w:sz w:val="28"/>
-          <w:szCs w:val="28"/>
-        </w:rPr>
-        <w:t>StandardScaler</w:t>
-      </w:r>
-      <w:proofErr w:type="spellEnd"/>
-      <w:r>
-        <w:rPr>
-          <w:rFonts w:ascii="Times New Roman" w:hAnsi="Times New Roman" w:cs="Times New Roman"/>
-          <w:sz w:val="28"/>
-          <w:szCs w:val="28"/>
-        </w:rPr>
-        <w:t xml:space="preserve"> from Scikit-learn. The cleaned dataset is then saved into a processed data directory. This ensures consistent scaling and improves model performance during training.</w:t>
+        <w:t>contains multiple sensor readings, and corresponding labels are generated. The input sequences (X) and output labels (y) are saved as NumPy arrays. This step transforms tabular data into a format suitable for deep learning.</w:t>
       </w:r>
     </w:p>
     <w:p>
@@ -13812,60 +12835,6 @@
           <w:sz w:val="32"/>
           <w:szCs w:val="32"/>
         </w:rPr>
-        <w:t>Sequence Builder Module</w:t>
-      </w:r>
-    </w:p>
-    <w:p>
-      <w:pPr>
-        <w:pStyle w:val="ListParagraph"/>
-        <w:numPr>
-          <w:ilvl w:val="0"/>
-          <w:numId w:val="46"/>
-        </w:numPr>
-        <w:rPr>
-          <w:rFonts w:ascii="Times New Roman" w:hAnsi="Times New Roman" w:cs="Times New Roman"/>
-          <w:sz w:val="28"/>
-          <w:szCs w:val="28"/>
-        </w:rPr>
-      </w:pPr>
-      <w:r>
-        <w:rPr>
-          <w:rFonts w:ascii="Times New Roman" w:hAnsi="Times New Roman" w:cs="Times New Roman"/>
-          <w:sz w:val="28"/>
-          <w:szCs w:val="28"/>
-        </w:rPr>
-        <w:t>The sequence builder prepares time-series data for LSTM model training. It converts the processed dataset into fixed-length sequences (sequence length = 30). Each sequence contains multiple sensor readings, and corresponding labels are generated. The input sequences (X) and output labels (y) are saved as NumPy arrays. This step transforms tabular data into a format suitable for deep learning.</w:t>
-      </w:r>
-    </w:p>
-    <w:p>
-      <w:pPr>
-        <w:pStyle w:val="ListParagraph"/>
-        <w:rPr>
-          <w:rFonts w:ascii="Times New Roman" w:hAnsi="Times New Roman" w:cs="Times New Roman"/>
-          <w:sz w:val="32"/>
-          <w:szCs w:val="32"/>
-        </w:rPr>
-      </w:pPr>
-    </w:p>
-    <w:p>
-      <w:pPr>
-        <w:pStyle w:val="ListParagraph"/>
-        <w:numPr>
-          <w:ilvl w:val="0"/>
-          <w:numId w:val="44"/>
-        </w:numPr>
-        <w:rPr>
-          <w:rFonts w:ascii="Times New Roman" w:hAnsi="Times New Roman" w:cs="Times New Roman"/>
-          <w:sz w:val="32"/>
-          <w:szCs w:val="32"/>
-        </w:rPr>
-      </w:pPr>
-      <w:r>
-        <w:rPr>
-          <w:rFonts w:ascii="Times New Roman" w:hAnsi="Times New Roman" w:cs="Times New Roman"/>
-          <w:sz w:val="32"/>
-          <w:szCs w:val="32"/>
-        </w:rPr>
         <w:t>Feature Selection Module</w:t>
       </w:r>
     </w:p>
@@ -13942,66 +12911,114 @@
           <w:sz w:val="28"/>
           <w:szCs w:val="28"/>
         </w:rPr>
-        <w:t xml:space="preserve">The deep learning model is built using TensorFlow and </w:t>
-      </w:r>
-      <w:proofErr w:type="spellStart"/>
-      <w:r>
-        <w:rPr>
-          <w:rFonts w:ascii="Times New Roman" w:hAnsi="Times New Roman" w:cs="Times New Roman"/>
-          <w:sz w:val="28"/>
-          <w:szCs w:val="28"/>
-        </w:rPr>
-        <w:t>Keras</w:t>
-      </w:r>
-      <w:proofErr w:type="spellEnd"/>
-      <w:r>
-        <w:rPr>
-          <w:rFonts w:ascii="Times New Roman" w:hAnsi="Times New Roman" w:cs="Times New Roman"/>
-          <w:sz w:val="28"/>
-          <w:szCs w:val="28"/>
-        </w:rPr>
-        <w:t xml:space="preserve">. A Sequential LSTM architecture is implemented with multiple LSTM layers, dropout layers for regularization, and dense layers for final prediction. The model uses binary cross-entropy loss and the Adam optimizer. The dataset is split into training </w:t>
-      </w:r>
-      <w:r>
-        <w:rPr>
-          <w:rFonts w:ascii="Times New Roman" w:hAnsi="Times New Roman" w:cs="Times New Roman"/>
-          <w:sz w:val="28"/>
-          <w:szCs w:val="28"/>
+        <w:t>The deep learning model is built using TensorFlow and Keras. A Sequential LSTM architecture is implemented with multiple LSTM layers, dropout layers for regularization, and dense layers for final prediction. The model uses binary cross-entropy loss and the Adam optimizer. The dataset is split into training and testing sets for evaluation. This model predicts machine failure probability based on sequential sensor inputs.</w:t>
+      </w:r>
+    </w:p>
+    <w:p>
+      <w:pPr>
+        <w:pStyle w:val="ListParagraph"/>
+        <w:rPr>
+          <w:rFonts w:ascii="Times New Roman" w:hAnsi="Times New Roman" w:cs="Times New Roman"/>
+          <w:sz w:val="32"/>
+          <w:szCs w:val="32"/>
+        </w:rPr>
+      </w:pPr>
+    </w:p>
+    <w:p>
+      <w:pPr>
+        <w:pStyle w:val="ListParagraph"/>
+        <w:numPr>
+          <w:ilvl w:val="0"/>
+          <w:numId w:val="51"/>
+        </w:numPr>
+        <w:rPr>
+          <w:rFonts w:ascii="Times New Roman" w:hAnsi="Times New Roman" w:cs="Times New Roman"/>
+          <w:sz w:val="32"/>
+          <w:szCs w:val="32"/>
+        </w:rPr>
+      </w:pPr>
+      <w:r>
+        <w:rPr>
+          <w:rFonts w:ascii="Times New Roman" w:hAnsi="Times New Roman" w:cs="Times New Roman"/>
+          <w:sz w:val="32"/>
+          <w:szCs w:val="32"/>
+        </w:rPr>
+        <w:t>Prediction &amp; Export Module (predict_and_export.py)</w:t>
+      </w:r>
+    </w:p>
+    <w:p>
+      <w:pPr>
+        <w:pStyle w:val="ListParagraph"/>
+        <w:numPr>
+          <w:ilvl w:val="0"/>
+          <w:numId w:val="50"/>
+        </w:numPr>
+        <w:rPr>
+          <w:rFonts w:ascii="Times New Roman" w:hAnsi="Times New Roman" w:cs="Times New Roman"/>
+          <w:sz w:val="28"/>
+          <w:szCs w:val="28"/>
+        </w:rPr>
+      </w:pPr>
+      <w:r>
+        <w:rPr>
+          <w:rFonts w:ascii="Times New Roman" w:hAnsi="Times New Roman" w:cs="Times New Roman"/>
+          <w:sz w:val="28"/>
+          <w:szCs w:val="28"/>
+        </w:rPr>
+        <w:t>This module loads the trained LSTM model and processed dataset. It generates predictions for machine failure probability using sequence-based input data. The results, including timestamp, product ID, and predicted probability, are saved into a CSV file. This output file is used for dashboard visualization and reporting.</w:t>
+      </w:r>
+    </w:p>
+    <w:p>
+      <w:pPr>
+        <w:pStyle w:val="ListParagraph"/>
+        <w:rPr>
+          <w:rFonts w:ascii="Times New Roman" w:hAnsi="Times New Roman" w:cs="Times New Roman"/>
+          <w:sz w:val="32"/>
+          <w:szCs w:val="32"/>
+        </w:rPr>
+      </w:pPr>
+    </w:p>
+    <w:p>
+      <w:pPr>
+        <w:pStyle w:val="ListParagraph"/>
+        <w:rPr>
+          <w:rFonts w:ascii="Times New Roman" w:hAnsi="Times New Roman" w:cs="Times New Roman"/>
+          <w:sz w:val="32"/>
+          <w:szCs w:val="32"/>
+        </w:rPr>
+      </w:pPr>
+    </w:p>
+    <w:p>
+      <w:pPr>
+        <w:pStyle w:val="ListParagraph"/>
+        <w:rPr>
+          <w:rFonts w:ascii="Times New Roman" w:hAnsi="Times New Roman" w:cs="Times New Roman"/>
+          <w:sz w:val="32"/>
+          <w:szCs w:val="32"/>
+        </w:rPr>
+      </w:pPr>
+    </w:p>
+    <w:p>
+      <w:pPr>
+        <w:pStyle w:val="ListParagraph"/>
+        <w:numPr>
+          <w:ilvl w:val="0"/>
+          <w:numId w:val="51"/>
+        </w:numPr>
+        <w:rPr>
+          <w:rFonts w:ascii="Times New Roman" w:hAnsi="Times New Roman" w:cs="Times New Roman"/>
+          <w:sz w:val="32"/>
+          <w:szCs w:val="32"/>
+        </w:rPr>
+      </w:pPr>
+      <w:r>
+        <w:rPr>
+          <w:rFonts w:ascii="Times New Roman" w:hAnsi="Times New Roman" w:cs="Times New Roman"/>
+          <w:sz w:val="32"/>
+          <w:szCs w:val="32"/>
         </w:rPr>
         <w:lastRenderedPageBreak/>
-        <w:t>and testing sets for evaluation. This model predicts machine failure probability based on sequential sensor inputs.</w:t>
-      </w:r>
-    </w:p>
-    <w:p>
-      <w:pPr>
-        <w:pStyle w:val="ListParagraph"/>
-        <w:rPr>
-          <w:rFonts w:ascii="Times New Roman" w:hAnsi="Times New Roman" w:cs="Times New Roman"/>
-          <w:sz w:val="32"/>
-          <w:szCs w:val="32"/>
-        </w:rPr>
-      </w:pPr>
-    </w:p>
-    <w:p>
-      <w:pPr>
-        <w:pStyle w:val="ListParagraph"/>
-        <w:numPr>
-          <w:ilvl w:val="0"/>
-          <w:numId w:val="51"/>
-        </w:numPr>
-        <w:rPr>
-          <w:rFonts w:ascii="Times New Roman" w:hAnsi="Times New Roman" w:cs="Times New Roman"/>
-          <w:sz w:val="32"/>
-          <w:szCs w:val="32"/>
-        </w:rPr>
-      </w:pPr>
-      <w:r>
-        <w:rPr>
-          <w:rFonts w:ascii="Times New Roman" w:hAnsi="Times New Roman" w:cs="Times New Roman"/>
-          <w:sz w:val="32"/>
-          <w:szCs w:val="32"/>
-        </w:rPr>
-        <w:t>Prediction &amp; Export Module (predict_and_export.py)</w:t>
+        <w:t>Frontend (HTML, CSS, JavaScript)</w:t>
       </w:r>
     </w:p>
     <w:p>
@@ -14023,60 +13040,6 @@
           <w:sz w:val="28"/>
           <w:szCs w:val="28"/>
         </w:rPr>
-        <w:t>This module loads the trained LSTM model and processed dataset. It generates predictions for machine failure probability using sequence-based input data. The results, including timestamp, product ID, and predicted probability, are saved into a CSV file. This output file is used for dashboard visualization and reporting.</w:t>
-      </w:r>
-    </w:p>
-    <w:p>
-      <w:pPr>
-        <w:pStyle w:val="ListParagraph"/>
-        <w:rPr>
-          <w:rFonts w:ascii="Times New Roman" w:hAnsi="Times New Roman" w:cs="Times New Roman"/>
-          <w:sz w:val="32"/>
-          <w:szCs w:val="32"/>
-        </w:rPr>
-      </w:pPr>
-    </w:p>
-    <w:p>
-      <w:pPr>
-        <w:pStyle w:val="ListParagraph"/>
-        <w:numPr>
-          <w:ilvl w:val="0"/>
-          <w:numId w:val="51"/>
-        </w:numPr>
-        <w:rPr>
-          <w:rFonts w:ascii="Times New Roman" w:hAnsi="Times New Roman" w:cs="Times New Roman"/>
-          <w:sz w:val="32"/>
-          <w:szCs w:val="32"/>
-        </w:rPr>
-      </w:pPr>
-      <w:r>
-        <w:rPr>
-          <w:rFonts w:ascii="Times New Roman" w:hAnsi="Times New Roman" w:cs="Times New Roman"/>
-          <w:sz w:val="32"/>
-          <w:szCs w:val="32"/>
-        </w:rPr>
-        <w:t>Frontend (HTML, CSS, JavaScript)</w:t>
-      </w:r>
-    </w:p>
-    <w:p>
-      <w:pPr>
-        <w:pStyle w:val="ListParagraph"/>
-        <w:numPr>
-          <w:ilvl w:val="0"/>
-          <w:numId w:val="50"/>
-        </w:numPr>
-        <w:rPr>
-          <w:rFonts w:ascii="Times New Roman" w:hAnsi="Times New Roman" w:cs="Times New Roman"/>
-          <w:sz w:val="28"/>
-          <w:szCs w:val="28"/>
-        </w:rPr>
-      </w:pPr>
-      <w:r>
-        <w:rPr>
-          <w:rFonts w:ascii="Times New Roman" w:hAnsi="Times New Roman" w:cs="Times New Roman"/>
-          <w:sz w:val="28"/>
-          <w:szCs w:val="28"/>
-        </w:rPr>
         <w:t>The frontend consists of login and dashboard pages. The JavaScript file handles form validation, user input checking, role assignment (admin, analyst, viewer), and communication with the backend login API. The interface ensures proper error handling and user-friendly interaction. CSS is used to provide structured and responsive design.</w:t>
       </w:r>
     </w:p>
@@ -14093,64 +13056,162 @@
     <w:p>
       <w:pPr>
         <w:pStyle w:val="ListParagraph"/>
-        <w:numPr>
-          <w:ilvl w:val="0"/>
-          <w:numId w:val="51"/>
-        </w:numPr>
-        <w:rPr>
-          <w:rFonts w:ascii="Times New Roman" w:hAnsi="Times New Roman" w:cs="Times New Roman"/>
-          <w:sz w:val="32"/>
-          <w:szCs w:val="32"/>
-        </w:rPr>
-      </w:pPr>
-      <w:r>
-        <w:rPr>
-          <w:rFonts w:ascii="Times New Roman" w:hAnsi="Times New Roman" w:cs="Times New Roman"/>
-          <w:sz w:val="32"/>
-          <w:szCs w:val="32"/>
-        </w:rPr>
-        <w:t>Environment Configuration (.env)</w:t>
-      </w:r>
-    </w:p>
-    <w:p>
-      <w:pPr>
-        <w:pStyle w:val="ListParagraph"/>
-        <w:numPr>
-          <w:ilvl w:val="0"/>
-          <w:numId w:val="50"/>
-        </w:numPr>
-        <w:rPr>
-          <w:rFonts w:ascii="Times New Roman" w:hAnsi="Times New Roman" w:cs="Times New Roman"/>
-          <w:sz w:val="28"/>
-          <w:szCs w:val="28"/>
-        </w:rPr>
-      </w:pPr>
-      <w:r>
-        <w:rPr>
-          <w:rFonts w:ascii="Times New Roman" w:hAnsi="Times New Roman" w:cs="Times New Roman"/>
-          <w:sz w:val="28"/>
-          <w:szCs w:val="28"/>
-        </w:rPr>
-        <w:t xml:space="preserve">The .env file securely stores configuration details such as </w:t>
-      </w:r>
-      <w:proofErr w:type="spellStart"/>
-      <w:r>
-        <w:rPr>
-          <w:rFonts w:ascii="Times New Roman" w:hAnsi="Times New Roman" w:cs="Times New Roman"/>
-          <w:sz w:val="28"/>
-          <w:szCs w:val="28"/>
-        </w:rPr>
-        <w:t>Supabase</w:t>
-      </w:r>
-      <w:proofErr w:type="spellEnd"/>
-      <w:r>
-        <w:rPr>
-          <w:rFonts w:ascii="Times New Roman" w:hAnsi="Times New Roman" w:cs="Times New Roman"/>
-          <w:sz w:val="28"/>
-          <w:szCs w:val="28"/>
-        </w:rPr>
-        <w:t xml:space="preserve"> URL, API keys, database credentials, file paths, model parameters, and Flask configuration. Keeping sensitive information in environment variables enhances security and maintainability of the system.</w:t>
-      </w:r>
+        <w:rPr>
+          <w:rFonts w:ascii="Times New Roman" w:hAnsi="Times New Roman" w:cs="Times New Roman"/>
+          <w:sz w:val="32"/>
+          <w:szCs w:val="32"/>
+        </w:rPr>
+      </w:pPr>
+    </w:p>
+    <w:p>
+      <w:pPr>
+        <w:pStyle w:val="ListParagraph"/>
+        <w:rPr>
+          <w:rFonts w:ascii="Times New Roman" w:hAnsi="Times New Roman" w:cs="Times New Roman"/>
+          <w:sz w:val="32"/>
+          <w:szCs w:val="32"/>
+        </w:rPr>
+      </w:pPr>
+    </w:p>
+    <w:p>
+      <w:pPr>
+        <w:pStyle w:val="ListParagraph"/>
+        <w:rPr>
+          <w:rFonts w:ascii="Times New Roman" w:hAnsi="Times New Roman" w:cs="Times New Roman"/>
+          <w:sz w:val="32"/>
+          <w:szCs w:val="32"/>
+        </w:rPr>
+      </w:pPr>
+    </w:p>
+    <w:p>
+      <w:pPr>
+        <w:pStyle w:val="ListParagraph"/>
+        <w:rPr>
+          <w:rFonts w:ascii="Times New Roman" w:hAnsi="Times New Roman" w:cs="Times New Roman"/>
+          <w:sz w:val="32"/>
+          <w:szCs w:val="32"/>
+        </w:rPr>
+      </w:pPr>
+    </w:p>
+    <w:p>
+      <w:pPr>
+        <w:pStyle w:val="ListParagraph"/>
+        <w:rPr>
+          <w:rFonts w:ascii="Times New Roman" w:hAnsi="Times New Roman" w:cs="Times New Roman"/>
+          <w:sz w:val="32"/>
+          <w:szCs w:val="32"/>
+        </w:rPr>
+      </w:pPr>
+    </w:p>
+    <w:p>
+      <w:pPr>
+        <w:pStyle w:val="ListParagraph"/>
+        <w:rPr>
+          <w:rFonts w:ascii="Times New Roman" w:hAnsi="Times New Roman" w:cs="Times New Roman"/>
+          <w:sz w:val="32"/>
+          <w:szCs w:val="32"/>
+        </w:rPr>
+      </w:pPr>
+    </w:p>
+    <w:p>
+      <w:pPr>
+        <w:pStyle w:val="ListParagraph"/>
+        <w:rPr>
+          <w:rFonts w:ascii="Times New Roman" w:hAnsi="Times New Roman" w:cs="Times New Roman"/>
+          <w:sz w:val="32"/>
+          <w:szCs w:val="32"/>
+        </w:rPr>
+      </w:pPr>
+    </w:p>
+    <w:p>
+      <w:pPr>
+        <w:pStyle w:val="ListParagraph"/>
+        <w:rPr>
+          <w:rFonts w:ascii="Times New Roman" w:hAnsi="Times New Roman" w:cs="Times New Roman"/>
+          <w:sz w:val="32"/>
+          <w:szCs w:val="32"/>
+        </w:rPr>
+      </w:pPr>
+    </w:p>
+    <w:p>
+      <w:pPr>
+        <w:pStyle w:val="ListParagraph"/>
+        <w:rPr>
+          <w:rFonts w:ascii="Times New Roman" w:hAnsi="Times New Roman" w:cs="Times New Roman"/>
+          <w:sz w:val="32"/>
+          <w:szCs w:val="32"/>
+        </w:rPr>
+      </w:pPr>
+    </w:p>
+    <w:p>
+      <w:pPr>
+        <w:pStyle w:val="ListParagraph"/>
+        <w:rPr>
+          <w:rFonts w:ascii="Times New Roman" w:hAnsi="Times New Roman" w:cs="Times New Roman"/>
+          <w:sz w:val="32"/>
+          <w:szCs w:val="32"/>
+        </w:rPr>
+      </w:pPr>
+    </w:p>
+    <w:p>
+      <w:pPr>
+        <w:pStyle w:val="ListParagraph"/>
+        <w:rPr>
+          <w:rFonts w:ascii="Times New Roman" w:hAnsi="Times New Roman" w:cs="Times New Roman"/>
+          <w:sz w:val="32"/>
+          <w:szCs w:val="32"/>
+        </w:rPr>
+      </w:pPr>
+    </w:p>
+    <w:p>
+      <w:pPr>
+        <w:pStyle w:val="ListParagraph"/>
+        <w:rPr>
+          <w:rFonts w:ascii="Times New Roman" w:hAnsi="Times New Roman" w:cs="Times New Roman"/>
+          <w:sz w:val="32"/>
+          <w:szCs w:val="32"/>
+        </w:rPr>
+      </w:pPr>
+    </w:p>
+    <w:p>
+      <w:pPr>
+        <w:pStyle w:val="ListParagraph"/>
+        <w:rPr>
+          <w:rFonts w:ascii="Times New Roman" w:hAnsi="Times New Roman" w:cs="Times New Roman"/>
+          <w:sz w:val="32"/>
+          <w:szCs w:val="32"/>
+        </w:rPr>
+      </w:pPr>
+    </w:p>
+    <w:p>
+      <w:pPr>
+        <w:pStyle w:val="ListParagraph"/>
+        <w:rPr>
+          <w:rFonts w:ascii="Times New Roman" w:hAnsi="Times New Roman" w:cs="Times New Roman"/>
+          <w:sz w:val="32"/>
+          <w:szCs w:val="32"/>
+        </w:rPr>
+      </w:pPr>
+    </w:p>
+    <w:p>
+      <w:pPr>
+        <w:pStyle w:val="ListParagraph"/>
+        <w:rPr>
+          <w:rFonts w:ascii="Times New Roman" w:hAnsi="Times New Roman" w:cs="Times New Roman"/>
+          <w:sz w:val="32"/>
+          <w:szCs w:val="32"/>
+        </w:rPr>
+      </w:pPr>
+    </w:p>
+    <w:p>
+      <w:pPr>
+        <w:pStyle w:val="ListParagraph"/>
+        <w:rPr>
+          <w:rFonts w:ascii="Times New Roman" w:hAnsi="Times New Roman" w:cs="Times New Roman"/>
+          <w:sz w:val="32"/>
+          <w:szCs w:val="32"/>
+        </w:rPr>
+      </w:pPr>
     </w:p>
     <w:p>
       <w:pPr>
@@ -14331,25 +13392,7 @@
           <w:sz w:val="32"/>
           <w:szCs w:val="32"/>
         </w:rPr>
-        <w:t xml:space="preserve">The integration of </w:t>
-      </w:r>
-      <w:proofErr w:type="spellStart"/>
-      <w:r>
-        <w:rPr>
-          <w:rFonts w:ascii="Times New Roman" w:hAnsi="Times New Roman" w:cs="Times New Roman"/>
-          <w:sz w:val="32"/>
-          <w:szCs w:val="32"/>
-        </w:rPr>
-        <w:t>Supabase</w:t>
-      </w:r>
-      <w:proofErr w:type="spellEnd"/>
-      <w:r>
-        <w:rPr>
-          <w:rFonts w:ascii="Times New Roman" w:hAnsi="Times New Roman" w:cs="Times New Roman"/>
-          <w:sz w:val="32"/>
-          <w:szCs w:val="32"/>
-        </w:rPr>
-        <w:t xml:space="preserve"> cloud infrastructure ensures secure data storage, authentication, and logging, while the Flask-based backend and interactive dashboard enhance usability and accessibility. The project also demonstrates strong alignment with business objectives such as reducing operational costs, improving equipment lifespan, and enhancing overall system reliability.</w:t>
+        <w:t>The integration of Supabase cloud infrastructure ensures secure data storage, authentication, and logging, while the Flask-based backend and interactive dashboard enhance usability and accessibility. The project also demonstrates strong alignment with business objectives such as reducing operational costs, improving equipment lifespan, and enhancing overall system reliability.</w:t>
       </w:r>
     </w:p>
     <w:p>
@@ -21290,6 +20333,7 @@
   <w:style w:type="character" w:default="1" w:styleId="DefaultParagraphFont">
     <w:name w:val="Default Paragraph Font"/>
     <w:uiPriority w:val="1"/>
+    <w:semiHidden/>
     <w:unhideWhenUsed/>
   </w:style>
   <w:style w:type="table" w:default="1" w:styleId="TableNormal">

</xml_diff>

<commit_message>
Added Refrences In Report
</commit_message>
<xml_diff>
--- a/docs/Review 1 Report.docx
+++ b/docs/Review 1 Report.docx
@@ -143,8 +143,16 @@
               <w:rPr>
                 <w:rFonts w:ascii="Times New Roman" w:hAnsi="Times New Roman" w:cs="Times New Roman"/>
               </w:rPr>
-              <w:t>Guided By:-</w:t>
+              <w:t xml:space="preserve">Guided </w:t>
             </w:r>
+            <w:proofErr w:type="gramStart"/>
+            <w:r>
+              <w:rPr>
+                <w:rFonts w:ascii="Times New Roman" w:hAnsi="Times New Roman" w:cs="Times New Roman"/>
+              </w:rPr>
+              <w:t>By:-</w:t>
+            </w:r>
+            <w:proofErr w:type="gramEnd"/>
           </w:p>
         </w:tc>
       </w:tr>
@@ -196,7 +204,25 @@
                 <w:sz w:val="24"/>
                 <w:szCs w:val="24"/>
               </w:rPr>
-              <w:t>Prof. Umesh Lakhtariya (Internal)</w:t>
+              <w:t xml:space="preserve">Prof. Umesh </w:t>
+            </w:r>
+            <w:proofErr w:type="spellStart"/>
+            <w:r>
+              <w:rPr>
+                <w:bCs/>
+                <w:sz w:val="24"/>
+                <w:szCs w:val="24"/>
+              </w:rPr>
+              <w:t>Lakhtariya</w:t>
+            </w:r>
+            <w:proofErr w:type="spellEnd"/>
+            <w:r>
+              <w:rPr>
+                <w:bCs/>
+                <w:sz w:val="24"/>
+                <w:szCs w:val="24"/>
+              </w:rPr>
+              <w:t xml:space="preserve"> (Internal)</w:t>
             </w:r>
           </w:p>
         </w:tc>
@@ -567,16 +593,24 @@
       <w:tblPr>
         <w:tblStyle w:val="TableGrid"/>
         <w:tblW w:w="0" w:type="auto"/>
+        <w:tblBorders>
+          <w:top w:val="none" w:sz="0" w:space="0" w:color="auto"/>
+          <w:left w:val="none" w:sz="0" w:space="0" w:color="auto"/>
+          <w:bottom w:val="none" w:sz="0" w:space="0" w:color="auto"/>
+          <w:right w:val="none" w:sz="0" w:space="0" w:color="auto"/>
+          <w:insideH w:val="none" w:sz="0" w:space="0" w:color="auto"/>
+          <w:insideV w:val="none" w:sz="0" w:space="0" w:color="auto"/>
+        </w:tblBorders>
         <w:tblLook w:val="04A0" w:firstRow="1" w:lastRow="0" w:firstColumn="1" w:lastColumn="0" w:noHBand="0" w:noVBand="1"/>
       </w:tblPr>
       <w:tblGrid>
-        <w:gridCol w:w="7105"/>
-        <w:gridCol w:w="2245"/>
+        <w:gridCol w:w="8005"/>
+        <w:gridCol w:w="1345"/>
       </w:tblGrid>
       <w:tr>
         <w:tc>
           <w:tcPr>
-            <w:tcW w:w="7105" w:type="dxa"/>
+            <w:tcW w:w="8005" w:type="dxa"/>
           </w:tcPr>
           <w:p>
             <w:pPr>
@@ -601,7 +635,7 @@
         </w:tc>
         <w:tc>
           <w:tcPr>
-            <w:tcW w:w="2245" w:type="dxa"/>
+            <w:tcW w:w="1345" w:type="dxa"/>
           </w:tcPr>
           <w:p>
             <w:pPr>
@@ -617,7 +651,7 @@
       <w:tr>
         <w:tc>
           <w:tcPr>
-            <w:tcW w:w="7105" w:type="dxa"/>
+            <w:tcW w:w="8005" w:type="dxa"/>
           </w:tcPr>
           <w:p>
             <w:pPr>
@@ -630,7 +664,7 @@
         </w:tc>
         <w:tc>
           <w:tcPr>
-            <w:tcW w:w="2245" w:type="dxa"/>
+            <w:tcW w:w="1345" w:type="dxa"/>
           </w:tcPr>
           <w:p>
             <w:pPr>
@@ -646,17 +680,21 @@
       <w:tr>
         <w:tc>
           <w:tcPr>
-            <w:tcW w:w="7105" w:type="dxa"/>
+            <w:tcW w:w="8005" w:type="dxa"/>
           </w:tcPr>
           <w:p>
             <w:pPr>
               <w:rPr>
+                <w:b/>
+                <w:bCs/>
                 <w:sz w:val="28"/>
                 <w:szCs w:val="28"/>
               </w:rPr>
             </w:pPr>
             <w:r>
               <w:rPr>
+                <w:b/>
+                <w:bCs/>
                 <w:sz w:val="28"/>
                 <w:szCs w:val="28"/>
               </w:rPr>
@@ -666,18 +704,22 @@
         </w:tc>
         <w:tc>
           <w:tcPr>
-            <w:tcW w:w="2245" w:type="dxa"/>
+            <w:tcW w:w="1345" w:type="dxa"/>
           </w:tcPr>
           <w:p>
             <w:pPr>
               <w:jc w:val="right"/>
               <w:rPr>
+                <w:b/>
+                <w:bCs/>
                 <w:sz w:val="28"/>
                 <w:szCs w:val="28"/>
               </w:rPr>
             </w:pPr>
             <w:r>
               <w:rPr>
+                <w:b/>
+                <w:bCs/>
                 <w:sz w:val="28"/>
                 <w:szCs w:val="28"/>
               </w:rPr>
@@ -689,7 +731,7 @@
       <w:tr>
         <w:tc>
           <w:tcPr>
-            <w:tcW w:w="7105" w:type="dxa"/>
+            <w:tcW w:w="8005" w:type="dxa"/>
           </w:tcPr>
           <w:p>
             <w:pPr>
@@ -702,7 +744,7 @@
         </w:tc>
         <w:tc>
           <w:tcPr>
-            <w:tcW w:w="2245" w:type="dxa"/>
+            <w:tcW w:w="1345" w:type="dxa"/>
           </w:tcPr>
           <w:p>
             <w:pPr>
@@ -718,7 +760,7 @@
       <w:tr>
         <w:tc>
           <w:tcPr>
-            <w:tcW w:w="7105" w:type="dxa"/>
+            <w:tcW w:w="8005" w:type="dxa"/>
           </w:tcPr>
           <w:p>
             <w:pPr>
@@ -738,7 +780,7 @@
         </w:tc>
         <w:tc>
           <w:tcPr>
-            <w:tcW w:w="2245" w:type="dxa"/>
+            <w:tcW w:w="1345" w:type="dxa"/>
           </w:tcPr>
           <w:p>
             <w:pPr>
@@ -761,7 +803,7 @@
       <w:tr>
         <w:tc>
           <w:tcPr>
-            <w:tcW w:w="7105" w:type="dxa"/>
+            <w:tcW w:w="8005" w:type="dxa"/>
           </w:tcPr>
           <w:p>
             <w:pPr>
@@ -774,7 +816,7 @@
         </w:tc>
         <w:tc>
           <w:tcPr>
-            <w:tcW w:w="2245" w:type="dxa"/>
+            <w:tcW w:w="1345" w:type="dxa"/>
           </w:tcPr>
           <w:p>
             <w:pPr>
@@ -790,7 +832,7 @@
       <w:tr>
         <w:tc>
           <w:tcPr>
-            <w:tcW w:w="7105" w:type="dxa"/>
+            <w:tcW w:w="8005" w:type="dxa"/>
           </w:tcPr>
           <w:p>
             <w:pPr>
@@ -813,7 +855,7 @@
         </w:tc>
         <w:tc>
           <w:tcPr>
-            <w:tcW w:w="2245" w:type="dxa"/>
+            <w:tcW w:w="1345" w:type="dxa"/>
           </w:tcPr>
           <w:p>
             <w:pPr>
@@ -836,7 +878,7 @@
       <w:tr>
         <w:tc>
           <w:tcPr>
-            <w:tcW w:w="7105" w:type="dxa"/>
+            <w:tcW w:w="8005" w:type="dxa"/>
           </w:tcPr>
           <w:p>
             <w:pPr>
@@ -849,7 +891,7 @@
         </w:tc>
         <w:tc>
           <w:tcPr>
-            <w:tcW w:w="2245" w:type="dxa"/>
+            <w:tcW w:w="1345" w:type="dxa"/>
           </w:tcPr>
           <w:p>
             <w:pPr>
@@ -865,7 +907,7 @@
       <w:tr>
         <w:tc>
           <w:tcPr>
-            <w:tcW w:w="7105" w:type="dxa"/>
+            <w:tcW w:w="8005" w:type="dxa"/>
           </w:tcPr>
           <w:p>
             <w:pPr>
@@ -885,7 +927,7 @@
         </w:tc>
         <w:tc>
           <w:tcPr>
-            <w:tcW w:w="2245" w:type="dxa"/>
+            <w:tcW w:w="1345" w:type="dxa"/>
           </w:tcPr>
           <w:p>
             <w:pPr>
@@ -908,16 +950,22 @@
       <w:tr>
         <w:tc>
           <w:tcPr>
-            <w:tcW w:w="7105" w:type="dxa"/>
+            <w:tcW w:w="8005" w:type="dxa"/>
           </w:tcPr>
           <w:p>
             <w:pPr>
-              <w:jc w:val="center"/>
               <w:rPr>
                 <w:sz w:val="28"/>
                 <w:szCs w:val="28"/>
               </w:rPr>
             </w:pPr>
+            <w:r>
+              <w:rPr>
+                <w:sz w:val="28"/>
+                <w:szCs w:val="28"/>
+              </w:rPr>
+              <w:t xml:space="preserve">              </w:t>
+            </w:r>
             <w:r>
               <w:rPr>
                 <w:sz w:val="28"/>
@@ -936,7 +984,7 @@
         </w:tc>
         <w:tc>
           <w:tcPr>
-            <w:tcW w:w="2245" w:type="dxa"/>
+            <w:tcW w:w="1345" w:type="dxa"/>
           </w:tcPr>
           <w:p>
             <w:pPr>
@@ -959,16 +1007,22 @@
       <w:tr>
         <w:tc>
           <w:tcPr>
-            <w:tcW w:w="7105" w:type="dxa"/>
+            <w:tcW w:w="8005" w:type="dxa"/>
           </w:tcPr>
           <w:p>
             <w:pPr>
-              <w:jc w:val="center"/>
               <w:rPr>
                 <w:sz w:val="28"/>
                 <w:szCs w:val="28"/>
               </w:rPr>
             </w:pPr>
+            <w:r>
+              <w:rPr>
+                <w:sz w:val="28"/>
+                <w:szCs w:val="28"/>
+              </w:rPr>
+              <w:t xml:space="preserve">              </w:t>
+            </w:r>
             <w:r>
               <w:rPr>
                 <w:sz w:val="28"/>
@@ -987,7 +1041,7 @@
         </w:tc>
         <w:tc>
           <w:tcPr>
-            <w:tcW w:w="2245" w:type="dxa"/>
+            <w:tcW w:w="1345" w:type="dxa"/>
           </w:tcPr>
           <w:p>
             <w:pPr>
@@ -1010,7 +1064,7 @@
       <w:tr>
         <w:tc>
           <w:tcPr>
-            <w:tcW w:w="7105" w:type="dxa"/>
+            <w:tcW w:w="8005" w:type="dxa"/>
           </w:tcPr>
           <w:p>
             <w:pPr>
@@ -1023,7 +1077,7 @@
         </w:tc>
         <w:tc>
           <w:tcPr>
-            <w:tcW w:w="2245" w:type="dxa"/>
+            <w:tcW w:w="1345" w:type="dxa"/>
           </w:tcPr>
           <w:p>
             <w:pPr>
@@ -1039,7 +1093,7 @@
       <w:tr>
         <w:tc>
           <w:tcPr>
-            <w:tcW w:w="7105" w:type="dxa"/>
+            <w:tcW w:w="8005" w:type="dxa"/>
           </w:tcPr>
           <w:p>
             <w:pPr>
@@ -1059,7 +1113,7 @@
         </w:tc>
         <w:tc>
           <w:tcPr>
-            <w:tcW w:w="2245" w:type="dxa"/>
+            <w:tcW w:w="1345" w:type="dxa"/>
           </w:tcPr>
           <w:p>
             <w:pPr>
@@ -1082,7 +1136,7 @@
       <w:tr>
         <w:tc>
           <w:tcPr>
-            <w:tcW w:w="7105" w:type="dxa"/>
+            <w:tcW w:w="8005" w:type="dxa"/>
           </w:tcPr>
           <w:p>
             <w:pPr>
@@ -1116,7 +1170,7 @@
         </w:tc>
         <w:tc>
           <w:tcPr>
-            <w:tcW w:w="2245" w:type="dxa"/>
+            <w:tcW w:w="1345" w:type="dxa"/>
           </w:tcPr>
           <w:p>
             <w:pPr>
@@ -1139,7 +1193,7 @@
       <w:tr>
         <w:tc>
           <w:tcPr>
-            <w:tcW w:w="7105" w:type="dxa"/>
+            <w:tcW w:w="8005" w:type="dxa"/>
           </w:tcPr>
           <w:p>
             <w:pPr>
@@ -1168,7 +1222,7 @@
         </w:tc>
         <w:tc>
           <w:tcPr>
-            <w:tcW w:w="2245" w:type="dxa"/>
+            <w:tcW w:w="1345" w:type="dxa"/>
           </w:tcPr>
           <w:p>
             <w:pPr>
@@ -1191,7 +1245,7 @@
       <w:tr>
         <w:tc>
           <w:tcPr>
-            <w:tcW w:w="7105" w:type="dxa"/>
+            <w:tcW w:w="8005" w:type="dxa"/>
           </w:tcPr>
           <w:p>
             <w:pPr>
@@ -1225,7 +1279,7 @@
         </w:tc>
         <w:tc>
           <w:tcPr>
-            <w:tcW w:w="2245" w:type="dxa"/>
+            <w:tcW w:w="1345" w:type="dxa"/>
           </w:tcPr>
           <w:p>
             <w:pPr>
@@ -1248,7 +1302,7 @@
       <w:tr>
         <w:tc>
           <w:tcPr>
-            <w:tcW w:w="7105" w:type="dxa"/>
+            <w:tcW w:w="8005" w:type="dxa"/>
           </w:tcPr>
           <w:p>
             <w:pPr>
@@ -1275,7 +1329,7 @@
         </w:tc>
         <w:tc>
           <w:tcPr>
-            <w:tcW w:w="2245" w:type="dxa"/>
+            <w:tcW w:w="1345" w:type="dxa"/>
           </w:tcPr>
           <w:p>
             <w:pPr>
@@ -1298,7 +1352,7 @@
       <w:tr>
         <w:tc>
           <w:tcPr>
-            <w:tcW w:w="7105" w:type="dxa"/>
+            <w:tcW w:w="8005" w:type="dxa"/>
           </w:tcPr>
           <w:p>
             <w:pPr>
@@ -1325,7 +1379,7 @@
         </w:tc>
         <w:tc>
           <w:tcPr>
-            <w:tcW w:w="2245" w:type="dxa"/>
+            <w:tcW w:w="1345" w:type="dxa"/>
           </w:tcPr>
           <w:p>
             <w:pPr>
@@ -1348,7 +1402,7 @@
       <w:tr>
         <w:tc>
           <w:tcPr>
-            <w:tcW w:w="7105" w:type="dxa"/>
+            <w:tcW w:w="8005" w:type="dxa"/>
           </w:tcPr>
           <w:p>
             <w:pPr>
@@ -1375,7 +1429,7 @@
         </w:tc>
         <w:tc>
           <w:tcPr>
-            <w:tcW w:w="2245" w:type="dxa"/>
+            <w:tcW w:w="1345" w:type="dxa"/>
           </w:tcPr>
           <w:p>
             <w:pPr>
@@ -1398,7 +1452,7 @@
       <w:tr>
         <w:tc>
           <w:tcPr>
-            <w:tcW w:w="7105" w:type="dxa"/>
+            <w:tcW w:w="8005" w:type="dxa"/>
           </w:tcPr>
           <w:p>
             <w:pPr>
@@ -1425,7 +1479,7 @@
         </w:tc>
         <w:tc>
           <w:tcPr>
-            <w:tcW w:w="2245" w:type="dxa"/>
+            <w:tcW w:w="1345" w:type="dxa"/>
           </w:tcPr>
           <w:p>
             <w:pPr>
@@ -1448,7 +1502,7 @@
       <w:tr>
         <w:tc>
           <w:tcPr>
-            <w:tcW w:w="7105" w:type="dxa"/>
+            <w:tcW w:w="8005" w:type="dxa"/>
           </w:tcPr>
           <w:p>
             <w:pPr>
@@ -1469,13 +1523,22 @@
                 <w:sz w:val="28"/>
                 <w:szCs w:val="28"/>
               </w:rPr>
-              <w:t>odel Maintainence</w:t>
+              <w:t xml:space="preserve">odel </w:t>
             </w:r>
+            <w:proofErr w:type="spellStart"/>
+            <w:r>
+              <w:rPr>
+                <w:sz w:val="28"/>
+                <w:szCs w:val="28"/>
+              </w:rPr>
+              <w:t>Maintainence</w:t>
+            </w:r>
+            <w:proofErr w:type="spellEnd"/>
           </w:p>
         </w:tc>
         <w:tc>
           <w:tcPr>
-            <w:tcW w:w="2245" w:type="dxa"/>
+            <w:tcW w:w="1345" w:type="dxa"/>
           </w:tcPr>
           <w:p>
             <w:pPr>
@@ -1498,7 +1561,7 @@
       <w:tr>
         <w:tc>
           <w:tcPr>
-            <w:tcW w:w="7105" w:type="dxa"/>
+            <w:tcW w:w="8005" w:type="dxa"/>
           </w:tcPr>
           <w:p>
             <w:pPr>
@@ -1525,7 +1588,7 @@
         </w:tc>
         <w:tc>
           <w:tcPr>
-            <w:tcW w:w="2245" w:type="dxa"/>
+            <w:tcW w:w="1345" w:type="dxa"/>
           </w:tcPr>
           <w:p>
             <w:pPr>
@@ -1548,7 +1611,7 @@
       <w:tr>
         <w:tc>
           <w:tcPr>
-            <w:tcW w:w="7105" w:type="dxa"/>
+            <w:tcW w:w="8005" w:type="dxa"/>
           </w:tcPr>
           <w:p>
             <w:pPr>
@@ -1575,7 +1638,7 @@
         </w:tc>
         <w:tc>
           <w:tcPr>
-            <w:tcW w:w="2245" w:type="dxa"/>
+            <w:tcW w:w="1345" w:type="dxa"/>
           </w:tcPr>
           <w:p>
             <w:pPr>
@@ -1598,7 +1661,7 @@
       <w:tr>
         <w:tc>
           <w:tcPr>
-            <w:tcW w:w="7105" w:type="dxa"/>
+            <w:tcW w:w="8005" w:type="dxa"/>
           </w:tcPr>
           <w:p>
             <w:pPr>
@@ -1611,7 +1674,7 @@
         </w:tc>
         <w:tc>
           <w:tcPr>
-            <w:tcW w:w="2245" w:type="dxa"/>
+            <w:tcW w:w="1345" w:type="dxa"/>
           </w:tcPr>
           <w:p>
             <w:pPr>
@@ -1627,7 +1690,7 @@
       <w:tr>
         <w:tc>
           <w:tcPr>
-            <w:tcW w:w="7105" w:type="dxa"/>
+            <w:tcW w:w="8005" w:type="dxa"/>
           </w:tcPr>
           <w:p>
             <w:pPr>
@@ -1647,7 +1710,7 @@
         </w:tc>
         <w:tc>
           <w:tcPr>
-            <w:tcW w:w="2245" w:type="dxa"/>
+            <w:tcW w:w="1345" w:type="dxa"/>
           </w:tcPr>
           <w:p>
             <w:pPr>
@@ -1670,7 +1733,7 @@
       <w:tr>
         <w:tc>
           <w:tcPr>
-            <w:tcW w:w="7105" w:type="dxa"/>
+            <w:tcW w:w="8005" w:type="dxa"/>
           </w:tcPr>
           <w:p>
             <w:pPr>
@@ -1684,13 +1747,29 @@
                 <w:sz w:val="28"/>
                 <w:szCs w:val="28"/>
               </w:rPr>
-              <w:t xml:space="preserve">              5.1 List Of Major Activities </w:t>
+              <w:t xml:space="preserve">              5.1 List </w:t>
+            </w:r>
+            <w:proofErr w:type="gramStart"/>
+            <w:r>
+              <w:rPr>
+                <w:sz w:val="28"/>
+                <w:szCs w:val="28"/>
+              </w:rPr>
+              <w:t>Of</w:t>
+            </w:r>
+            <w:proofErr w:type="gramEnd"/>
+            <w:r>
+              <w:rPr>
+                <w:sz w:val="28"/>
+                <w:szCs w:val="28"/>
+              </w:rPr>
+              <w:t xml:space="preserve"> Major Activities </w:t>
             </w:r>
           </w:p>
         </w:tc>
         <w:tc>
           <w:tcPr>
-            <w:tcW w:w="2245" w:type="dxa"/>
+            <w:tcW w:w="1345" w:type="dxa"/>
           </w:tcPr>
           <w:p>
             <w:pPr>
@@ -1713,7 +1792,7 @@
       <w:tr>
         <w:tc>
           <w:tcPr>
-            <w:tcW w:w="7105" w:type="dxa"/>
+            <w:tcW w:w="8005" w:type="dxa"/>
           </w:tcPr>
           <w:p>
             <w:pPr>
@@ -1733,7 +1812,7 @@
         </w:tc>
         <w:tc>
           <w:tcPr>
-            <w:tcW w:w="2245" w:type="dxa"/>
+            <w:tcW w:w="1345" w:type="dxa"/>
           </w:tcPr>
           <w:p>
             <w:pPr>
@@ -1756,7 +1835,7 @@
       <w:tr>
         <w:tc>
           <w:tcPr>
-            <w:tcW w:w="7105" w:type="dxa"/>
+            <w:tcW w:w="8005" w:type="dxa"/>
           </w:tcPr>
           <w:p>
             <w:pPr>
@@ -1769,7 +1848,7 @@
         </w:tc>
         <w:tc>
           <w:tcPr>
-            <w:tcW w:w="2245" w:type="dxa"/>
+            <w:tcW w:w="1345" w:type="dxa"/>
           </w:tcPr>
           <w:p>
             <w:pPr>
@@ -1785,7 +1864,7 @@
       <w:tr>
         <w:tc>
           <w:tcPr>
-            <w:tcW w:w="7105" w:type="dxa"/>
+            <w:tcW w:w="8005" w:type="dxa"/>
           </w:tcPr>
           <w:p>
             <w:pPr>
@@ -1805,7 +1884,7 @@
         </w:tc>
         <w:tc>
           <w:tcPr>
-            <w:tcW w:w="2245" w:type="dxa"/>
+            <w:tcW w:w="1345" w:type="dxa"/>
           </w:tcPr>
           <w:p>
             <w:pPr>
@@ -1828,7 +1907,7 @@
       <w:tr>
         <w:tc>
           <w:tcPr>
-            <w:tcW w:w="7105" w:type="dxa"/>
+            <w:tcW w:w="8005" w:type="dxa"/>
           </w:tcPr>
           <w:p>
             <w:pPr>
@@ -1848,7 +1927,7 @@
         </w:tc>
         <w:tc>
           <w:tcPr>
-            <w:tcW w:w="2245" w:type="dxa"/>
+            <w:tcW w:w="1345" w:type="dxa"/>
           </w:tcPr>
           <w:p>
             <w:pPr>
@@ -1871,7 +1950,7 @@
       <w:tr>
         <w:tc>
           <w:tcPr>
-            <w:tcW w:w="7105" w:type="dxa"/>
+            <w:tcW w:w="8005" w:type="dxa"/>
           </w:tcPr>
           <w:p>
             <w:pPr>
@@ -1891,7 +1970,7 @@
         </w:tc>
         <w:tc>
           <w:tcPr>
-            <w:tcW w:w="2245" w:type="dxa"/>
+            <w:tcW w:w="1345" w:type="dxa"/>
           </w:tcPr>
           <w:p>
             <w:pPr>
@@ -1914,7 +1993,7 @@
       <w:tr>
         <w:tc>
           <w:tcPr>
-            <w:tcW w:w="7105" w:type="dxa"/>
+            <w:tcW w:w="8005" w:type="dxa"/>
           </w:tcPr>
           <w:p>
             <w:pPr>
@@ -1934,7 +2013,7 @@
         </w:tc>
         <w:tc>
           <w:tcPr>
-            <w:tcW w:w="2245" w:type="dxa"/>
+            <w:tcW w:w="1345" w:type="dxa"/>
           </w:tcPr>
           <w:p>
             <w:pPr>
@@ -1957,7 +2036,7 @@
       <w:tr>
         <w:tc>
           <w:tcPr>
-            <w:tcW w:w="7105" w:type="dxa"/>
+            <w:tcW w:w="8005" w:type="dxa"/>
           </w:tcPr>
           <w:p>
             <w:pPr>
@@ -1977,7 +2056,7 @@
         </w:tc>
         <w:tc>
           <w:tcPr>
-            <w:tcW w:w="2245" w:type="dxa"/>
+            <w:tcW w:w="1345" w:type="dxa"/>
           </w:tcPr>
           <w:p>
             <w:pPr>
@@ -2000,7 +2079,7 @@
       <w:tr>
         <w:tc>
           <w:tcPr>
-            <w:tcW w:w="7105" w:type="dxa"/>
+            <w:tcW w:w="8005" w:type="dxa"/>
           </w:tcPr>
           <w:p>
             <w:pPr>
@@ -2020,7 +2099,7 @@
         </w:tc>
         <w:tc>
           <w:tcPr>
-            <w:tcW w:w="2245" w:type="dxa"/>
+            <w:tcW w:w="1345" w:type="dxa"/>
           </w:tcPr>
           <w:p>
             <w:pPr>
@@ -2043,7 +2122,7 @@
       <w:tr>
         <w:tc>
           <w:tcPr>
-            <w:tcW w:w="7105" w:type="dxa"/>
+            <w:tcW w:w="8005" w:type="dxa"/>
           </w:tcPr>
           <w:p>
             <w:pPr>
@@ -2070,7 +2149,7 @@
         </w:tc>
         <w:tc>
           <w:tcPr>
-            <w:tcW w:w="2245" w:type="dxa"/>
+            <w:tcW w:w="1345" w:type="dxa"/>
           </w:tcPr>
           <w:p>
             <w:pPr>
@@ -2093,7 +2172,7 @@
       <w:tr>
         <w:tc>
           <w:tcPr>
-            <w:tcW w:w="7105" w:type="dxa"/>
+            <w:tcW w:w="8005" w:type="dxa"/>
           </w:tcPr>
           <w:p>
             <w:pPr>
@@ -2120,7 +2199,7 @@
         </w:tc>
         <w:tc>
           <w:tcPr>
-            <w:tcW w:w="2245" w:type="dxa"/>
+            <w:tcW w:w="1345" w:type="dxa"/>
           </w:tcPr>
           <w:p>
             <w:pPr>
@@ -2143,7 +2222,7 @@
       <w:tr>
         <w:tc>
           <w:tcPr>
-            <w:tcW w:w="7105" w:type="dxa"/>
+            <w:tcW w:w="8005" w:type="dxa"/>
           </w:tcPr>
           <w:p>
             <w:pPr>
@@ -2170,7 +2249,7 @@
         </w:tc>
         <w:tc>
           <w:tcPr>
-            <w:tcW w:w="2245" w:type="dxa"/>
+            <w:tcW w:w="1345" w:type="dxa"/>
           </w:tcPr>
           <w:p>
             <w:pPr>
@@ -2193,7 +2272,7 @@
       <w:tr>
         <w:tc>
           <w:tcPr>
-            <w:tcW w:w="7105" w:type="dxa"/>
+            <w:tcW w:w="8005" w:type="dxa"/>
           </w:tcPr>
           <w:p>
             <w:pPr>
@@ -2207,7 +2286,6 @@
                 <w:sz w:val="28"/>
                 <w:szCs w:val="28"/>
               </w:rPr>
-              <w:lastRenderedPageBreak/>
               <w:t xml:space="preserve">                    </w:t>
             </w:r>
             <w:r>
@@ -2221,7 +2299,7 @@
         </w:tc>
         <w:tc>
           <w:tcPr>
-            <w:tcW w:w="2245" w:type="dxa"/>
+            <w:tcW w:w="1345" w:type="dxa"/>
           </w:tcPr>
           <w:p>
             <w:pPr>
@@ -2244,7 +2322,7 @@
       <w:tr>
         <w:tc>
           <w:tcPr>
-            <w:tcW w:w="7105" w:type="dxa"/>
+            <w:tcW w:w="8005" w:type="dxa"/>
           </w:tcPr>
           <w:p>
             <w:pPr>
@@ -2271,7 +2349,7 @@
         </w:tc>
         <w:tc>
           <w:tcPr>
-            <w:tcW w:w="2245" w:type="dxa"/>
+            <w:tcW w:w="1345" w:type="dxa"/>
           </w:tcPr>
           <w:p>
             <w:pPr>
@@ -2294,7 +2372,7 @@
       <w:tr>
         <w:tc>
           <w:tcPr>
-            <w:tcW w:w="7105" w:type="dxa"/>
+            <w:tcW w:w="8005" w:type="dxa"/>
           </w:tcPr>
           <w:p>
             <w:pPr>
@@ -2308,6 +2386,7 @@
                 <w:sz w:val="28"/>
                 <w:szCs w:val="28"/>
               </w:rPr>
+              <w:lastRenderedPageBreak/>
               <w:t xml:space="preserve">                    </w:t>
             </w:r>
             <w:r>
@@ -2321,7 +2400,7 @@
         </w:tc>
         <w:tc>
           <w:tcPr>
-            <w:tcW w:w="2245" w:type="dxa"/>
+            <w:tcW w:w="1345" w:type="dxa"/>
           </w:tcPr>
           <w:p>
             <w:pPr>
@@ -2344,7 +2423,7 @@
       <w:tr>
         <w:tc>
           <w:tcPr>
-            <w:tcW w:w="7105" w:type="dxa"/>
+            <w:tcW w:w="8005" w:type="dxa"/>
           </w:tcPr>
           <w:p>
             <w:pPr>
@@ -2365,13 +2444,22 @@
                 <w:sz w:val="28"/>
                 <w:szCs w:val="28"/>
               </w:rPr>
-              <w:t>6.5 Coding Explaination</w:t>
+              <w:t xml:space="preserve">6.5 Coding </w:t>
             </w:r>
+            <w:proofErr w:type="spellStart"/>
+            <w:r>
+              <w:rPr>
+                <w:sz w:val="28"/>
+                <w:szCs w:val="28"/>
+              </w:rPr>
+              <w:t>Explaination</w:t>
+            </w:r>
+            <w:proofErr w:type="spellEnd"/>
           </w:p>
         </w:tc>
         <w:tc>
           <w:tcPr>
-            <w:tcW w:w="2245" w:type="dxa"/>
+            <w:tcW w:w="1345" w:type="dxa"/>
           </w:tcPr>
           <w:p>
             <w:pPr>
@@ -2394,7 +2482,7 @@
       <w:tr>
         <w:tc>
           <w:tcPr>
-            <w:tcW w:w="7105" w:type="dxa"/>
+            <w:tcW w:w="8005" w:type="dxa"/>
           </w:tcPr>
           <w:p>
             <w:pPr>
@@ -2407,7 +2495,7 @@
         </w:tc>
         <w:tc>
           <w:tcPr>
-            <w:tcW w:w="2245" w:type="dxa"/>
+            <w:tcW w:w="1345" w:type="dxa"/>
           </w:tcPr>
           <w:p>
             <w:pPr>
@@ -2423,7 +2511,7 @@
       <w:tr>
         <w:tc>
           <w:tcPr>
-            <w:tcW w:w="7105" w:type="dxa"/>
+            <w:tcW w:w="8005" w:type="dxa"/>
           </w:tcPr>
           <w:p>
             <w:pPr>
@@ -2443,7 +2531,7 @@
         </w:tc>
         <w:tc>
           <w:tcPr>
-            <w:tcW w:w="2245" w:type="dxa"/>
+            <w:tcW w:w="1345" w:type="dxa"/>
           </w:tcPr>
           <w:p>
             <w:pPr>
@@ -2466,7 +2554,7 @@
       <w:tr>
         <w:tc>
           <w:tcPr>
-            <w:tcW w:w="7105" w:type="dxa"/>
+            <w:tcW w:w="8005" w:type="dxa"/>
           </w:tcPr>
           <w:p>
             <w:pPr>
@@ -2479,7 +2567,7 @@
         </w:tc>
         <w:tc>
           <w:tcPr>
-            <w:tcW w:w="2245" w:type="dxa"/>
+            <w:tcW w:w="1345" w:type="dxa"/>
           </w:tcPr>
           <w:p>
             <w:pPr>
@@ -2495,7 +2583,7 @@
       <w:tr>
         <w:tc>
           <w:tcPr>
-            <w:tcW w:w="7105" w:type="dxa"/>
+            <w:tcW w:w="8005" w:type="dxa"/>
           </w:tcPr>
           <w:p>
             <w:pPr>
@@ -2515,7 +2603,7 @@
         </w:tc>
         <w:tc>
           <w:tcPr>
-            <w:tcW w:w="2245" w:type="dxa"/>
+            <w:tcW w:w="1345" w:type="dxa"/>
           </w:tcPr>
           <w:p>
             <w:pPr>
@@ -2532,35 +2620,6 @@
               </w:rPr>
               <w:t>32</w:t>
             </w:r>
-          </w:p>
-        </w:tc>
-      </w:tr>
-      <w:tr>
-        <w:tc>
-          <w:tcPr>
-            <w:tcW w:w="7105" w:type="dxa"/>
-          </w:tcPr>
-          <w:p>
-            <w:pPr>
-              <w:rPr>
-                <w:sz w:val="28"/>
-                <w:szCs w:val="28"/>
-              </w:rPr>
-            </w:pPr>
-          </w:p>
-        </w:tc>
-        <w:tc>
-          <w:tcPr>
-            <w:tcW w:w="2245" w:type="dxa"/>
-          </w:tcPr>
-          <w:p>
-            <w:pPr>
-              <w:jc w:val="right"/>
-              <w:rPr>
-                <w:sz w:val="28"/>
-                <w:szCs w:val="28"/>
-              </w:rPr>
-            </w:pPr>
           </w:p>
         </w:tc>
       </w:tr>
@@ -2624,6 +2683,9 @@
     <w:p/>
     <w:p/>
     <w:p/>
+    <w:p/>
+    <w:p/>
+    <w:p/>
     <w:p>
       <w:pPr>
         <w:jc w:val="center"/>
@@ -2644,79 +2706,245 @@
     <w:p>
       <w:pPr>
         <w:rPr>
+          <w:sz w:val="28"/>
+          <w:szCs w:val="28"/>
+        </w:rPr>
+      </w:pPr>
+    </w:p>
+    <w:p>
+      <w:pPr>
+        <w:rPr>
+          <w:sz w:val="28"/>
+          <w:szCs w:val="28"/>
+        </w:rPr>
+      </w:pPr>
+    </w:p>
+    <w:p>
+      <w:pPr>
+        <w:rPr>
+          <w:sz w:val="28"/>
+          <w:szCs w:val="28"/>
+        </w:rPr>
+      </w:pPr>
+      <w:r>
+        <w:rPr>
+          <w:sz w:val="28"/>
+          <w:szCs w:val="28"/>
+        </w:rPr>
+        <w:t>Organizations require their equipment to operate continuously because equipment downtime creates safety risks and prevents businesses from achieving their productivity needs and operational targets. Equipment failures disrupt operations while creating financial losses and raising maintenance expenses and decreasing customer satisfaction. Reactive maintenance has served as the primary maintenance method for industries because it involves conducting repairs after machines reach their breakdown point. This method generates unexpected operational stops which lead to expensive urgent maintenance work. Preventive maintenance requires equipment to follow its scheduled maintenance times, but this method does not evaluate actual equipment conditions, which results in both excessive maintenance activities and failure detection problems.</w:t>
+      </w:r>
+    </w:p>
+    <w:p>
+      <w:pPr>
+        <w:rPr>
+          <w:sz w:val="28"/>
+          <w:szCs w:val="28"/>
+        </w:rPr>
+      </w:pPr>
+    </w:p>
+    <w:p>
+      <w:pPr>
+        <w:rPr>
+          <w:sz w:val="28"/>
+          <w:szCs w:val="28"/>
+        </w:rPr>
+      </w:pPr>
+      <w:r>
+        <w:rPr>
+          <w:sz w:val="28"/>
+          <w:szCs w:val="28"/>
+        </w:rPr>
+        <w:t>Digital technologies have developed rapidly, which has created new chances for intelligent maintenance systems through access to vast equipment and sensor data streams. Organizations use analytics and data-driven decision-making to transition from time-based maintenance approaches toward condition-based and predictive maintenance systems. Organizations can monitor their operational systems through nonstop surveillance of key parameters, which include temperature, vibration, pressure, and usage patterns, to identify system abnormalities and performance drops and to predict future equipment failures. Organizations use this proactive approach to create optimized maintenance plans, which help them achieve less operational downtime and increased durability for their essential resources.</w:t>
+      </w:r>
+    </w:p>
+    <w:p>
+      <w:pPr>
+        <w:rPr>
+          <w:sz w:val="28"/>
+          <w:szCs w:val="28"/>
+        </w:rPr>
+      </w:pPr>
+    </w:p>
+    <w:p>
+      <w:pPr>
+        <w:rPr>
+          <w:sz w:val="28"/>
+          <w:szCs w:val="28"/>
+        </w:rPr>
+      </w:pPr>
+      <w:r>
+        <w:rPr>
+          <w:sz w:val="28"/>
+          <w:szCs w:val="28"/>
+        </w:rPr>
+        <w:t>The IBM project named "Proactive Equipment Care using Analytics with Cloud - Cloud-Integrated Analytics" intends to use modern technology through its system, which combines analytics functions with cloud computing resources. The project focuses on collecting real-time and historical equipment data and securing its storage into two separate data systems.</w:t>
+      </w:r>
+    </w:p>
+    <w:p>
+      <w:pPr>
+        <w:rPr>
+          <w:sz w:val="28"/>
+          <w:szCs w:val="28"/>
+        </w:rPr>
+      </w:pPr>
+    </w:p>
+    <w:p>
+      <w:pPr>
+        <w:rPr>
+          <w:sz w:val="28"/>
+          <w:szCs w:val="28"/>
+        </w:rPr>
+      </w:pPr>
+    </w:p>
+    <w:p>
+      <w:pPr>
+        <w:rPr>
+          <w:sz w:val="28"/>
+          <w:szCs w:val="28"/>
+        </w:rPr>
+      </w:pPr>
+    </w:p>
+    <w:p>
+      <w:pPr>
+        <w:rPr>
+          <w:sz w:val="28"/>
+          <w:szCs w:val="28"/>
+        </w:rPr>
+      </w:pPr>
+    </w:p>
+    <w:p>
+      <w:pPr>
+        <w:rPr>
+          <w:sz w:val="28"/>
+          <w:szCs w:val="28"/>
+        </w:rPr>
+      </w:pPr>
+    </w:p>
+    <w:p>
+      <w:pPr>
+        <w:rPr>
+          <w:sz w:val="28"/>
+          <w:szCs w:val="28"/>
+        </w:rPr>
+      </w:pPr>
+    </w:p>
+    <w:p>
+      <w:pPr>
+        <w:rPr>
+          <w:sz w:val="28"/>
+          <w:szCs w:val="28"/>
+        </w:rPr>
+      </w:pPr>
+    </w:p>
+    <w:p>
+      <w:pPr>
+        <w:rPr>
+          <w:sz w:val="28"/>
+          <w:szCs w:val="28"/>
+        </w:rPr>
+      </w:pPr>
+    </w:p>
+    <w:p>
+      <w:pPr>
+        <w:jc w:val="center"/>
+        <w:rPr>
           <w:sz w:val="36"/>
           <w:szCs w:val="36"/>
         </w:rPr>
       </w:pPr>
-    </w:p>
-    <w:p>
-      <w:pPr>
+      <w:r>
         <w:rPr>
           <w:sz w:val="36"/>
           <w:szCs w:val="36"/>
         </w:rPr>
-      </w:pPr>
-    </w:p>
-    <w:p>
-      <w:pPr>
-        <w:rPr>
-          <w:sz w:val="28"/>
-          <w:szCs w:val="28"/>
-        </w:rPr>
-      </w:pPr>
-      <w:r>
-        <w:rPr>
-          <w:sz w:val="28"/>
-          <w:szCs w:val="28"/>
-        </w:rPr>
-        <w:t>Organizations require their equipment to operate continuously because equipment downtime creates safety risks and prevents businesses from achieving their productivity needs and operational targets. Equipment failures disrupt operations while creating financial losses and raising maintenance expenses and decreasing customer satisfaction. Reactive maintenance has served as the primary maintenance method for industries because it involves conducting repairs after machines reach their breakdown point. This method generates unexpected operational stops which lead to expensive urgent maintenance work. Preventive maintenance requires equipment to follow its scheduled maintenance times, but this method does not evaluate actual equipment conditions, which results in both excessive maintenance activities and failure detection problems.</w:t>
-      </w:r>
-    </w:p>
-    <w:p>
-      <w:pPr>
-        <w:rPr>
-          <w:sz w:val="28"/>
-          <w:szCs w:val="28"/>
-        </w:rPr>
-      </w:pPr>
-    </w:p>
-    <w:p>
-      <w:pPr>
-        <w:rPr>
-          <w:sz w:val="28"/>
-          <w:szCs w:val="28"/>
-        </w:rPr>
-      </w:pPr>
-      <w:r>
-        <w:rPr>
-          <w:sz w:val="28"/>
-          <w:szCs w:val="28"/>
-        </w:rPr>
-        <w:t>Digital technologies have developed rapidly, which has created new chances for intelligent maintenance systems through access to vast equipment and sensor data streams. Organizations use analytics and data-driven decision-making to transition from time-based maintenance approaches toward condition-based and predictive maintenance systems. Organizations can monitor their operational systems through nonstop surveillance of key parameters, which include temperature, vibration, pressure, and usage patterns, to identify system abnormalities and performance drops and to predict future equipment failures. Organizations use this proactive approach to create optimized maintenance plans, which help them achieve less operational downtime and increased durability for their essential resources.</w:t>
-      </w:r>
-    </w:p>
-    <w:p>
-      <w:pPr>
-        <w:rPr>
-          <w:sz w:val="28"/>
-          <w:szCs w:val="28"/>
-        </w:rPr>
-      </w:pPr>
-    </w:p>
-    <w:p>
-      <w:pPr>
-        <w:rPr>
-          <w:sz w:val="28"/>
-          <w:szCs w:val="28"/>
-        </w:rPr>
-      </w:pPr>
-      <w:r>
-        <w:rPr>
-          <w:sz w:val="28"/>
-          <w:szCs w:val="28"/>
-        </w:rPr>
-        <w:t>The IBM project named "Proactive Equipment Care using Analytics with Cloud - Cloud-Integrated Analytics" intends to use modern technology through its system, which combines analytics functions with cloud computing resources. The project focuses on collecting real-time and historical equipment data and securing its storage into two separate data systems.</w:t>
-      </w:r>
+        <w:lastRenderedPageBreak/>
+        <w:t>CHAPTER 2: PROJECT SCOPE</w:t>
+      </w:r>
+    </w:p>
+    <w:p>
+      <w:pPr>
+        <w:rPr>
+          <w:sz w:val="28"/>
+          <w:szCs w:val="28"/>
+        </w:rPr>
+      </w:pPr>
+    </w:p>
+    <w:p>
+      <w:pPr>
+        <w:rPr>
+          <w:sz w:val="28"/>
+          <w:szCs w:val="28"/>
+        </w:rPr>
+      </w:pPr>
+    </w:p>
+    <w:p>
+      <w:pPr>
+        <w:rPr>
+          <w:sz w:val="28"/>
+          <w:szCs w:val="28"/>
+        </w:rPr>
+      </w:pPr>
+      <w:r>
+        <w:rPr>
+          <w:sz w:val="28"/>
+          <w:szCs w:val="28"/>
+        </w:rPr>
+        <w:t>The scope of the IBM project titled “Proactive Equipment Care using Analytics with Cloud – Cloud-Integrated Analytics” is to design and develop a cloud-based analytical system that enables proactive monitoring and maintenance of equipment using data-driven techniques. The project focuses on collecting, storing, and analyzing historical as well as real-time equipment data to gain meaningful insights into equipment performance and health. By leveraging cloud infrastructure, the system ensures scalability, reliability, and secure data management while supporting remote access and centralized monitoring.</w:t>
+      </w:r>
+    </w:p>
+    <w:p>
+      <w:pPr>
+        <w:rPr>
+          <w:sz w:val="28"/>
+          <w:szCs w:val="28"/>
+        </w:rPr>
+      </w:pPr>
+    </w:p>
+    <w:p>
+      <w:pPr>
+        <w:rPr>
+          <w:sz w:val="28"/>
+          <w:szCs w:val="28"/>
+        </w:rPr>
+      </w:pPr>
+      <w:r>
+        <w:rPr>
+          <w:sz w:val="28"/>
+          <w:szCs w:val="28"/>
+        </w:rPr>
+        <w:t>This project includes the development of a backend system using Python and Flask to handle data ingestion, processing, and communication between different system components. A cloud database and storage solution are used to manage structured and unstructured equipment data efficiently, while authentication mechanisms ensure secure user access. Data preprocessing and exploratory analysis are carried out using analytical tools to clean and prepare the data for modeling. Machine learning models are developed to predict potential equipment failures, detect anomalies, and support condition-based maintenance strategies.</w:t>
+      </w:r>
+    </w:p>
+    <w:p>
+      <w:pPr>
+        <w:rPr>
+          <w:sz w:val="28"/>
+          <w:szCs w:val="28"/>
+        </w:rPr>
+      </w:pPr>
+    </w:p>
+    <w:p>
+      <w:pPr>
+        <w:rPr>
+          <w:sz w:val="28"/>
+          <w:szCs w:val="28"/>
+        </w:rPr>
+      </w:pPr>
+      <w:r>
+        <w:rPr>
+          <w:sz w:val="28"/>
+          <w:szCs w:val="28"/>
+        </w:rPr>
+        <w:t>The project scope also covers the creation of interactive dashboards and visualizations to present analytical results, performance trends, and predictive insights in an understandable manner for end users. These visualizations help maintenance teams and decision-makers take timely and informed actions. However, the scope of this project is limited to analytical prediction and monitoring; it does not include physical sensor installation, real-time hardware control, or automated maintenance execution. Overall, the project aims to demonstrate how cloud-integrated analytics can transform traditional maintenance approaches into a proactive, efficient, and cost-effective equipment care solution.</w:t>
+      </w:r>
+    </w:p>
+    <w:p>
+      <w:pPr>
+        <w:rPr>
+          <w:sz w:val="28"/>
+          <w:szCs w:val="28"/>
+        </w:rPr>
+      </w:pPr>
     </w:p>
     <w:p>
       <w:pPr>
@@ -2796,188 +3024,22 @@
           <w:szCs w:val="36"/>
         </w:rPr>
         <w:lastRenderedPageBreak/>
-        <w:t>CHAPTER 2: PROJECT SCOPE</w:t>
-      </w:r>
-    </w:p>
-    <w:p>
-      <w:pPr>
-        <w:rPr>
-          <w:sz w:val="28"/>
-          <w:szCs w:val="28"/>
-        </w:rPr>
-      </w:pPr>
-    </w:p>
-    <w:p>
-      <w:pPr>
-        <w:rPr>
-          <w:sz w:val="28"/>
-          <w:szCs w:val="28"/>
-        </w:rPr>
-      </w:pPr>
-    </w:p>
-    <w:p>
-      <w:pPr>
-        <w:rPr>
-          <w:sz w:val="28"/>
-          <w:szCs w:val="28"/>
-        </w:rPr>
-      </w:pPr>
-      <w:r>
-        <w:rPr>
-          <w:sz w:val="28"/>
-          <w:szCs w:val="28"/>
-        </w:rPr>
-        <w:t>The scope of the IBM project titled “Proactive Equipment Care using Analytics with Cloud – Cloud-Integrated Analytics” is to design and develop a cloud-based analytical system that enables proactive monitoring and maintenance of equipment using data-driven techniques. The project focuses on collecting, storing, and analyzing historical as well as real-time equipment data to gain meaningful insights into equipment performance and health. By leveraging cloud infrastructure, the system ensures scalability, reliability, and secure data management while supporting remote access and centralized monitoring.</w:t>
-      </w:r>
-    </w:p>
-    <w:p>
-      <w:pPr>
-        <w:rPr>
-          <w:sz w:val="28"/>
-          <w:szCs w:val="28"/>
-        </w:rPr>
-      </w:pPr>
-    </w:p>
-    <w:p>
-      <w:pPr>
-        <w:rPr>
-          <w:sz w:val="28"/>
-          <w:szCs w:val="28"/>
-        </w:rPr>
-      </w:pPr>
-      <w:r>
-        <w:rPr>
-          <w:sz w:val="28"/>
-          <w:szCs w:val="28"/>
-        </w:rPr>
-        <w:t>This project includes the development of a backend system using Python and Flask to handle data ingestion, processing, and communication between different system components. A cloud database and storage solution are used to manage structured and unstructured equipment data efficiently, while authentication mechanisms ensure secure user access. Data preprocessing and exploratory analysis are carried out using analytical tools to clean and prepare the data for modeling. Machine learning models are developed to predict potential equipment failures, detect anomalies, and support condition-based maintenance strategies.</w:t>
-      </w:r>
-    </w:p>
-    <w:p>
-      <w:pPr>
-        <w:rPr>
-          <w:sz w:val="28"/>
-          <w:szCs w:val="28"/>
-        </w:rPr>
-      </w:pPr>
-    </w:p>
-    <w:p>
-      <w:pPr>
-        <w:rPr>
-          <w:sz w:val="28"/>
-          <w:szCs w:val="28"/>
-        </w:rPr>
-      </w:pPr>
-      <w:r>
-        <w:rPr>
-          <w:sz w:val="28"/>
-          <w:szCs w:val="28"/>
-        </w:rPr>
-        <w:t>The project scope also covers the creation of interactive dashboards and visualizations to present analytical results, performance trends, and predictive insights in an understandable manner for end users. These visualizations help maintenance teams and decision-makers take timely and informed actions. However, the scope of this project is limited to analytical prediction and monitoring; it does not include physical sensor installation, real-time hardware control, or automated maintenance execution. Overall, the project aims to demonstrate how cloud-integrated analytics can transform traditional maintenance approaches into a proactive, efficient, and cost-effective equipment care solution.</w:t>
-      </w:r>
-    </w:p>
-    <w:p>
-      <w:pPr>
-        <w:rPr>
-          <w:sz w:val="28"/>
-          <w:szCs w:val="28"/>
-        </w:rPr>
-      </w:pPr>
-    </w:p>
-    <w:p>
-      <w:pPr>
-        <w:rPr>
-          <w:sz w:val="28"/>
-          <w:szCs w:val="28"/>
-        </w:rPr>
-      </w:pPr>
-    </w:p>
-    <w:p>
-      <w:pPr>
-        <w:rPr>
-          <w:sz w:val="28"/>
-          <w:szCs w:val="28"/>
-        </w:rPr>
-      </w:pPr>
-    </w:p>
-    <w:p>
-      <w:pPr>
-        <w:rPr>
-          <w:sz w:val="28"/>
-          <w:szCs w:val="28"/>
-        </w:rPr>
-      </w:pPr>
-    </w:p>
-    <w:p>
-      <w:pPr>
-        <w:rPr>
-          <w:sz w:val="28"/>
-          <w:szCs w:val="28"/>
-        </w:rPr>
-      </w:pPr>
-    </w:p>
-    <w:p>
-      <w:pPr>
-        <w:rPr>
-          <w:sz w:val="28"/>
-          <w:szCs w:val="28"/>
-        </w:rPr>
-      </w:pPr>
-    </w:p>
-    <w:p>
-      <w:pPr>
-        <w:rPr>
-          <w:sz w:val="28"/>
-          <w:szCs w:val="28"/>
-        </w:rPr>
-      </w:pPr>
-    </w:p>
-    <w:p>
-      <w:pPr>
-        <w:rPr>
-          <w:sz w:val="28"/>
-          <w:szCs w:val="28"/>
-        </w:rPr>
-      </w:pPr>
-    </w:p>
-    <w:p>
-      <w:pPr>
-        <w:rPr>
-          <w:sz w:val="28"/>
-          <w:szCs w:val="28"/>
-        </w:rPr>
-      </w:pPr>
-    </w:p>
-    <w:p>
-      <w:pPr>
-        <w:jc w:val="center"/>
-        <w:rPr>
-          <w:sz w:val="36"/>
-          <w:szCs w:val="36"/>
-        </w:rPr>
-      </w:pPr>
-      <w:r>
-        <w:rPr>
-          <w:sz w:val="36"/>
-          <w:szCs w:val="36"/>
-        </w:rPr>
-        <w:lastRenderedPageBreak/>
         <w:t>CHAPTER 3: SOFTWARE AND HARDWARE REQUIREMENTS</w:t>
       </w:r>
     </w:p>
     <w:p>
       <w:pPr>
         <w:rPr>
-          <w:sz w:val="36"/>
-          <w:szCs w:val="36"/>
-        </w:rPr>
-      </w:pPr>
-    </w:p>
-    <w:p>
-      <w:pPr>
-        <w:rPr>
-          <w:sz w:val="36"/>
-          <w:szCs w:val="36"/>
+          <w:sz w:val="28"/>
+          <w:szCs w:val="28"/>
+        </w:rPr>
+      </w:pPr>
+    </w:p>
+    <w:p>
+      <w:pPr>
+        <w:rPr>
+          <w:sz w:val="28"/>
+          <w:szCs w:val="28"/>
         </w:rPr>
       </w:pPr>
     </w:p>
@@ -3255,12 +3317,21 @@
                 <w:szCs w:val="28"/>
               </w:rPr>
             </w:pPr>
+            <w:proofErr w:type="spellStart"/>
             <w:r>
               <w:rPr>
                 <w:sz w:val="28"/>
                 <w:szCs w:val="28"/>
               </w:rPr>
-              <w:t>Jupyter Notebook</w:t>
+              <w:t>Jupyter</w:t>
+            </w:r>
+            <w:proofErr w:type="spellEnd"/>
+            <w:r>
+              <w:rPr>
+                <w:sz w:val="28"/>
+                <w:szCs w:val="28"/>
+              </w:rPr>
+              <w:t xml:space="preserve"> Notebook</w:t>
             </w:r>
           </w:p>
         </w:tc>
@@ -3387,12 +3458,21 @@
                 <w:szCs w:val="28"/>
               </w:rPr>
             </w:pPr>
+            <w:proofErr w:type="spellStart"/>
             <w:r>
               <w:rPr>
                 <w:sz w:val="28"/>
                 <w:szCs w:val="28"/>
               </w:rPr>
-              <w:t>Supabase Storage</w:t>
+              <w:t>Supabase</w:t>
+            </w:r>
+            <w:proofErr w:type="spellEnd"/>
+            <w:r>
+              <w:rPr>
+                <w:sz w:val="28"/>
+                <w:szCs w:val="28"/>
+              </w:rPr>
+              <w:t xml:space="preserve"> Storage</w:t>
             </w:r>
           </w:p>
         </w:tc>
@@ -3431,12 +3511,21 @@
                 <w:szCs w:val="28"/>
               </w:rPr>
             </w:pPr>
+            <w:proofErr w:type="spellStart"/>
             <w:r>
               <w:rPr>
                 <w:sz w:val="28"/>
                 <w:szCs w:val="28"/>
               </w:rPr>
-              <w:t>Supabase PostgreSQL</w:t>
+              <w:t>Supabase</w:t>
+            </w:r>
+            <w:proofErr w:type="spellEnd"/>
+            <w:r>
+              <w:rPr>
+                <w:sz w:val="28"/>
+                <w:szCs w:val="28"/>
+              </w:rPr>
+              <w:t xml:space="preserve"> PostgreSQL</w:t>
             </w:r>
           </w:p>
         </w:tc>
@@ -3475,12 +3564,21 @@
                 <w:szCs w:val="28"/>
               </w:rPr>
             </w:pPr>
+            <w:proofErr w:type="spellStart"/>
             <w:r>
               <w:rPr>
                 <w:sz w:val="28"/>
                 <w:szCs w:val="28"/>
               </w:rPr>
-              <w:t>Supabase Auth</w:t>
+              <w:t>Supabase</w:t>
+            </w:r>
+            <w:proofErr w:type="spellEnd"/>
+            <w:r>
+              <w:rPr>
+                <w:sz w:val="28"/>
+                <w:szCs w:val="28"/>
+              </w:rPr>
+              <w:t xml:space="preserve"> Auth</w:t>
             </w:r>
           </w:p>
         </w:tc>
@@ -4044,8 +4142,17 @@
       <w:pPr>
         <w:jc w:val="center"/>
         <w:rPr>
-          <w:sz w:val="36"/>
-          <w:szCs w:val="36"/>
+          <w:sz w:val="28"/>
+          <w:szCs w:val="28"/>
+        </w:rPr>
+      </w:pPr>
+    </w:p>
+    <w:p>
+      <w:pPr>
+        <w:jc w:val="center"/>
+        <w:rPr>
+          <w:sz w:val="28"/>
+          <w:szCs w:val="28"/>
         </w:rPr>
       </w:pPr>
     </w:p>
@@ -4163,8 +4270,18 @@
           <w:sz w:val="32"/>
           <w:szCs w:val="32"/>
         </w:rPr>
-        <w:t>Model Inforamtion</w:t>
-      </w:r>
+        <w:t xml:space="preserve">Model </w:t>
+      </w:r>
+      <w:proofErr w:type="spellStart"/>
+      <w:r>
+        <w:rPr>
+          <w:rFonts w:ascii="Times New Roman" w:hAnsi="Times New Roman" w:cs="Times New Roman"/>
+          <w:sz w:val="32"/>
+          <w:szCs w:val="32"/>
+        </w:rPr>
+        <w:t>Inforamtion</w:t>
+      </w:r>
+      <w:proofErr w:type="spellEnd"/>
     </w:p>
     <w:p>
       <w:pPr>
@@ -4229,8 +4346,18 @@
           <w:sz w:val="28"/>
           <w:szCs w:val="28"/>
         </w:rPr>
-        <w:t>Framework: TensorFlow/Keras</w:t>
-      </w:r>
+        <w:t>Framework: TensorFlow/</w:t>
+      </w:r>
+      <w:proofErr w:type="spellStart"/>
+      <w:r>
+        <w:rPr>
+          <w:rFonts w:ascii="Times New Roman" w:hAnsi="Times New Roman" w:cs="Times New Roman"/>
+          <w:sz w:val="28"/>
+          <w:szCs w:val="28"/>
+        </w:rPr>
+        <w:t>Keras</w:t>
+      </w:r>
+      <w:proofErr w:type="spellEnd"/>
     </w:p>
     <w:p>
       <w:pPr>
@@ -4595,7 +4722,25 @@
           <w:sz w:val="28"/>
           <w:szCs w:val="28"/>
         </w:rPr>
-        <w:t>Vibration (mm/s) - Multi-axis vibration measurements</w:t>
+        <w:t xml:space="preserve">Vibration (mm/s) - </w:t>
+      </w:r>
+      <w:proofErr w:type="gramStart"/>
+      <w:r>
+        <w:rPr>
+          <w:rFonts w:ascii="Times New Roman" w:hAnsi="Times New Roman" w:cs="Times New Roman"/>
+          <w:sz w:val="28"/>
+          <w:szCs w:val="28"/>
+        </w:rPr>
+        <w:t>Multi-axis</w:t>
+      </w:r>
+      <w:proofErr w:type="gramEnd"/>
+      <w:r>
+        <w:rPr>
+          <w:rFonts w:ascii="Times New Roman" w:hAnsi="Times New Roman" w:cs="Times New Roman"/>
+          <w:sz w:val="28"/>
+          <w:szCs w:val="28"/>
+        </w:rPr>
+        <w:t xml:space="preserve"> vibration measurements</w:t>
       </w:r>
     </w:p>
     <w:p>
@@ -4820,7 +4965,25 @@
           <w:sz w:val="28"/>
           <w:szCs w:val="28"/>
         </w:rPr>
-        <w:t>Read CSV files from Supabase storage</w:t>
+        <w:t xml:space="preserve">Read CSV files from </w:t>
+      </w:r>
+      <w:proofErr w:type="spellStart"/>
+      <w:r>
+        <w:rPr>
+          <w:rFonts w:ascii="Times New Roman" w:hAnsi="Times New Roman" w:cs="Times New Roman"/>
+          <w:sz w:val="28"/>
+          <w:szCs w:val="28"/>
+        </w:rPr>
+        <w:t>Supabase</w:t>
+      </w:r>
+      <w:proofErr w:type="spellEnd"/>
+      <w:r>
+        <w:rPr>
+          <w:rFonts w:ascii="Times New Roman" w:hAnsi="Times New Roman" w:cs="Times New Roman"/>
+          <w:sz w:val="28"/>
+          <w:szCs w:val="28"/>
+        </w:rPr>
+        <w:t xml:space="preserve"> storage</w:t>
       </w:r>
     </w:p>
     <w:p>
@@ -4839,8 +5002,18 @@
           <w:sz w:val="28"/>
           <w:szCs w:val="28"/>
         </w:rPr>
-        <w:t>Merge multiple datasets by timestamp and motor_id</w:t>
-      </w:r>
+        <w:t xml:space="preserve">Merge multiple datasets by timestamp and </w:t>
+      </w:r>
+      <w:proofErr w:type="spellStart"/>
+      <w:r>
+        <w:rPr>
+          <w:rFonts w:ascii="Times New Roman" w:hAnsi="Times New Roman" w:cs="Times New Roman"/>
+          <w:sz w:val="28"/>
+          <w:szCs w:val="28"/>
+        </w:rPr>
+        <w:t>motor_id</w:t>
+      </w:r>
+      <w:proofErr w:type="spellEnd"/>
     </w:p>
     <w:p>
       <w:pPr>
@@ -5156,7 +5329,25 @@
           <w:sz w:val="28"/>
           <w:szCs w:val="28"/>
         </w:rPr>
-        <w:t>Sequence Length: 30 time steps (30 minutes of data)</w:t>
+        <w:t xml:space="preserve">Sequence Length: </w:t>
+      </w:r>
+      <w:proofErr w:type="gramStart"/>
+      <w:r>
+        <w:rPr>
+          <w:rFonts w:ascii="Times New Roman" w:hAnsi="Times New Roman" w:cs="Times New Roman"/>
+          <w:sz w:val="28"/>
+          <w:szCs w:val="28"/>
+        </w:rPr>
+        <w:t>30 time</w:t>
+      </w:r>
+      <w:proofErr w:type="gramEnd"/>
+      <w:r>
+        <w:rPr>
+          <w:rFonts w:ascii="Times New Roman" w:hAnsi="Times New Roman" w:cs="Times New Roman"/>
+          <w:sz w:val="28"/>
+          <w:szCs w:val="28"/>
+        </w:rPr>
+        <w:t xml:space="preserve"> steps (30 minutes of data)</w:t>
       </w:r>
     </w:p>
     <w:p>
@@ -5522,8 +5713,18 @@
           <w:sz w:val="28"/>
           <w:szCs w:val="28"/>
         </w:rPr>
-        <w:t>Loss Function: Binary Crossentropy</w:t>
-      </w:r>
+        <w:t xml:space="preserve">Loss Function: Binary </w:t>
+      </w:r>
+      <w:proofErr w:type="spellStart"/>
+      <w:r>
+        <w:rPr>
+          <w:rFonts w:ascii="Times New Roman" w:hAnsi="Times New Roman" w:cs="Times New Roman"/>
+          <w:sz w:val="28"/>
+          <w:szCs w:val="28"/>
+        </w:rPr>
+        <w:t>Crossentropy</w:t>
+      </w:r>
+      <w:proofErr w:type="spellEnd"/>
     </w:p>
     <w:p>
       <w:pPr>
@@ -5948,7 +6149,25 @@
           <w:sz w:val="28"/>
           <w:szCs w:val="28"/>
         </w:rPr>
-        <w:t>Calculate binary crossentropy loss</w:t>
+        <w:t xml:space="preserve">Calculate binary </w:t>
+      </w:r>
+      <w:proofErr w:type="spellStart"/>
+      <w:r>
+        <w:rPr>
+          <w:rFonts w:ascii="Times New Roman" w:hAnsi="Times New Roman" w:cs="Times New Roman"/>
+          <w:sz w:val="28"/>
+          <w:szCs w:val="28"/>
+        </w:rPr>
+        <w:t>crossentropy</w:t>
+      </w:r>
+      <w:proofErr w:type="spellEnd"/>
+      <w:r>
+        <w:rPr>
+          <w:rFonts w:ascii="Times New Roman" w:hAnsi="Times New Roman" w:cs="Times New Roman"/>
+          <w:sz w:val="28"/>
+          <w:szCs w:val="28"/>
+        </w:rPr>
+        <w:t xml:space="preserve"> loss</w:t>
       </w:r>
     </w:p>
     <w:p>
@@ -8181,7 +8400,25 @@
           <w:sz w:val="28"/>
           <w:szCs w:val="28"/>
         </w:rPr>
-        <w:t>Install required software (Python, VS Code, Jupyter, Tableau)</w:t>
+        <w:t xml:space="preserve">Install required software (Python, VS Code, </w:t>
+      </w:r>
+      <w:proofErr w:type="spellStart"/>
+      <w:r>
+        <w:rPr>
+          <w:rFonts w:ascii="Times New Roman" w:hAnsi="Times New Roman" w:cs="Times New Roman"/>
+          <w:sz w:val="28"/>
+          <w:szCs w:val="28"/>
+        </w:rPr>
+        <w:t>Jupyter</w:t>
+      </w:r>
+      <w:proofErr w:type="spellEnd"/>
+      <w:r>
+        <w:rPr>
+          <w:rFonts w:ascii="Times New Roman" w:hAnsi="Times New Roman" w:cs="Times New Roman"/>
+          <w:sz w:val="28"/>
+          <w:szCs w:val="28"/>
+        </w:rPr>
+        <w:t>, Tableau)</w:t>
       </w:r>
     </w:p>
     <w:p>
@@ -8303,7 +8540,25 @@
           <w:sz w:val="28"/>
           <w:szCs w:val="28"/>
         </w:rPr>
-        <w:t>Create and configure Supabase project</w:t>
+        <w:t xml:space="preserve">Create and configure </w:t>
+      </w:r>
+      <w:proofErr w:type="spellStart"/>
+      <w:r>
+        <w:rPr>
+          <w:rFonts w:ascii="Times New Roman" w:hAnsi="Times New Roman" w:cs="Times New Roman"/>
+          <w:sz w:val="28"/>
+          <w:szCs w:val="28"/>
+        </w:rPr>
+        <w:t>Supabase</w:t>
+      </w:r>
+      <w:proofErr w:type="spellEnd"/>
+      <w:r>
+        <w:rPr>
+          <w:rFonts w:ascii="Times New Roman" w:hAnsi="Times New Roman" w:cs="Times New Roman"/>
+          <w:sz w:val="28"/>
+          <w:szCs w:val="28"/>
+        </w:rPr>
+        <w:t xml:space="preserve"> project</w:t>
       </w:r>
     </w:p>
     <w:p>
@@ -8347,7 +8602,43 @@
           <w:sz w:val="28"/>
           <w:szCs w:val="28"/>
         </w:rPr>
-        <w:t>Design database tables (login_logs, model_predictions)</w:t>
+        <w:t>Design database tables (</w:t>
+      </w:r>
+      <w:proofErr w:type="spellStart"/>
+      <w:r>
+        <w:rPr>
+          <w:rFonts w:ascii="Times New Roman" w:hAnsi="Times New Roman" w:cs="Times New Roman"/>
+          <w:sz w:val="28"/>
+          <w:szCs w:val="28"/>
+        </w:rPr>
+        <w:t>login_logs</w:t>
+      </w:r>
+      <w:proofErr w:type="spellEnd"/>
+      <w:r>
+        <w:rPr>
+          <w:rFonts w:ascii="Times New Roman" w:hAnsi="Times New Roman" w:cs="Times New Roman"/>
+          <w:sz w:val="28"/>
+          <w:szCs w:val="28"/>
+        </w:rPr>
+        <w:t xml:space="preserve">, </w:t>
+      </w:r>
+      <w:proofErr w:type="spellStart"/>
+      <w:r>
+        <w:rPr>
+          <w:rFonts w:ascii="Times New Roman" w:hAnsi="Times New Roman" w:cs="Times New Roman"/>
+          <w:sz w:val="28"/>
+          <w:szCs w:val="28"/>
+        </w:rPr>
+        <w:t>model_predictions</w:t>
+      </w:r>
+      <w:proofErr w:type="spellEnd"/>
+      <w:r>
+        <w:rPr>
+          <w:rFonts w:ascii="Times New Roman" w:hAnsi="Times New Roman" w:cs="Times New Roman"/>
+          <w:sz w:val="28"/>
+          <w:szCs w:val="28"/>
+        </w:rPr>
+        <w:t>)</w:t>
       </w:r>
     </w:p>
     <w:p>
@@ -8425,7 +8716,25 @@
           <w:sz w:val="28"/>
           <w:szCs w:val="28"/>
         </w:rPr>
-        <w:t>Develop Supabase connection module</w:t>
+        <w:t xml:space="preserve">Develop </w:t>
+      </w:r>
+      <w:proofErr w:type="spellStart"/>
+      <w:r>
+        <w:rPr>
+          <w:rFonts w:ascii="Times New Roman" w:hAnsi="Times New Roman" w:cs="Times New Roman"/>
+          <w:sz w:val="28"/>
+          <w:szCs w:val="28"/>
+        </w:rPr>
+        <w:t>Supabase</w:t>
+      </w:r>
+      <w:proofErr w:type="spellEnd"/>
+      <w:r>
+        <w:rPr>
+          <w:rFonts w:ascii="Times New Roman" w:hAnsi="Times New Roman" w:cs="Times New Roman"/>
+          <w:sz w:val="28"/>
+          <w:szCs w:val="28"/>
+        </w:rPr>
+        <w:t xml:space="preserve"> connection module</w:t>
       </w:r>
     </w:p>
     <w:p>
@@ -8876,8 +9185,18 @@
           <w:sz w:val="28"/>
           <w:szCs w:val="28"/>
         </w:rPr>
-        <w:t>Implement authentication using Supabase</w:t>
-      </w:r>
+        <w:t xml:space="preserve">Implement authentication using </w:t>
+      </w:r>
+      <w:proofErr w:type="spellStart"/>
+      <w:r>
+        <w:rPr>
+          <w:rFonts w:ascii="Times New Roman" w:hAnsi="Times New Roman" w:cs="Times New Roman"/>
+          <w:sz w:val="28"/>
+          <w:szCs w:val="28"/>
+        </w:rPr>
+        <w:t>Supabase</w:t>
+      </w:r>
+      <w:proofErr w:type="spellEnd"/>
     </w:p>
     <w:p>
       <w:pPr>
@@ -8976,7 +9295,25 @@
           <w:sz w:val="28"/>
           <w:szCs w:val="28"/>
         </w:rPr>
-        <w:t>Store logs in Supabase database</w:t>
+        <w:t xml:space="preserve">Store logs in </w:t>
+      </w:r>
+      <w:proofErr w:type="spellStart"/>
+      <w:r>
+        <w:rPr>
+          <w:rFonts w:ascii="Times New Roman" w:hAnsi="Times New Roman" w:cs="Times New Roman"/>
+          <w:sz w:val="28"/>
+          <w:szCs w:val="28"/>
+        </w:rPr>
+        <w:t>Supabase</w:t>
+      </w:r>
+      <w:proofErr w:type="spellEnd"/>
+      <w:r>
+        <w:rPr>
+          <w:rFonts w:ascii="Times New Roman" w:hAnsi="Times New Roman" w:cs="Times New Roman"/>
+          <w:sz w:val="28"/>
+          <w:szCs w:val="28"/>
+        </w:rPr>
+        <w:t xml:space="preserve"> database</w:t>
       </w:r>
     </w:p>
     <w:p>
@@ -9428,8 +9765,16 @@
     <w:p>
       <w:pPr>
         <w:rPr>
-          <w:sz w:val="36"/>
-          <w:szCs w:val="36"/>
+          <w:sz w:val="28"/>
+          <w:szCs w:val="28"/>
+        </w:rPr>
+      </w:pPr>
+    </w:p>
+    <w:p>
+      <w:pPr>
+        <w:rPr>
+          <w:sz w:val="28"/>
+          <w:szCs w:val="28"/>
         </w:rPr>
       </w:pPr>
     </w:p>
@@ -9504,7 +9849,61 @@
           <w:sz w:val="28"/>
           <w:szCs w:val="28"/>
         </w:rPr>
-        <w:t xml:space="preserve"> like Pandas, NumPy ,TensorFlow/Keras, Supabase client, Flask, Scikit-learn</w:t>
+        <w:t xml:space="preserve"> like Pandas, </w:t>
+      </w:r>
+      <w:proofErr w:type="gramStart"/>
+      <w:r>
+        <w:rPr>
+          <w:rFonts w:ascii="Times New Roman" w:hAnsi="Times New Roman" w:cs="Times New Roman"/>
+          <w:sz w:val="28"/>
+          <w:szCs w:val="28"/>
+        </w:rPr>
+        <w:t>NumPy ,TensorFlow</w:t>
+      </w:r>
+      <w:proofErr w:type="gramEnd"/>
+      <w:r>
+        <w:rPr>
+          <w:rFonts w:ascii="Times New Roman" w:hAnsi="Times New Roman" w:cs="Times New Roman"/>
+          <w:sz w:val="28"/>
+          <w:szCs w:val="28"/>
+        </w:rPr>
+        <w:t>/</w:t>
+      </w:r>
+      <w:proofErr w:type="spellStart"/>
+      <w:r>
+        <w:rPr>
+          <w:rFonts w:ascii="Times New Roman" w:hAnsi="Times New Roman" w:cs="Times New Roman"/>
+          <w:sz w:val="28"/>
+          <w:szCs w:val="28"/>
+        </w:rPr>
+        <w:t>Keras</w:t>
+      </w:r>
+      <w:proofErr w:type="spellEnd"/>
+      <w:r>
+        <w:rPr>
+          <w:rFonts w:ascii="Times New Roman" w:hAnsi="Times New Roman" w:cs="Times New Roman"/>
+          <w:sz w:val="28"/>
+          <w:szCs w:val="28"/>
+        </w:rPr>
+        <w:t xml:space="preserve">, </w:t>
+      </w:r>
+      <w:proofErr w:type="spellStart"/>
+      <w:r>
+        <w:rPr>
+          <w:rFonts w:ascii="Times New Roman" w:hAnsi="Times New Roman" w:cs="Times New Roman"/>
+          <w:sz w:val="28"/>
+          <w:szCs w:val="28"/>
+        </w:rPr>
+        <w:t>Supabase</w:t>
+      </w:r>
+      <w:proofErr w:type="spellEnd"/>
+      <w:r>
+        <w:rPr>
+          <w:rFonts w:ascii="Times New Roman" w:hAnsi="Times New Roman" w:cs="Times New Roman"/>
+          <w:sz w:val="28"/>
+          <w:szCs w:val="28"/>
+        </w:rPr>
+        <w:t xml:space="preserve"> client, Flask, Scikit-learn</w:t>
       </w:r>
     </w:p>
     <w:p>
@@ -9556,7 +9955,25 @@
           <w:sz w:val="28"/>
           <w:szCs w:val="28"/>
         </w:rPr>
-        <w:t>- SUPABASE_URL: Your Supabase project URL</w:t>
+        <w:t xml:space="preserve">- SUPABASE_URL: Your </w:t>
+      </w:r>
+      <w:proofErr w:type="spellStart"/>
+      <w:r>
+        <w:rPr>
+          <w:rFonts w:ascii="Times New Roman" w:hAnsi="Times New Roman" w:cs="Times New Roman"/>
+          <w:sz w:val="28"/>
+          <w:szCs w:val="28"/>
+        </w:rPr>
+        <w:t>Supabase</w:t>
+      </w:r>
+      <w:proofErr w:type="spellEnd"/>
+      <w:r>
+        <w:rPr>
+          <w:rFonts w:ascii="Times New Roman" w:hAnsi="Times New Roman" w:cs="Times New Roman"/>
+          <w:sz w:val="28"/>
+          <w:szCs w:val="28"/>
+        </w:rPr>
+        <w:t xml:space="preserve"> project URL</w:t>
       </w:r>
     </w:p>
     <w:p>
@@ -9575,7 +9992,25 @@
           <w:sz w:val="28"/>
           <w:szCs w:val="28"/>
         </w:rPr>
-        <w:t>- SUPABASE_KEY: Your Supabase anon/service key</w:t>
+        <w:t xml:space="preserve">- SUPABASE_KEY: Your </w:t>
+      </w:r>
+      <w:proofErr w:type="spellStart"/>
+      <w:r>
+        <w:rPr>
+          <w:rFonts w:ascii="Times New Roman" w:hAnsi="Times New Roman" w:cs="Times New Roman"/>
+          <w:sz w:val="28"/>
+          <w:szCs w:val="28"/>
+        </w:rPr>
+        <w:t>Supabase</w:t>
+      </w:r>
+      <w:proofErr w:type="spellEnd"/>
+      <w:r>
+        <w:rPr>
+          <w:rFonts w:ascii="Times New Roman" w:hAnsi="Times New Roman" w:cs="Times New Roman"/>
+          <w:sz w:val="28"/>
+          <w:szCs w:val="28"/>
+        </w:rPr>
+        <w:t xml:space="preserve"> anon/service key</w:t>
       </w:r>
     </w:p>
     <w:p>
@@ -9646,7 +10081,25 @@
           <w:sz w:val="28"/>
           <w:szCs w:val="28"/>
         </w:rPr>
-        <w:t>Action: Create Supabase database tables using provided SQL scripts</w:t>
+        <w:t xml:space="preserve">Action: Create </w:t>
+      </w:r>
+      <w:proofErr w:type="spellStart"/>
+      <w:r>
+        <w:rPr>
+          <w:rFonts w:ascii="Times New Roman" w:hAnsi="Times New Roman" w:cs="Times New Roman"/>
+          <w:sz w:val="28"/>
+          <w:szCs w:val="28"/>
+        </w:rPr>
+        <w:t>Supabase</w:t>
+      </w:r>
+      <w:proofErr w:type="spellEnd"/>
+      <w:r>
+        <w:rPr>
+          <w:rFonts w:ascii="Times New Roman" w:hAnsi="Times New Roman" w:cs="Times New Roman"/>
+          <w:sz w:val="28"/>
+          <w:szCs w:val="28"/>
+        </w:rPr>
+        <w:t xml:space="preserve"> database tables using provided SQL scripts</w:t>
       </w:r>
     </w:p>
     <w:p>
@@ -9684,15 +10137,141 @@
           <w:sz w:val="28"/>
           <w:szCs w:val="28"/>
         </w:rPr>
-        <w:t>a) login_logs table:</w:t>
-      </w:r>
-      <w:r>
-        <w:rPr>
-          <w:rFonts w:ascii="Times New Roman" w:hAnsi="Times New Roman" w:cs="Times New Roman"/>
-          <w:sz w:val="28"/>
-          <w:szCs w:val="28"/>
-        </w:rPr>
-        <w:t xml:space="preserve"> id (uuid, primary key), user_email (text),login_time (timestamp), ip_address (text), dashboard_accessed (text)   </w:t>
+        <w:t xml:space="preserve">a) </w:t>
+      </w:r>
+      <w:proofErr w:type="spellStart"/>
+      <w:r>
+        <w:rPr>
+          <w:rFonts w:ascii="Times New Roman" w:hAnsi="Times New Roman" w:cs="Times New Roman"/>
+          <w:sz w:val="28"/>
+          <w:szCs w:val="28"/>
+        </w:rPr>
+        <w:t>login_logs</w:t>
+      </w:r>
+      <w:proofErr w:type="spellEnd"/>
+      <w:r>
+        <w:rPr>
+          <w:rFonts w:ascii="Times New Roman" w:hAnsi="Times New Roman" w:cs="Times New Roman"/>
+          <w:sz w:val="28"/>
+          <w:szCs w:val="28"/>
+        </w:rPr>
+        <w:t xml:space="preserve"> table:</w:t>
+      </w:r>
+      <w:r>
+        <w:rPr>
+          <w:rFonts w:ascii="Times New Roman" w:hAnsi="Times New Roman" w:cs="Times New Roman"/>
+          <w:sz w:val="28"/>
+          <w:szCs w:val="28"/>
+        </w:rPr>
+        <w:t xml:space="preserve"> id (</w:t>
+      </w:r>
+      <w:proofErr w:type="spellStart"/>
+      <w:r>
+        <w:rPr>
+          <w:rFonts w:ascii="Times New Roman" w:hAnsi="Times New Roman" w:cs="Times New Roman"/>
+          <w:sz w:val="28"/>
+          <w:szCs w:val="28"/>
+        </w:rPr>
+        <w:t>uuid</w:t>
+      </w:r>
+      <w:proofErr w:type="spellEnd"/>
+      <w:r>
+        <w:rPr>
+          <w:rFonts w:ascii="Times New Roman" w:hAnsi="Times New Roman" w:cs="Times New Roman"/>
+          <w:sz w:val="28"/>
+          <w:szCs w:val="28"/>
+        </w:rPr>
+        <w:t xml:space="preserve">, primary key), </w:t>
+      </w:r>
+      <w:proofErr w:type="spellStart"/>
+      <w:r>
+        <w:rPr>
+          <w:rFonts w:ascii="Times New Roman" w:hAnsi="Times New Roman" w:cs="Times New Roman"/>
+          <w:sz w:val="28"/>
+          <w:szCs w:val="28"/>
+        </w:rPr>
+        <w:t>user_email</w:t>
+      </w:r>
+      <w:proofErr w:type="spellEnd"/>
+      <w:r>
+        <w:rPr>
+          <w:rFonts w:ascii="Times New Roman" w:hAnsi="Times New Roman" w:cs="Times New Roman"/>
+          <w:sz w:val="28"/>
+          <w:szCs w:val="28"/>
+        </w:rPr>
+        <w:t xml:space="preserve"> (text</w:t>
+      </w:r>
+      <w:proofErr w:type="gramStart"/>
+      <w:r>
+        <w:rPr>
+          <w:rFonts w:ascii="Times New Roman" w:hAnsi="Times New Roman" w:cs="Times New Roman"/>
+          <w:sz w:val="28"/>
+          <w:szCs w:val="28"/>
+        </w:rPr>
+        <w:t>),</w:t>
+      </w:r>
+      <w:proofErr w:type="spellStart"/>
+      <w:r>
+        <w:rPr>
+          <w:rFonts w:ascii="Times New Roman" w:hAnsi="Times New Roman" w:cs="Times New Roman"/>
+          <w:sz w:val="28"/>
+          <w:szCs w:val="28"/>
+        </w:rPr>
+        <w:t>login</w:t>
+      </w:r>
+      <w:proofErr w:type="gramEnd"/>
+      <w:r>
+        <w:rPr>
+          <w:rFonts w:ascii="Times New Roman" w:hAnsi="Times New Roman" w:cs="Times New Roman"/>
+          <w:sz w:val="28"/>
+          <w:szCs w:val="28"/>
+        </w:rPr>
+        <w:t>_time</w:t>
+      </w:r>
+      <w:proofErr w:type="spellEnd"/>
+      <w:r>
+        <w:rPr>
+          <w:rFonts w:ascii="Times New Roman" w:hAnsi="Times New Roman" w:cs="Times New Roman"/>
+          <w:sz w:val="28"/>
+          <w:szCs w:val="28"/>
+        </w:rPr>
+        <w:t xml:space="preserve"> (timestamp), </w:t>
+      </w:r>
+      <w:proofErr w:type="spellStart"/>
+      <w:r>
+        <w:rPr>
+          <w:rFonts w:ascii="Times New Roman" w:hAnsi="Times New Roman" w:cs="Times New Roman"/>
+          <w:sz w:val="28"/>
+          <w:szCs w:val="28"/>
+        </w:rPr>
+        <w:t>ip_address</w:t>
+      </w:r>
+      <w:proofErr w:type="spellEnd"/>
+      <w:r>
+        <w:rPr>
+          <w:rFonts w:ascii="Times New Roman" w:hAnsi="Times New Roman" w:cs="Times New Roman"/>
+          <w:sz w:val="28"/>
+          <w:szCs w:val="28"/>
+        </w:rPr>
+        <w:t xml:space="preserve"> (text), </w:t>
+      </w:r>
+      <w:proofErr w:type="spellStart"/>
+      <w:r>
+        <w:rPr>
+          <w:rFonts w:ascii="Times New Roman" w:hAnsi="Times New Roman" w:cs="Times New Roman"/>
+          <w:sz w:val="28"/>
+          <w:szCs w:val="28"/>
+        </w:rPr>
+        <w:t>dashboard_accessed</w:t>
+      </w:r>
+      <w:proofErr w:type="spellEnd"/>
+      <w:r>
+        <w:rPr>
+          <w:rFonts w:ascii="Times New Roman" w:hAnsi="Times New Roman" w:cs="Times New Roman"/>
+          <w:sz w:val="28"/>
+          <w:szCs w:val="28"/>
+        </w:rPr>
+        <w:t xml:space="preserve"> (text)   </w:t>
       </w:r>
     </w:p>
     <w:p>
@@ -9722,15 +10301,69 @@
           <w:sz w:val="28"/>
           <w:szCs w:val="28"/>
         </w:rPr>
-        <w:t>b) model_predictions table:</w:t>
-      </w:r>
-      <w:r>
-        <w:rPr>
-          <w:rFonts w:ascii="Times New Roman" w:hAnsi="Times New Roman" w:cs="Times New Roman"/>
-          <w:sz w:val="28"/>
-          <w:szCs w:val="28"/>
-        </w:rPr>
-        <w:t xml:space="preserve"> timestamp (timestamp), motor_id (text), failure_probability (float)</w:t>
+        <w:t xml:space="preserve">b) </w:t>
+      </w:r>
+      <w:proofErr w:type="spellStart"/>
+      <w:r>
+        <w:rPr>
+          <w:rFonts w:ascii="Times New Roman" w:hAnsi="Times New Roman" w:cs="Times New Roman"/>
+          <w:sz w:val="28"/>
+          <w:szCs w:val="28"/>
+        </w:rPr>
+        <w:t>model_predictions</w:t>
+      </w:r>
+      <w:proofErr w:type="spellEnd"/>
+      <w:r>
+        <w:rPr>
+          <w:rFonts w:ascii="Times New Roman" w:hAnsi="Times New Roman" w:cs="Times New Roman"/>
+          <w:sz w:val="28"/>
+          <w:szCs w:val="28"/>
+        </w:rPr>
+        <w:t xml:space="preserve"> table:</w:t>
+      </w:r>
+      <w:r>
+        <w:rPr>
+          <w:rFonts w:ascii="Times New Roman" w:hAnsi="Times New Roman" w:cs="Times New Roman"/>
+          <w:sz w:val="28"/>
+          <w:szCs w:val="28"/>
+        </w:rPr>
+        <w:t xml:space="preserve"> timestamp (timestamp), </w:t>
+      </w:r>
+      <w:proofErr w:type="spellStart"/>
+      <w:r>
+        <w:rPr>
+          <w:rFonts w:ascii="Times New Roman" w:hAnsi="Times New Roman" w:cs="Times New Roman"/>
+          <w:sz w:val="28"/>
+          <w:szCs w:val="28"/>
+        </w:rPr>
+        <w:t>motor_id</w:t>
+      </w:r>
+      <w:proofErr w:type="spellEnd"/>
+      <w:r>
+        <w:rPr>
+          <w:rFonts w:ascii="Times New Roman" w:hAnsi="Times New Roman" w:cs="Times New Roman"/>
+          <w:sz w:val="28"/>
+          <w:szCs w:val="28"/>
+        </w:rPr>
+        <w:t xml:space="preserve"> (text), </w:t>
+      </w:r>
+      <w:proofErr w:type="spellStart"/>
+      <w:r>
+        <w:rPr>
+          <w:rFonts w:ascii="Times New Roman" w:hAnsi="Times New Roman" w:cs="Times New Roman"/>
+          <w:sz w:val="28"/>
+          <w:szCs w:val="28"/>
+        </w:rPr>
+        <w:t>failure_probability</w:t>
+      </w:r>
+      <w:proofErr w:type="spellEnd"/>
+      <w:r>
+        <w:rPr>
+          <w:rFonts w:ascii="Times New Roman" w:hAnsi="Times New Roman" w:cs="Times New Roman"/>
+          <w:sz w:val="28"/>
+          <w:szCs w:val="28"/>
+        </w:rPr>
+        <w:t xml:space="preserve"> (float)</w:t>
       </w:r>
     </w:p>
     <w:p>
@@ -9771,7 +10404,25 @@
           <w:sz w:val="28"/>
           <w:szCs w:val="28"/>
         </w:rPr>
-        <w:t>Purpose: Download motor sensor data from Supabase storage</w:t>
+        <w:t xml:space="preserve">Purpose: Download motor sensor data from </w:t>
+      </w:r>
+      <w:proofErr w:type="spellStart"/>
+      <w:r>
+        <w:rPr>
+          <w:rFonts w:ascii="Times New Roman" w:hAnsi="Times New Roman" w:cs="Times New Roman"/>
+          <w:sz w:val="28"/>
+          <w:szCs w:val="28"/>
+        </w:rPr>
+        <w:t>Supabase</w:t>
+      </w:r>
+      <w:proofErr w:type="spellEnd"/>
+      <w:r>
+        <w:rPr>
+          <w:rFonts w:ascii="Times New Roman" w:hAnsi="Times New Roman" w:cs="Times New Roman"/>
+          <w:sz w:val="28"/>
+          <w:szCs w:val="28"/>
+        </w:rPr>
+        <w:t xml:space="preserve"> storage</w:t>
       </w:r>
     </w:p>
     <w:p>
@@ -9804,7 +10455,25 @@
           <w:sz w:val="28"/>
           <w:szCs w:val="28"/>
         </w:rPr>
-        <w:t>Step 5: Execute Jupyter Notebooks in Sequence</w:t>
+        <w:t xml:space="preserve">Step 5: Execute </w:t>
+      </w:r>
+      <w:proofErr w:type="spellStart"/>
+      <w:r>
+        <w:rPr>
+          <w:rFonts w:ascii="Times New Roman" w:hAnsi="Times New Roman" w:cs="Times New Roman"/>
+          <w:sz w:val="28"/>
+          <w:szCs w:val="28"/>
+        </w:rPr>
+        <w:t>Jupyter</w:t>
+      </w:r>
+      <w:proofErr w:type="spellEnd"/>
+      <w:r>
+        <w:rPr>
+          <w:rFonts w:ascii="Times New Roman" w:hAnsi="Times New Roman" w:cs="Times New Roman"/>
+          <w:sz w:val="28"/>
+          <w:szCs w:val="28"/>
+        </w:rPr>
+        <w:t xml:space="preserve"> Notebooks in Sequence</w:t>
       </w:r>
     </w:p>
     <w:p>
@@ -9918,8 +10587,18 @@
           <w:sz w:val="28"/>
           <w:szCs w:val="28"/>
         </w:rPr>
-        <w:t>- Output: Unified DataFrame</w:t>
-      </w:r>
+        <w:t xml:space="preserve">- Output: Unified </w:t>
+      </w:r>
+      <w:proofErr w:type="spellStart"/>
+      <w:r>
+        <w:rPr>
+          <w:rFonts w:ascii="Times New Roman" w:hAnsi="Times New Roman" w:cs="Times New Roman"/>
+          <w:sz w:val="28"/>
+          <w:szCs w:val="28"/>
+        </w:rPr>
+        <w:t>DataFrame</w:t>
+      </w:r>
+      <w:proofErr w:type="spellEnd"/>
     </w:p>
     <w:p>
       <w:pPr>
@@ -9937,6 +10616,7 @@
           <w:sz w:val="28"/>
           <w:szCs w:val="28"/>
         </w:rPr>
+        <w:lastRenderedPageBreak/>
         <w:t>b) notebooks/02_data_preprocessing.ipynb</w:t>
       </w:r>
     </w:p>
@@ -9956,7 +10636,6 @@
           <w:sz w:val="28"/>
           <w:szCs w:val="28"/>
         </w:rPr>
-        <w:lastRenderedPageBreak/>
         <w:t>- Handles missing values</w:t>
       </w:r>
     </w:p>
@@ -10625,6 +11304,7 @@
           <w:sz w:val="28"/>
           <w:szCs w:val="28"/>
         </w:rPr>
+        <w:lastRenderedPageBreak/>
         <w:t>- System validates credentials</w:t>
       </w:r>
     </w:p>
@@ -10644,8 +11324,25 @@
           <w:sz w:val="28"/>
           <w:szCs w:val="28"/>
         </w:rPr>
-        <w:lastRenderedPageBreak/>
-        <w:t>- Logs entry to login_logs table</w:t>
+        <w:t xml:space="preserve">- Logs entry to </w:t>
+      </w:r>
+      <w:proofErr w:type="spellStart"/>
+      <w:r>
+        <w:rPr>
+          <w:rFonts w:ascii="Times New Roman" w:hAnsi="Times New Roman" w:cs="Times New Roman"/>
+          <w:sz w:val="28"/>
+          <w:szCs w:val="28"/>
+        </w:rPr>
+        <w:t>login_logs</w:t>
+      </w:r>
+      <w:proofErr w:type="spellEnd"/>
+      <w:r>
+        <w:rPr>
+          <w:rFonts w:ascii="Times New Roman" w:hAnsi="Times New Roman" w:cs="Times New Roman"/>
+          <w:sz w:val="28"/>
+          <w:szCs w:val="28"/>
+        </w:rPr>
+        <w:t xml:space="preserve"> table</w:t>
       </w:r>
     </w:p>
     <w:p>
@@ -10744,7 +11441,27 @@
           <w:szCs w:val="28"/>
           <w:lang w:bidi="en-US"/>
         </w:rPr>
-        <w:t>- Check login_logs table for user activity</w:t>
+        <w:t xml:space="preserve">- Check </w:t>
+      </w:r>
+      <w:proofErr w:type="spellStart"/>
+      <w:r>
+        <w:rPr>
+          <w:rFonts w:ascii="Times New Roman" w:hAnsi="Times New Roman" w:cs="Times New Roman"/>
+          <w:sz w:val="28"/>
+          <w:szCs w:val="28"/>
+          <w:lang w:bidi="en-US"/>
+        </w:rPr>
+        <w:t>login_logs</w:t>
+      </w:r>
+      <w:proofErr w:type="spellEnd"/>
+      <w:r>
+        <w:rPr>
+          <w:rFonts w:ascii="Times New Roman" w:hAnsi="Times New Roman" w:cs="Times New Roman"/>
+          <w:sz w:val="28"/>
+          <w:szCs w:val="28"/>
+          <w:lang w:bidi="en-US"/>
+        </w:rPr>
+        <w:t xml:space="preserve"> table for user activity</w:t>
       </w:r>
     </w:p>
     <w:p>
@@ -10881,8 +11598,18 @@
           <w:sz w:val="28"/>
           <w:szCs w:val="28"/>
         </w:rPr>
-        <w:t>Risk 3: API Rate Limits or Connectivity Issues with Supabase</w:t>
-      </w:r>
+        <w:t xml:space="preserve">Risk 3: API Rate Limits or Connectivity Issues with </w:t>
+      </w:r>
+      <w:proofErr w:type="spellStart"/>
+      <w:r>
+        <w:rPr>
+          <w:rFonts w:ascii="Times New Roman" w:hAnsi="Times New Roman" w:cs="Times New Roman"/>
+          <w:sz w:val="28"/>
+          <w:szCs w:val="28"/>
+        </w:rPr>
+        <w:t>Supabase</w:t>
+      </w:r>
+      <w:proofErr w:type="spellEnd"/>
     </w:p>
     <w:p>
       <w:pPr>
@@ -11069,11 +11796,15 @@
         </w:numPr>
         <w:rPr>
           <w:rFonts w:ascii="Times New Roman" w:hAnsi="Times New Roman" w:cs="Times New Roman"/>
-        </w:rPr>
-      </w:pPr>
-      <w:r>
-        <w:rPr>
-          <w:rFonts w:ascii="Times New Roman" w:hAnsi="Times New Roman" w:cs="Times New Roman"/>
+          <w:sz w:val="28"/>
+          <w:szCs w:val="28"/>
+        </w:rPr>
+      </w:pPr>
+      <w:r>
+        <w:rPr>
+          <w:rFonts w:ascii="Times New Roman" w:hAnsi="Times New Roman" w:cs="Times New Roman"/>
+          <w:sz w:val="28"/>
+          <w:szCs w:val="28"/>
         </w:rPr>
         <w:t>Model Accuracy &gt; 85% on Test Dataset</w:t>
       </w:r>
@@ -11084,11 +11815,15 @@
         <w:ind w:left="2160"/>
         <w:rPr>
           <w:rFonts w:ascii="Times New Roman" w:hAnsi="Times New Roman" w:cs="Times New Roman"/>
-        </w:rPr>
-      </w:pPr>
-      <w:r>
-        <w:rPr>
-          <w:rFonts w:ascii="Times New Roman" w:hAnsi="Times New Roman" w:cs="Times New Roman"/>
+          <w:sz w:val="28"/>
+          <w:szCs w:val="28"/>
+        </w:rPr>
+      </w:pPr>
+      <w:r>
+        <w:rPr>
+          <w:rFonts w:ascii="Times New Roman" w:hAnsi="Times New Roman" w:cs="Times New Roman"/>
+          <w:sz w:val="28"/>
+          <w:szCs w:val="28"/>
         </w:rPr>
         <w:t>Measurement: Classification accuracy on held-out test set</w:t>
       </w:r>
@@ -11099,11 +11834,15 @@
         <w:ind w:left="2160"/>
         <w:rPr>
           <w:rFonts w:ascii="Times New Roman" w:hAnsi="Times New Roman" w:cs="Times New Roman"/>
-        </w:rPr>
-      </w:pPr>
-      <w:r>
-        <w:rPr>
-          <w:rFonts w:ascii="Times New Roman" w:hAnsi="Times New Roman" w:cs="Times New Roman"/>
+          <w:sz w:val="28"/>
+          <w:szCs w:val="28"/>
+        </w:rPr>
+      </w:pPr>
+      <w:r>
+        <w:rPr>
+          <w:rFonts w:ascii="Times New Roman" w:hAnsi="Times New Roman" w:cs="Times New Roman"/>
+          <w:sz w:val="28"/>
+          <w:szCs w:val="28"/>
         </w:rPr>
         <w:t>Validation: Confusion matrix analysis</w:t>
       </w:r>
@@ -11114,11 +11853,15 @@
         <w:ind w:left="2160"/>
         <w:rPr>
           <w:rFonts w:ascii="Times New Roman" w:hAnsi="Times New Roman" w:cs="Times New Roman"/>
-        </w:rPr>
-      </w:pPr>
-      <w:r>
-        <w:rPr>
-          <w:rFonts w:ascii="Times New Roman" w:hAnsi="Times New Roman" w:cs="Times New Roman"/>
+          <w:sz w:val="28"/>
+          <w:szCs w:val="28"/>
+        </w:rPr>
+      </w:pPr>
+      <w:r>
+        <w:rPr>
+          <w:rFonts w:ascii="Times New Roman" w:hAnsi="Times New Roman" w:cs="Times New Roman"/>
+          <w:sz w:val="28"/>
+          <w:szCs w:val="28"/>
         </w:rPr>
         <w:t>Target: 85% minimum, 90% desired</w:t>
       </w:r>
@@ -11129,6 +11872,8 @@
         <w:ind w:left="2160"/>
         <w:rPr>
           <w:rFonts w:ascii="Times New Roman" w:hAnsi="Times New Roman" w:cs="Times New Roman"/>
+          <w:sz w:val="28"/>
+          <w:szCs w:val="28"/>
         </w:rPr>
       </w:pPr>
     </w:p>
@@ -11141,11 +11886,15 @@
         </w:numPr>
         <w:rPr>
           <w:rFonts w:ascii="Times New Roman" w:hAnsi="Times New Roman" w:cs="Times New Roman"/>
-        </w:rPr>
-      </w:pPr>
-      <w:r>
-        <w:rPr>
-          <w:rFonts w:ascii="Times New Roman" w:hAnsi="Times New Roman" w:cs="Times New Roman"/>
+          <w:sz w:val="28"/>
+          <w:szCs w:val="28"/>
+        </w:rPr>
+      </w:pPr>
+      <w:r>
+        <w:rPr>
+          <w:rFonts w:ascii="Times New Roman" w:hAnsi="Times New Roman" w:cs="Times New Roman"/>
+          <w:sz w:val="28"/>
+          <w:szCs w:val="28"/>
         </w:rPr>
         <w:t>Prediction Recall &gt; 90% for Failure Detection</w:t>
       </w:r>
@@ -11156,11 +11905,15 @@
         <w:ind w:left="2160"/>
         <w:rPr>
           <w:rFonts w:ascii="Times New Roman" w:hAnsi="Times New Roman" w:cs="Times New Roman"/>
-        </w:rPr>
-      </w:pPr>
-      <w:r>
-        <w:rPr>
-          <w:rFonts w:ascii="Times New Roman" w:hAnsi="Times New Roman" w:cs="Times New Roman"/>
+          <w:sz w:val="28"/>
+          <w:szCs w:val="28"/>
+        </w:rPr>
+      </w:pPr>
+      <w:r>
+        <w:rPr>
+          <w:rFonts w:ascii="Times New Roman" w:hAnsi="Times New Roman" w:cs="Times New Roman"/>
+          <w:sz w:val="28"/>
+          <w:szCs w:val="28"/>
         </w:rPr>
         <w:t>Measurement: True positive rate for failure events</w:t>
       </w:r>
@@ -11171,11 +11924,15 @@
         <w:ind w:left="2160"/>
         <w:rPr>
           <w:rFonts w:ascii="Times New Roman" w:hAnsi="Times New Roman" w:cs="Times New Roman"/>
-        </w:rPr>
-      </w:pPr>
-      <w:r>
-        <w:rPr>
-          <w:rFonts w:ascii="Times New Roman" w:hAnsi="Times New Roman" w:cs="Times New Roman"/>
+          <w:sz w:val="28"/>
+          <w:szCs w:val="28"/>
+        </w:rPr>
+      </w:pPr>
+      <w:r>
+        <w:rPr>
+          <w:rFonts w:ascii="Times New Roman" w:hAnsi="Times New Roman" w:cs="Times New Roman"/>
+          <w:sz w:val="28"/>
+          <w:szCs w:val="28"/>
         </w:rPr>
         <w:t>Importance: Critical for preventing missed failures</w:t>
       </w:r>
@@ -11186,14 +11943,29 @@
         <w:ind w:left="2160"/>
         <w:rPr>
           <w:rFonts w:ascii="Times New Roman" w:hAnsi="Times New Roman" w:cs="Times New Roman"/>
-        </w:rPr>
-      </w:pPr>
-      <w:r>
-        <w:rPr>
-          <w:rFonts w:ascii="Times New Roman" w:hAnsi="Times New Roman" w:cs="Times New Roman"/>
+          <w:sz w:val="28"/>
+          <w:szCs w:val="28"/>
+        </w:rPr>
+      </w:pPr>
+      <w:r>
+        <w:rPr>
+          <w:rFonts w:ascii="Times New Roman" w:hAnsi="Times New Roman" w:cs="Times New Roman"/>
+          <w:sz w:val="28"/>
+          <w:szCs w:val="28"/>
         </w:rPr>
         <w:t>Target: 90% minimum (maximize failure detection)</w:t>
       </w:r>
+    </w:p>
+    <w:p>
+      <w:pPr>
+        <w:pStyle w:val="ListParagraph"/>
+        <w:ind w:left="2160"/>
+        <w:rPr>
+          <w:rFonts w:ascii="Times New Roman" w:hAnsi="Times New Roman" w:cs="Times New Roman"/>
+          <w:sz w:val="28"/>
+          <w:szCs w:val="28"/>
+        </w:rPr>
+      </w:pPr>
     </w:p>
     <w:p>
       <w:pPr>
@@ -11204,12 +11976,17 @@
         </w:numPr>
         <w:rPr>
           <w:rFonts w:ascii="Times New Roman" w:hAnsi="Times New Roman" w:cs="Times New Roman"/>
-        </w:rPr>
-      </w:pPr>
-      <w:r>
-        <w:rPr>
-          <w:rFonts w:ascii="Times New Roman" w:hAnsi="Times New Roman" w:cs="Times New Roman"/>
-        </w:rPr>
+          <w:sz w:val="28"/>
+          <w:szCs w:val="28"/>
+        </w:rPr>
+      </w:pPr>
+      <w:r>
+        <w:rPr>
+          <w:rFonts w:ascii="Times New Roman" w:hAnsi="Times New Roman" w:cs="Times New Roman"/>
+          <w:sz w:val="28"/>
+          <w:szCs w:val="28"/>
+        </w:rPr>
+        <w:lastRenderedPageBreak/>
         <w:t>Precision for Failure Prediction &gt; 75%</w:t>
       </w:r>
     </w:p>
@@ -11219,11 +11996,15 @@
         <w:ind w:left="2160"/>
         <w:rPr>
           <w:rFonts w:ascii="Times New Roman" w:hAnsi="Times New Roman" w:cs="Times New Roman"/>
-        </w:rPr>
-      </w:pPr>
-      <w:r>
-        <w:rPr>
-          <w:rFonts w:ascii="Times New Roman" w:hAnsi="Times New Roman" w:cs="Times New Roman"/>
+          <w:sz w:val="28"/>
+          <w:szCs w:val="28"/>
+        </w:rPr>
+      </w:pPr>
+      <w:r>
+        <w:rPr>
+          <w:rFonts w:ascii="Times New Roman" w:hAnsi="Times New Roman" w:cs="Times New Roman"/>
+          <w:sz w:val="28"/>
+          <w:szCs w:val="28"/>
         </w:rPr>
         <w:t>Measurement: Positive predictive value</w:t>
       </w:r>
@@ -11234,11 +12015,15 @@
         <w:ind w:left="2160"/>
         <w:rPr>
           <w:rFonts w:ascii="Times New Roman" w:hAnsi="Times New Roman" w:cs="Times New Roman"/>
-        </w:rPr>
-      </w:pPr>
-      <w:r>
-        <w:rPr>
-          <w:rFonts w:ascii="Times New Roman" w:hAnsi="Times New Roman" w:cs="Times New Roman"/>
+          <w:sz w:val="28"/>
+          <w:szCs w:val="28"/>
+        </w:rPr>
+      </w:pPr>
+      <w:r>
+        <w:rPr>
+          <w:rFonts w:ascii="Times New Roman" w:hAnsi="Times New Roman" w:cs="Times New Roman"/>
+          <w:sz w:val="28"/>
+          <w:szCs w:val="28"/>
         </w:rPr>
         <w:t>Purpose: Minimize unnecessary maintenance actions</w:t>
       </w:r>
@@ -11249,12 +12034,16 @@
         <w:ind w:left="2160"/>
         <w:rPr>
           <w:rFonts w:ascii="Times New Roman" w:hAnsi="Times New Roman" w:cs="Times New Roman"/>
+          <w:sz w:val="28"/>
+          <w:szCs w:val="28"/>
           <w:lang w:bidi="en-US"/>
         </w:rPr>
       </w:pPr>
       <w:r>
         <w:rPr>
           <w:rFonts w:ascii="Times New Roman" w:hAnsi="Times New Roman" w:cs="Times New Roman"/>
+          <w:sz w:val="28"/>
+          <w:szCs w:val="28"/>
           <w:lang w:bidi="en-US"/>
         </w:rPr>
         <w:t>Target: 75% minimum</w:t>
@@ -11461,7 +12250,27 @@
           <w:szCs w:val="28"/>
           <w:lang w:bidi="en-US"/>
         </w:rPr>
-        <w:t>Target: &lt; 5 seconds initial load</w:t>
+        <w:t xml:space="preserve">Target: &lt; 5 </w:t>
+      </w:r>
+      <w:proofErr w:type="gramStart"/>
+      <w:r>
+        <w:rPr>
+          <w:rFonts w:ascii="Times New Roman" w:hAnsi="Times New Roman" w:cs="Times New Roman"/>
+          <w:sz w:val="28"/>
+          <w:szCs w:val="28"/>
+          <w:lang w:bidi="en-US"/>
+        </w:rPr>
+        <w:t>seconds</w:t>
+      </w:r>
+      <w:proofErr w:type="gramEnd"/>
+      <w:r>
+        <w:rPr>
+          <w:rFonts w:ascii="Times New Roman" w:hAnsi="Times New Roman" w:cs="Times New Roman"/>
+          <w:sz w:val="28"/>
+          <w:szCs w:val="28"/>
+          <w:lang w:bidi="en-US"/>
+        </w:rPr>
+        <w:t xml:space="preserve"> initial load</w:t>
       </w:r>
     </w:p>
     <w:p>
@@ -11575,13 +12384,23 @@
           <w:szCs w:val="32"/>
         </w:rPr>
       </w:pPr>
-      <w:r>
-        <w:rPr>
-          <w:rFonts w:ascii="Times New Roman" w:hAnsi="Times New Roman" w:cs="Times New Roman"/>
-          <w:sz w:val="32"/>
-          <w:szCs w:val="32"/>
-        </w:rPr>
-        <w:t>Buisness metrices</w:t>
+      <w:proofErr w:type="spellStart"/>
+      <w:r>
+        <w:rPr>
+          <w:rFonts w:ascii="Times New Roman" w:hAnsi="Times New Roman" w:cs="Times New Roman"/>
+          <w:sz w:val="32"/>
+          <w:szCs w:val="32"/>
+        </w:rPr>
+        <w:t>Buisness</w:t>
+      </w:r>
+      <w:proofErr w:type="spellEnd"/>
+      <w:r>
+        <w:rPr>
+          <w:rFonts w:ascii="Times New Roman" w:hAnsi="Times New Roman" w:cs="Times New Roman"/>
+          <w:sz w:val="32"/>
+          <w:szCs w:val="32"/>
+        </w:rPr>
+        <w:t xml:space="preserve"> metrices</w:t>
       </w:r>
     </w:p>
     <w:p>
@@ -11763,38 +12582,6 @@
         </w:rPr>
         <w:t>Benefit: Allows scheduled maintenance vs emergency repairs</w:t>
       </w:r>
-    </w:p>
-    <w:p>
-      <w:pPr>
-        <w:rPr>
-          <w:sz w:val="32"/>
-          <w:szCs w:val="32"/>
-        </w:rPr>
-      </w:pPr>
-    </w:p>
-    <w:p>
-      <w:pPr>
-        <w:rPr>
-          <w:sz w:val="32"/>
-          <w:szCs w:val="32"/>
-        </w:rPr>
-      </w:pPr>
-    </w:p>
-    <w:p>
-      <w:pPr>
-        <w:rPr>
-          <w:sz w:val="32"/>
-          <w:szCs w:val="32"/>
-        </w:rPr>
-      </w:pPr>
-    </w:p>
-    <w:p>
-      <w:pPr>
-        <w:rPr>
-          <w:sz w:val="32"/>
-          <w:szCs w:val="32"/>
-        </w:rPr>
-      </w:pPr>
     </w:p>
     <w:p>
       <w:pPr>
@@ -12525,7 +13312,25 @@
           <w:sz w:val="28"/>
           <w:szCs w:val="28"/>
         </w:rPr>
-        <w:t>The backend of the system is developed using the Flask framework. It initializes the application, enables CORS for frontend-backend communication, and loads environment variables securely using the dotenv library. The application provides a root route that serves the login page and a /login API endpoint that handles user authentication through POST requests. User credentials are validated using a custom authentication service, and login activities are recorded along with the user’s IP address. The backend dynamically reads configuration settings such as port number and debug mode from environment variables to maintain flexibility and security.</w:t>
+        <w:t xml:space="preserve">The backend of the system is developed using the Flask framework. It initializes the application, enables CORS for frontend-backend communication, and loads environment variables securely using the </w:t>
+      </w:r>
+      <w:proofErr w:type="spellStart"/>
+      <w:r>
+        <w:rPr>
+          <w:rFonts w:ascii="Times New Roman" w:hAnsi="Times New Roman" w:cs="Times New Roman"/>
+          <w:sz w:val="28"/>
+          <w:szCs w:val="28"/>
+        </w:rPr>
+        <w:t>dotenv</w:t>
+      </w:r>
+      <w:proofErr w:type="spellEnd"/>
+      <w:r>
+        <w:rPr>
+          <w:rFonts w:ascii="Times New Roman" w:hAnsi="Times New Roman" w:cs="Times New Roman"/>
+          <w:sz w:val="28"/>
+          <w:szCs w:val="28"/>
+        </w:rPr>
+        <w:t xml:space="preserve"> library. The application provides a root route that serves the login page and a /login API endpoint that handles user authentication through POST requests. User credentials are validated using a custom authentication service, and login activities are recorded along with the user’s IP address. The backend dynamically reads configuration settings such as port number and debug mode from environment variables to maintain flexibility and security.</w:t>
       </w:r>
     </w:p>
     <w:p>
@@ -12588,7 +13393,25 @@
           <w:szCs w:val="28"/>
         </w:rPr>
         <w:lastRenderedPageBreak/>
-        <w:t>attempts (success or failure) are logged into a Supabase database table. The logging mechanism captures user email, IP address, login status, and timestamp. This ensures proper monitoring, traceability, and audit control within the system.</w:t>
+        <w:t xml:space="preserve">attempts (success or failure) are logged into a </w:t>
+      </w:r>
+      <w:proofErr w:type="spellStart"/>
+      <w:r>
+        <w:rPr>
+          <w:rFonts w:ascii="Times New Roman" w:hAnsi="Times New Roman" w:cs="Times New Roman"/>
+          <w:sz w:val="28"/>
+          <w:szCs w:val="28"/>
+        </w:rPr>
+        <w:t>Supabase</w:t>
+      </w:r>
+      <w:proofErr w:type="spellEnd"/>
+      <w:r>
+        <w:rPr>
+          <w:rFonts w:ascii="Times New Roman" w:hAnsi="Times New Roman" w:cs="Times New Roman"/>
+          <w:sz w:val="28"/>
+          <w:szCs w:val="28"/>
+        </w:rPr>
+        <w:t xml:space="preserve"> database table. The logging mechanism captures user email, IP address, login status, and timestamp. This ensures proper monitoring, traceability, and audit control within the system.</w:t>
       </w:r>
     </w:p>
     <w:p>
@@ -12740,7 +13563,25 @@
           <w:sz w:val="28"/>
           <w:szCs w:val="28"/>
         </w:rPr>
-        <w:t>In this stage, the raw data is cleaned and normalized. Missing values are removed, and sensor-related numerical columns are standardized using StandardScaler from Scikit-learn. The cleaned dataset is then saved into a processed data directory. This ensures consistent scaling and improves model performance during training.</w:t>
+        <w:t xml:space="preserve">In this stage, the raw data is cleaned and normalized. Missing values are removed, and sensor-related numerical columns are standardized using </w:t>
+      </w:r>
+      <w:proofErr w:type="spellStart"/>
+      <w:r>
+        <w:rPr>
+          <w:rFonts w:ascii="Times New Roman" w:hAnsi="Times New Roman" w:cs="Times New Roman"/>
+          <w:sz w:val="28"/>
+          <w:szCs w:val="28"/>
+        </w:rPr>
+        <w:t>StandardScaler</w:t>
+      </w:r>
+      <w:proofErr w:type="spellEnd"/>
+      <w:r>
+        <w:rPr>
+          <w:rFonts w:ascii="Times New Roman" w:hAnsi="Times New Roman" w:cs="Times New Roman"/>
+          <w:sz w:val="28"/>
+          <w:szCs w:val="28"/>
+        </w:rPr>
+        <w:t xml:space="preserve"> from Scikit-learn. The cleaned dataset is then saved into a processed data directory. This ensures consistent scaling and improves model performance during training.</w:t>
       </w:r>
     </w:p>
     <w:p>
@@ -12911,7 +13752,25 @@
           <w:sz w:val="28"/>
           <w:szCs w:val="28"/>
         </w:rPr>
-        <w:t>The deep learning model is built using TensorFlow and Keras. A Sequential LSTM architecture is implemented with multiple LSTM layers, dropout layers for regularization, and dense layers for final prediction. The model uses binary cross-entropy loss and the Adam optimizer. The dataset is split into training and testing sets for evaluation. This model predicts machine failure probability based on sequential sensor inputs.</w:t>
+        <w:t xml:space="preserve">The deep learning model is built using TensorFlow and </w:t>
+      </w:r>
+      <w:proofErr w:type="spellStart"/>
+      <w:r>
+        <w:rPr>
+          <w:rFonts w:ascii="Times New Roman" w:hAnsi="Times New Roman" w:cs="Times New Roman"/>
+          <w:sz w:val="28"/>
+          <w:szCs w:val="28"/>
+        </w:rPr>
+        <w:t>Keras</w:t>
+      </w:r>
+      <w:proofErr w:type="spellEnd"/>
+      <w:r>
+        <w:rPr>
+          <w:rFonts w:ascii="Times New Roman" w:hAnsi="Times New Roman" w:cs="Times New Roman"/>
+          <w:sz w:val="28"/>
+          <w:szCs w:val="28"/>
+        </w:rPr>
+        <w:t>. A Sequential LSTM architecture is implemented with multiple LSTM layers, dropout layers for regularization, and dense layers for final prediction. The model uses binary cross-entropy loss and the Adam optimizer. The dataset is split into training and testing sets for evaluation. This model predicts machine failure probability based on sequential sensor inputs.</w:t>
       </w:r>
     </w:p>
     <w:p>
@@ -13304,8 +14163,17 @@
       <w:pPr>
         <w:jc w:val="center"/>
         <w:rPr>
-          <w:sz w:val="36"/>
-          <w:szCs w:val="36"/>
+          <w:sz w:val="28"/>
+          <w:szCs w:val="28"/>
+        </w:rPr>
+      </w:pPr>
+    </w:p>
+    <w:p>
+      <w:pPr>
+        <w:jc w:val="center"/>
+        <w:rPr>
+          <w:sz w:val="28"/>
+          <w:szCs w:val="28"/>
         </w:rPr>
       </w:pPr>
     </w:p>
@@ -13392,7 +14260,25 @@
           <w:sz w:val="32"/>
           <w:szCs w:val="32"/>
         </w:rPr>
-        <w:t>The integration of Supabase cloud infrastructure ensures secure data storage, authentication, and logging, while the Flask-based backend and interactive dashboard enhance usability and accessibility. The project also demonstrates strong alignment with business objectives such as reducing operational costs, improving equipment lifespan, and enhancing overall system reliability.</w:t>
+        <w:t xml:space="preserve">The integration of </w:t>
+      </w:r>
+      <w:proofErr w:type="spellStart"/>
+      <w:r>
+        <w:rPr>
+          <w:rFonts w:ascii="Times New Roman" w:hAnsi="Times New Roman" w:cs="Times New Roman"/>
+          <w:sz w:val="32"/>
+          <w:szCs w:val="32"/>
+        </w:rPr>
+        <w:t>Supabase</w:t>
+      </w:r>
+      <w:proofErr w:type="spellEnd"/>
+      <w:r>
+        <w:rPr>
+          <w:rFonts w:ascii="Times New Roman" w:hAnsi="Times New Roman" w:cs="Times New Roman"/>
+          <w:sz w:val="32"/>
+          <w:szCs w:val="32"/>
+        </w:rPr>
+        <w:t xml:space="preserve"> cloud infrastructure ensures secure data storage, authentication, and logging, while the Flask-based backend and interactive dashboard enhance usability and accessibility. The project also demonstrates strong alignment with business objectives such as reducing operational costs, improving equipment lifespan, and enhancing overall system reliability.</w:t>
       </w:r>
     </w:p>
     <w:p>
@@ -13461,6 +14347,227 @@
     <w:p>
       <w:pPr>
         <w:jc w:val="center"/>
+        <w:rPr>
+          <w:sz w:val="28"/>
+          <w:szCs w:val="28"/>
+        </w:rPr>
+      </w:pPr>
+    </w:p>
+    <w:p>
+      <w:pPr>
+        <w:rPr>
+          <w:sz w:val="28"/>
+          <w:szCs w:val="28"/>
+        </w:rPr>
+      </w:pPr>
+    </w:p>
+    <w:p>
+      <w:pPr>
+        <w:pStyle w:val="ListParagraph"/>
+        <w:numPr>
+          <w:ilvl w:val="0"/>
+          <w:numId w:val="53"/>
+        </w:numPr>
+        <w:rPr>
+          <w:rFonts w:ascii="Times New Roman" w:hAnsi="Times New Roman" w:cs="Times New Roman"/>
+          <w:sz w:val="32"/>
+          <w:szCs w:val="32"/>
+        </w:rPr>
+      </w:pPr>
+      <w:r>
+        <w:rPr>
+          <w:rFonts w:ascii="Times New Roman" w:hAnsi="Times New Roman" w:cs="Times New Roman"/>
+          <w:sz w:val="32"/>
+          <w:szCs w:val="32"/>
+        </w:rPr>
+        <w:t>D</w:t>
+      </w:r>
+      <w:r>
+        <w:rPr>
+          <w:rFonts w:ascii="Times New Roman" w:hAnsi="Times New Roman" w:cs="Times New Roman"/>
+          <w:sz w:val="32"/>
+          <w:szCs w:val="32"/>
+        </w:rPr>
+        <w:t xml:space="preserve">ataset </w:t>
+      </w:r>
+      <w:r>
+        <w:rPr>
+          <w:rFonts w:ascii="Times New Roman" w:hAnsi="Times New Roman" w:cs="Times New Roman"/>
+          <w:sz w:val="32"/>
+          <w:szCs w:val="32"/>
+        </w:rPr>
+        <w:t>R</w:t>
+      </w:r>
+      <w:r>
+        <w:rPr>
+          <w:rFonts w:ascii="Times New Roman" w:hAnsi="Times New Roman" w:cs="Times New Roman"/>
+          <w:sz w:val="32"/>
+          <w:szCs w:val="32"/>
+        </w:rPr>
+        <w:t>eference</w:t>
+      </w:r>
+      <w:r>
+        <w:rPr>
+          <w:rFonts w:ascii="Times New Roman" w:hAnsi="Times New Roman" w:cs="Times New Roman"/>
+          <w:sz w:val="32"/>
+          <w:szCs w:val="32"/>
+        </w:rPr>
+        <w:t xml:space="preserve">: </w:t>
+      </w:r>
+      <w:hyperlink r:id="rId23" w:history="1">
+        <w:r>
+          <w:rPr>
+            <w:rStyle w:val="Hyperlink"/>
+            <w:rFonts w:ascii="Times New Roman" w:hAnsi="Times New Roman" w:cs="Times New Roman"/>
+            <w:sz w:val="32"/>
+            <w:szCs w:val="32"/>
+          </w:rPr>
+          <w:t>https://www.kaggle.com/datasets/stephanmatzka/predictive-maintenance-dataset-ai4i-2020</w:t>
+        </w:r>
+      </w:hyperlink>
+    </w:p>
+    <w:p>
+      <w:pPr>
+        <w:pStyle w:val="ListParagraph"/>
+        <w:rPr>
+          <w:rFonts w:ascii="Times New Roman" w:hAnsi="Times New Roman" w:cs="Times New Roman"/>
+          <w:sz w:val="32"/>
+          <w:szCs w:val="32"/>
+        </w:rPr>
+      </w:pPr>
+    </w:p>
+    <w:p>
+      <w:pPr>
+        <w:pStyle w:val="ListParagraph"/>
+        <w:numPr>
+          <w:ilvl w:val="0"/>
+          <w:numId w:val="53"/>
+        </w:numPr>
+        <w:rPr>
+          <w:rFonts w:ascii="Times New Roman" w:hAnsi="Times New Roman" w:cs="Times New Roman"/>
+          <w:sz w:val="32"/>
+          <w:szCs w:val="32"/>
+        </w:rPr>
+      </w:pPr>
+      <w:r>
+        <w:rPr>
+          <w:rFonts w:ascii="Times New Roman" w:hAnsi="Times New Roman" w:cs="Times New Roman"/>
+          <w:sz w:val="32"/>
+          <w:szCs w:val="32"/>
+        </w:rPr>
+        <w:t xml:space="preserve">LSTM: </w:t>
+      </w:r>
+      <w:hyperlink r:id="rId24" w:history="1">
+        <w:r>
+          <w:rPr>
+            <w:rStyle w:val="Hyperlink"/>
+            <w:rFonts w:ascii="Times New Roman" w:hAnsi="Times New Roman" w:cs="Times New Roman"/>
+            <w:sz w:val="32"/>
+            <w:szCs w:val="32"/>
+          </w:rPr>
+          <w:t>https://www.geeksforgeeks.org/deep-learning/deep-learning-introduction-to-long-short-term-memory/</w:t>
+        </w:r>
+      </w:hyperlink>
+    </w:p>
+    <w:p>
+      <w:pPr>
+        <w:pStyle w:val="ListParagraph"/>
+        <w:rPr>
+          <w:rFonts w:ascii="Times New Roman" w:hAnsi="Times New Roman" w:cs="Times New Roman"/>
+          <w:sz w:val="32"/>
+          <w:szCs w:val="32"/>
+        </w:rPr>
+      </w:pPr>
+    </w:p>
+    <w:p>
+      <w:pPr>
+        <w:pStyle w:val="ListParagraph"/>
+        <w:numPr>
+          <w:ilvl w:val="0"/>
+          <w:numId w:val="53"/>
+        </w:numPr>
+        <w:rPr>
+          <w:rFonts w:ascii="Times New Roman" w:hAnsi="Times New Roman" w:cs="Times New Roman"/>
+          <w:sz w:val="32"/>
+          <w:szCs w:val="32"/>
+        </w:rPr>
+      </w:pPr>
+      <w:proofErr w:type="spellStart"/>
+      <w:r>
+        <w:rPr>
+          <w:rFonts w:ascii="Times New Roman" w:hAnsi="Times New Roman" w:cs="Times New Roman"/>
+          <w:sz w:val="32"/>
+          <w:szCs w:val="32"/>
+        </w:rPr>
+        <w:t>Keras</w:t>
+      </w:r>
+      <w:proofErr w:type="spellEnd"/>
+      <w:r>
+        <w:rPr>
+          <w:rFonts w:ascii="Times New Roman" w:hAnsi="Times New Roman" w:cs="Times New Roman"/>
+          <w:sz w:val="32"/>
+          <w:szCs w:val="32"/>
+        </w:rPr>
+        <w:t xml:space="preserve">: </w:t>
+      </w:r>
+      <w:hyperlink r:id="rId25" w:history="1">
+        <w:r>
+          <w:rPr>
+            <w:rStyle w:val="Hyperlink"/>
+            <w:rFonts w:ascii="Times New Roman" w:hAnsi="Times New Roman" w:cs="Times New Roman"/>
+            <w:sz w:val="32"/>
+            <w:szCs w:val="32"/>
+          </w:rPr>
+          <w:t>https://keras.io</w:t>
+        </w:r>
+      </w:hyperlink>
+    </w:p>
+    <w:p>
+      <w:pPr>
+        <w:pStyle w:val="ListParagraph"/>
+        <w:rPr>
+          <w:rFonts w:ascii="Times New Roman" w:hAnsi="Times New Roman" w:cs="Times New Roman"/>
+          <w:sz w:val="32"/>
+          <w:szCs w:val="32"/>
+        </w:rPr>
+      </w:pPr>
+    </w:p>
+    <w:p>
+      <w:pPr>
+        <w:pStyle w:val="ListParagraph"/>
+        <w:numPr>
+          <w:ilvl w:val="0"/>
+          <w:numId w:val="53"/>
+        </w:numPr>
+        <w:rPr>
+          <w:rFonts w:ascii="Times New Roman" w:hAnsi="Times New Roman" w:cs="Times New Roman"/>
+          <w:sz w:val="32"/>
+          <w:szCs w:val="32"/>
+        </w:rPr>
+      </w:pPr>
+      <w:r>
+        <w:rPr>
+          <w:rFonts w:ascii="Times New Roman" w:hAnsi="Times New Roman" w:cs="Times New Roman"/>
+          <w:sz w:val="32"/>
+          <w:szCs w:val="32"/>
+        </w:rPr>
+        <w:t xml:space="preserve">Flask: </w:t>
+      </w:r>
+      <w:hyperlink r:id="rId26" w:history="1">
+        <w:r>
+          <w:rPr>
+            <w:rStyle w:val="Hyperlink"/>
+            <w:rFonts w:ascii="Times New Roman" w:hAnsi="Times New Roman" w:cs="Times New Roman"/>
+            <w:sz w:val="32"/>
+            <w:szCs w:val="32"/>
+          </w:rPr>
+          <w:t>https://flask.palletsprojects.com/en/stable/</w:t>
+        </w:r>
+      </w:hyperlink>
+    </w:p>
+    <w:p>
+      <w:pPr>
+        <w:pStyle w:val="ListParagraph"/>
         <w:rPr>
           <w:sz w:val="32"/>
           <w:szCs w:val="32"/>
@@ -15765,7 +16872,7 @@
   <w:abstractNum w:abstractNumId="19" w15:restartNumberingAfterBreak="0">
     <w:nsid w:val="299B5E3B"/>
     <w:multiLevelType w:val="hybridMultilevel"/>
-    <w:tmpl w:val="7FD23320"/>
+    <w:tmpl w:val="A4A49E92"/>
     <w:lvl w:ilvl="0" w:tplc="04090009">
       <w:start w:val="1"/>
       <w:numFmt w:val="bullet"/>
@@ -16554,6 +17661,119 @@
     </w:lvl>
   </w:abstractNum>
   <w:abstractNum w:abstractNumId="26" w15:restartNumberingAfterBreak="0">
+    <w:nsid w:val="327626A1"/>
+    <w:multiLevelType w:val="hybridMultilevel"/>
+    <w:tmpl w:val="6AE0A10C"/>
+    <w:lvl w:ilvl="0" w:tplc="0409000B">
+      <w:start w:val="1"/>
+      <w:numFmt w:val="bullet"/>
+      <w:lvlText w:val=""/>
+      <w:lvlJc w:val="left"/>
+      <w:pPr>
+        <w:ind w:left="720" w:hanging="360"/>
+      </w:pPr>
+      <w:rPr>
+        <w:rFonts w:ascii="Wingdings" w:hAnsi="Wingdings" w:hint="default"/>
+      </w:rPr>
+    </w:lvl>
+    <w:lvl w:ilvl="1" w:tplc="04090003" w:tentative="1">
+      <w:start w:val="1"/>
+      <w:numFmt w:val="bullet"/>
+      <w:lvlText w:val="o"/>
+      <w:lvlJc w:val="left"/>
+      <w:pPr>
+        <w:ind w:left="1440" w:hanging="360"/>
+      </w:pPr>
+      <w:rPr>
+        <w:rFonts w:ascii="Courier New" w:hAnsi="Courier New" w:cs="Courier New" w:hint="default"/>
+      </w:rPr>
+    </w:lvl>
+    <w:lvl w:ilvl="2" w:tplc="04090005" w:tentative="1">
+      <w:start w:val="1"/>
+      <w:numFmt w:val="bullet"/>
+      <w:lvlText w:val=""/>
+      <w:lvlJc w:val="left"/>
+      <w:pPr>
+        <w:ind w:left="2160" w:hanging="360"/>
+      </w:pPr>
+      <w:rPr>
+        <w:rFonts w:ascii="Wingdings" w:hAnsi="Wingdings" w:hint="default"/>
+      </w:rPr>
+    </w:lvl>
+    <w:lvl w:ilvl="3" w:tplc="04090001" w:tentative="1">
+      <w:start w:val="1"/>
+      <w:numFmt w:val="bullet"/>
+      <w:lvlText w:val=""/>
+      <w:lvlJc w:val="left"/>
+      <w:pPr>
+        <w:ind w:left="2880" w:hanging="360"/>
+      </w:pPr>
+      <w:rPr>
+        <w:rFonts w:ascii="Symbol" w:hAnsi="Symbol" w:hint="default"/>
+      </w:rPr>
+    </w:lvl>
+    <w:lvl w:ilvl="4" w:tplc="04090003" w:tentative="1">
+      <w:start w:val="1"/>
+      <w:numFmt w:val="bullet"/>
+      <w:lvlText w:val="o"/>
+      <w:lvlJc w:val="left"/>
+      <w:pPr>
+        <w:ind w:left="3600" w:hanging="360"/>
+      </w:pPr>
+      <w:rPr>
+        <w:rFonts w:ascii="Courier New" w:hAnsi="Courier New" w:cs="Courier New" w:hint="default"/>
+      </w:rPr>
+    </w:lvl>
+    <w:lvl w:ilvl="5" w:tplc="04090005" w:tentative="1">
+      <w:start w:val="1"/>
+      <w:numFmt w:val="bullet"/>
+      <w:lvlText w:val=""/>
+      <w:lvlJc w:val="left"/>
+      <w:pPr>
+        <w:ind w:left="4320" w:hanging="360"/>
+      </w:pPr>
+      <w:rPr>
+        <w:rFonts w:ascii="Wingdings" w:hAnsi="Wingdings" w:hint="default"/>
+      </w:rPr>
+    </w:lvl>
+    <w:lvl w:ilvl="6" w:tplc="04090001" w:tentative="1">
+      <w:start w:val="1"/>
+      <w:numFmt w:val="bullet"/>
+      <w:lvlText w:val=""/>
+      <w:lvlJc w:val="left"/>
+      <w:pPr>
+        <w:ind w:left="5040" w:hanging="360"/>
+      </w:pPr>
+      <w:rPr>
+        <w:rFonts w:ascii="Symbol" w:hAnsi="Symbol" w:hint="default"/>
+      </w:rPr>
+    </w:lvl>
+    <w:lvl w:ilvl="7" w:tplc="04090003" w:tentative="1">
+      <w:start w:val="1"/>
+      <w:numFmt w:val="bullet"/>
+      <w:lvlText w:val="o"/>
+      <w:lvlJc w:val="left"/>
+      <w:pPr>
+        <w:ind w:left="5760" w:hanging="360"/>
+      </w:pPr>
+      <w:rPr>
+        <w:rFonts w:ascii="Courier New" w:hAnsi="Courier New" w:cs="Courier New" w:hint="default"/>
+      </w:rPr>
+    </w:lvl>
+    <w:lvl w:ilvl="8" w:tplc="04090005" w:tentative="1">
+      <w:start w:val="1"/>
+      <w:numFmt w:val="bullet"/>
+      <w:lvlText w:val=""/>
+      <w:lvlJc w:val="left"/>
+      <w:pPr>
+        <w:ind w:left="6480" w:hanging="360"/>
+      </w:pPr>
+      <w:rPr>
+        <w:rFonts w:ascii="Wingdings" w:hAnsi="Wingdings" w:hint="default"/>
+      </w:rPr>
+    </w:lvl>
+  </w:abstractNum>
+  <w:abstractNum w:abstractNumId="27" w15:restartNumberingAfterBreak="0">
     <w:nsid w:val="356F1FAE"/>
     <w:multiLevelType w:val="hybridMultilevel"/>
     <w:tmpl w:val="2640D520"/>
@@ -16666,14 +17886,14 @@
       </w:rPr>
     </w:lvl>
   </w:abstractNum>
-  <w:abstractNum w:abstractNumId="27" w15:restartNumberingAfterBreak="0">
+  <w:abstractNum w:abstractNumId="28" w15:restartNumberingAfterBreak="0">
     <w:nsid w:val="38FF4271"/>
     <w:multiLevelType w:val="hybridMultilevel"/>
-    <w:tmpl w:val="690C8D7A"/>
-    <w:lvl w:ilvl="0" w:tplc="04090009">
-      <w:start w:val="1"/>
-      <w:numFmt w:val="bullet"/>
-      <w:lvlText w:val=""/>
+    <w:tmpl w:val="D2548C06"/>
+    <w:lvl w:ilvl="0" w:tplc="0409000B">
+      <w:start w:val="1"/>
+      <w:numFmt w:val="bullet"/>
+      <w:lvlText w:val=""/>
       <w:lvlJc w:val="left"/>
       <w:pPr>
         <w:ind w:left="1440" w:hanging="360"/>
@@ -16779,7 +17999,7 @@
       </w:rPr>
     </w:lvl>
   </w:abstractNum>
-  <w:abstractNum w:abstractNumId="28" w15:restartNumberingAfterBreak="0">
+  <w:abstractNum w:abstractNumId="29" w15:restartNumberingAfterBreak="0">
     <w:nsid w:val="3B020EAB"/>
     <w:multiLevelType w:val="hybridMultilevel"/>
     <w:tmpl w:val="4BEC0EFE"/>
@@ -16892,7 +18112,7 @@
       </w:rPr>
     </w:lvl>
   </w:abstractNum>
-  <w:abstractNum w:abstractNumId="29" w15:restartNumberingAfterBreak="0">
+  <w:abstractNum w:abstractNumId="30" w15:restartNumberingAfterBreak="0">
     <w:nsid w:val="3B126503"/>
     <w:multiLevelType w:val="hybridMultilevel"/>
     <w:tmpl w:val="6FCE8FEC"/>
@@ -17005,7 +18225,7 @@
       </w:rPr>
     </w:lvl>
   </w:abstractNum>
-  <w:abstractNum w:abstractNumId="30" w15:restartNumberingAfterBreak="0">
+  <w:abstractNum w:abstractNumId="31" w15:restartNumberingAfterBreak="0">
     <w:nsid w:val="3C4614EA"/>
     <w:multiLevelType w:val="hybridMultilevel"/>
     <w:tmpl w:val="EEBAE54A"/>
@@ -17118,7 +18338,7 @@
       </w:rPr>
     </w:lvl>
   </w:abstractNum>
-  <w:abstractNum w:abstractNumId="31" w15:restartNumberingAfterBreak="0">
+  <w:abstractNum w:abstractNumId="32" w15:restartNumberingAfterBreak="0">
     <w:nsid w:val="3C5A0160"/>
     <w:multiLevelType w:val="hybridMultilevel"/>
     <w:tmpl w:val="C3FE69B8"/>
@@ -17231,7 +18451,7 @@
       </w:rPr>
     </w:lvl>
   </w:abstractNum>
-  <w:abstractNum w:abstractNumId="32" w15:restartNumberingAfterBreak="0">
+  <w:abstractNum w:abstractNumId="33" w15:restartNumberingAfterBreak="0">
     <w:nsid w:val="3DDE4140"/>
     <w:multiLevelType w:val="hybridMultilevel"/>
     <w:tmpl w:val="CC9E5362"/>
@@ -17344,7 +18564,7 @@
       </w:rPr>
     </w:lvl>
   </w:abstractNum>
-  <w:abstractNum w:abstractNumId="33" w15:restartNumberingAfterBreak="0">
+  <w:abstractNum w:abstractNumId="34" w15:restartNumberingAfterBreak="0">
     <w:nsid w:val="3E120B0B"/>
     <w:multiLevelType w:val="hybridMultilevel"/>
     <w:tmpl w:val="8F16EBB0"/>
@@ -17457,7 +18677,7 @@
       </w:rPr>
     </w:lvl>
   </w:abstractNum>
-  <w:abstractNum w:abstractNumId="34" w15:restartNumberingAfterBreak="0">
+  <w:abstractNum w:abstractNumId="35" w15:restartNumberingAfterBreak="0">
     <w:nsid w:val="42700A8B"/>
     <w:multiLevelType w:val="hybridMultilevel"/>
     <w:tmpl w:val="71D69BD0"/>
@@ -17570,7 +18790,7 @@
       </w:rPr>
     </w:lvl>
   </w:abstractNum>
-  <w:abstractNum w:abstractNumId="35" w15:restartNumberingAfterBreak="0">
+  <w:abstractNum w:abstractNumId="36" w15:restartNumberingAfterBreak="0">
     <w:nsid w:val="45A51E9A"/>
     <w:multiLevelType w:val="hybridMultilevel"/>
     <w:tmpl w:val="43489DD0"/>
@@ -17683,7 +18903,7 @@
       </w:rPr>
     </w:lvl>
   </w:abstractNum>
-  <w:abstractNum w:abstractNumId="36" w15:restartNumberingAfterBreak="0">
+  <w:abstractNum w:abstractNumId="37" w15:restartNumberingAfterBreak="0">
     <w:nsid w:val="46514A23"/>
     <w:multiLevelType w:val="hybridMultilevel"/>
     <w:tmpl w:val="EE304DA0"/>
@@ -17796,7 +19016,7 @@
       </w:rPr>
     </w:lvl>
   </w:abstractNum>
-  <w:abstractNum w:abstractNumId="37" w15:restartNumberingAfterBreak="0">
+  <w:abstractNum w:abstractNumId="38" w15:restartNumberingAfterBreak="0">
     <w:nsid w:val="4BDC0791"/>
     <w:multiLevelType w:val="hybridMultilevel"/>
     <w:tmpl w:val="18CEE372"/>
@@ -17909,7 +19129,7 @@
       </w:rPr>
     </w:lvl>
   </w:abstractNum>
-  <w:abstractNum w:abstractNumId="38" w15:restartNumberingAfterBreak="0">
+  <w:abstractNum w:abstractNumId="39" w15:restartNumberingAfterBreak="0">
     <w:nsid w:val="4CBD287F"/>
     <w:multiLevelType w:val="hybridMultilevel"/>
     <w:tmpl w:val="A4E200A2"/>
@@ -18022,7 +19242,7 @@
       </w:rPr>
     </w:lvl>
   </w:abstractNum>
-  <w:abstractNum w:abstractNumId="39" w15:restartNumberingAfterBreak="0">
+  <w:abstractNum w:abstractNumId="40" w15:restartNumberingAfterBreak="0">
     <w:nsid w:val="4CDB2AA5"/>
     <w:multiLevelType w:val="hybridMultilevel"/>
     <w:tmpl w:val="853A9BE4"/>
@@ -18135,7 +19355,7 @@
       </w:rPr>
     </w:lvl>
   </w:abstractNum>
-  <w:abstractNum w:abstractNumId="40" w15:restartNumberingAfterBreak="0">
+  <w:abstractNum w:abstractNumId="41" w15:restartNumberingAfterBreak="0">
     <w:nsid w:val="57FA5A8F"/>
     <w:multiLevelType w:val="hybridMultilevel"/>
     <w:tmpl w:val="D8A4C074"/>
@@ -18248,7 +19468,7 @@
       </w:rPr>
     </w:lvl>
   </w:abstractNum>
-  <w:abstractNum w:abstractNumId="41" w15:restartNumberingAfterBreak="0">
+  <w:abstractNum w:abstractNumId="42" w15:restartNumberingAfterBreak="0">
     <w:nsid w:val="58741C84"/>
     <w:multiLevelType w:val="hybridMultilevel"/>
     <w:tmpl w:val="35623948"/>
@@ -18361,7 +19581,7 @@
       </w:rPr>
     </w:lvl>
   </w:abstractNum>
-  <w:abstractNum w:abstractNumId="42" w15:restartNumberingAfterBreak="0">
+  <w:abstractNum w:abstractNumId="43" w15:restartNumberingAfterBreak="0">
     <w:nsid w:val="5D4F6D87"/>
     <w:multiLevelType w:val="hybridMultilevel"/>
     <w:tmpl w:val="31560EF2"/>
@@ -18474,7 +19694,7 @@
       </w:rPr>
     </w:lvl>
   </w:abstractNum>
-  <w:abstractNum w:abstractNumId="43" w15:restartNumberingAfterBreak="0">
+  <w:abstractNum w:abstractNumId="44" w15:restartNumberingAfterBreak="0">
     <w:nsid w:val="5D6419B4"/>
     <w:multiLevelType w:val="hybridMultilevel"/>
     <w:tmpl w:val="9502EB86"/>
@@ -18587,7 +19807,7 @@
       </w:rPr>
     </w:lvl>
   </w:abstractNum>
-  <w:abstractNum w:abstractNumId="44" w15:restartNumberingAfterBreak="0">
+  <w:abstractNum w:abstractNumId="45" w15:restartNumberingAfterBreak="0">
     <w:nsid w:val="5E0C45C0"/>
     <w:multiLevelType w:val="hybridMultilevel"/>
     <w:tmpl w:val="E4344C38"/>
@@ -18700,7 +19920,7 @@
       </w:rPr>
     </w:lvl>
   </w:abstractNum>
-  <w:abstractNum w:abstractNumId="45" w15:restartNumberingAfterBreak="0">
+  <w:abstractNum w:abstractNumId="46" w15:restartNumberingAfterBreak="0">
     <w:nsid w:val="5FE93FEF"/>
     <w:multiLevelType w:val="hybridMultilevel"/>
     <w:tmpl w:val="D1B6B766"/>
@@ -18813,7 +20033,7 @@
       </w:rPr>
     </w:lvl>
   </w:abstractNum>
-  <w:abstractNum w:abstractNumId="46" w15:restartNumberingAfterBreak="0">
+  <w:abstractNum w:abstractNumId="47" w15:restartNumberingAfterBreak="0">
     <w:nsid w:val="718E14BC"/>
     <w:multiLevelType w:val="hybridMultilevel"/>
     <w:tmpl w:val="4A40DAF4"/>
@@ -18926,7 +20146,7 @@
       </w:rPr>
     </w:lvl>
   </w:abstractNum>
-  <w:abstractNum w:abstractNumId="47" w15:restartNumberingAfterBreak="0">
+  <w:abstractNum w:abstractNumId="48" w15:restartNumberingAfterBreak="0">
     <w:nsid w:val="7246266F"/>
     <w:multiLevelType w:val="hybridMultilevel"/>
     <w:tmpl w:val="2688AFDC"/>
@@ -19038,7 +20258,7 @@
       </w:rPr>
     </w:lvl>
   </w:abstractNum>
-  <w:abstractNum w:abstractNumId="48" w15:restartNumberingAfterBreak="0">
+  <w:abstractNum w:abstractNumId="49" w15:restartNumberingAfterBreak="0">
     <w:nsid w:val="735A1FAB"/>
     <w:multiLevelType w:val="hybridMultilevel"/>
     <w:tmpl w:val="5002E46A"/>
@@ -19151,7 +20371,7 @@
       </w:rPr>
     </w:lvl>
   </w:abstractNum>
-  <w:abstractNum w:abstractNumId="49" w15:restartNumberingAfterBreak="0">
+  <w:abstractNum w:abstractNumId="50" w15:restartNumberingAfterBreak="0">
     <w:nsid w:val="74CC7D1E"/>
     <w:multiLevelType w:val="hybridMultilevel"/>
     <w:tmpl w:val="CB52A886"/>
@@ -19264,7 +20484,7 @@
       </w:rPr>
     </w:lvl>
   </w:abstractNum>
-  <w:abstractNum w:abstractNumId="50" w15:restartNumberingAfterBreak="0">
+  <w:abstractNum w:abstractNumId="51" w15:restartNumberingAfterBreak="0">
     <w:nsid w:val="76736577"/>
     <w:multiLevelType w:val="hybridMultilevel"/>
     <w:tmpl w:val="2F4E4AC4"/>
@@ -19377,7 +20597,7 @@
       </w:rPr>
     </w:lvl>
   </w:abstractNum>
-  <w:abstractNum w:abstractNumId="51" w15:restartNumberingAfterBreak="0">
+  <w:abstractNum w:abstractNumId="52" w15:restartNumberingAfterBreak="0">
     <w:nsid w:val="76C35753"/>
     <w:multiLevelType w:val="hybridMultilevel"/>
     <w:tmpl w:val="B51A4972"/>
@@ -19500,7 +20720,7 @@
     <w:abstractNumId w:val="11"/>
   </w:num>
   <w:num w:numId="4" w16cid:durableId="1024750155">
-    <w:abstractNumId w:val="49"/>
+    <w:abstractNumId w:val="50"/>
   </w:num>
   <w:num w:numId="5" w16cid:durableId="898319901">
     <w:abstractNumId w:val="5"/>
@@ -19509,28 +20729,28 @@
     <w:abstractNumId w:val="18"/>
   </w:num>
   <w:num w:numId="7" w16cid:durableId="260258610">
-    <w:abstractNumId w:val="33"/>
+    <w:abstractNumId w:val="34"/>
   </w:num>
   <w:num w:numId="8" w16cid:durableId="393628058">
-    <w:abstractNumId w:val="38"/>
+    <w:abstractNumId w:val="39"/>
   </w:num>
   <w:num w:numId="9" w16cid:durableId="1881823539">
-    <w:abstractNumId w:val="39"/>
+    <w:abstractNumId w:val="40"/>
   </w:num>
   <w:num w:numId="10" w16cid:durableId="911279698">
     <w:abstractNumId w:val="22"/>
   </w:num>
   <w:num w:numId="11" w16cid:durableId="1526747176">
-    <w:abstractNumId w:val="40"/>
+    <w:abstractNumId w:val="41"/>
   </w:num>
   <w:num w:numId="12" w16cid:durableId="1739357221">
-    <w:abstractNumId w:val="47"/>
+    <w:abstractNumId w:val="48"/>
   </w:num>
   <w:num w:numId="13" w16cid:durableId="1164128801">
-    <w:abstractNumId w:val="41"/>
+    <w:abstractNumId w:val="42"/>
   </w:num>
   <w:num w:numId="14" w16cid:durableId="326247330">
-    <w:abstractNumId w:val="32"/>
+    <w:abstractNumId w:val="33"/>
   </w:num>
   <w:num w:numId="15" w16cid:durableId="2086416327">
     <w:abstractNumId w:val="16"/>
@@ -19563,10 +20783,10 @@
     <w:abstractNumId w:val="23"/>
   </w:num>
   <w:num w:numId="25" w16cid:durableId="527184220">
-    <w:abstractNumId w:val="42"/>
+    <w:abstractNumId w:val="43"/>
   </w:num>
   <w:num w:numId="26" w16cid:durableId="1814328372">
-    <w:abstractNumId w:val="26"/>
+    <w:abstractNumId w:val="27"/>
   </w:num>
   <w:num w:numId="27" w16cid:durableId="1167554190">
     <w:abstractNumId w:val="1"/>
@@ -19578,16 +20798,16 @@
     <w:abstractNumId w:val="17"/>
   </w:num>
   <w:num w:numId="30" w16cid:durableId="2073457653">
-    <w:abstractNumId w:val="35"/>
+    <w:abstractNumId w:val="36"/>
   </w:num>
   <w:num w:numId="31" w16cid:durableId="1131899672">
-    <w:abstractNumId w:val="34"/>
+    <w:abstractNumId w:val="35"/>
   </w:num>
   <w:num w:numId="32" w16cid:durableId="519701975">
     <w:abstractNumId w:val="20"/>
   </w:num>
   <w:num w:numId="33" w16cid:durableId="761491725">
-    <w:abstractNumId w:val="43"/>
+    <w:abstractNumId w:val="44"/>
   </w:num>
   <w:num w:numId="34" w16cid:durableId="999776913">
     <w:abstractNumId w:val="25"/>
@@ -19596,55 +20816,58 @@
     <w:abstractNumId w:val="10"/>
   </w:num>
   <w:num w:numId="36" w16cid:durableId="1567883265">
-    <w:abstractNumId w:val="44"/>
+    <w:abstractNumId w:val="45"/>
   </w:num>
   <w:num w:numId="37" w16cid:durableId="1724791897">
-    <w:abstractNumId w:val="48"/>
+    <w:abstractNumId w:val="49"/>
   </w:num>
   <w:num w:numId="38" w16cid:durableId="57944614">
-    <w:abstractNumId w:val="29"/>
+    <w:abstractNumId w:val="30"/>
   </w:num>
   <w:num w:numId="39" w16cid:durableId="476842001">
     <w:abstractNumId w:val="8"/>
   </w:num>
   <w:num w:numId="40" w16cid:durableId="671758587">
-    <w:abstractNumId w:val="28"/>
+    <w:abstractNumId w:val="29"/>
   </w:num>
   <w:num w:numId="41" w16cid:durableId="1708990977">
-    <w:abstractNumId w:val="36"/>
+    <w:abstractNumId w:val="37"/>
   </w:num>
   <w:num w:numId="42" w16cid:durableId="1076246991">
-    <w:abstractNumId w:val="51"/>
+    <w:abstractNumId w:val="52"/>
   </w:num>
   <w:num w:numId="43" w16cid:durableId="1719627268">
-    <w:abstractNumId w:val="46"/>
+    <w:abstractNumId w:val="47"/>
   </w:num>
   <w:num w:numId="44" w16cid:durableId="573390596">
-    <w:abstractNumId w:val="37"/>
+    <w:abstractNumId w:val="38"/>
   </w:num>
   <w:num w:numId="45" w16cid:durableId="369497029">
     <w:abstractNumId w:val="7"/>
   </w:num>
   <w:num w:numId="46" w16cid:durableId="61369886">
-    <w:abstractNumId w:val="30"/>
+    <w:abstractNumId w:val="31"/>
   </w:num>
   <w:num w:numId="47" w16cid:durableId="1193300826">
-    <w:abstractNumId w:val="45"/>
+    <w:abstractNumId w:val="46"/>
   </w:num>
   <w:num w:numId="48" w16cid:durableId="1977560091">
-    <w:abstractNumId w:val="31"/>
+    <w:abstractNumId w:val="32"/>
   </w:num>
   <w:num w:numId="49" w16cid:durableId="1097094340">
     <w:abstractNumId w:val="19"/>
   </w:num>
   <w:num w:numId="50" w16cid:durableId="498546303">
-    <w:abstractNumId w:val="50"/>
+    <w:abstractNumId w:val="51"/>
   </w:num>
   <w:num w:numId="51" w16cid:durableId="785394174">
-    <w:abstractNumId w:val="27"/>
+    <w:abstractNumId w:val="28"/>
   </w:num>
   <w:num w:numId="52" w16cid:durableId="542064420">
     <w:abstractNumId w:val="3"/>
+  </w:num>
+  <w:num w:numId="53" w16cid:durableId="546650079">
+    <w:abstractNumId w:val="26"/>
   </w:num>
 </w:numbering>
 </file>
@@ -20796,6 +22019,29 @@
       <w14:ligatures w14:val="none"/>
     </w:rPr>
   </w:style>
+  <w:style w:type="character" w:styleId="Hyperlink">
+    <w:name w:val="Hyperlink"/>
+    <w:basedOn w:val="DefaultParagraphFont"/>
+    <w:uiPriority w:val="99"/>
+    <w:unhideWhenUsed/>
+    <w:rsid w:val="00885044"/>
+    <w:rPr>
+      <w:color w:val="0563C1" w:themeColor="hyperlink"/>
+      <w:u w:val="single"/>
+    </w:rPr>
+  </w:style>
+  <w:style w:type="character" w:styleId="UnresolvedMention">
+    <w:name w:val="Unresolved Mention"/>
+    <w:basedOn w:val="DefaultParagraphFont"/>
+    <w:uiPriority w:val="99"/>
+    <w:semiHidden/>
+    <w:unhideWhenUsed/>
+    <w:rsid w:val="00885044"/>
+    <w:rPr>
+      <w:color w:val="605E5C"/>
+      <w:shd w:val="clear" w:color="auto" w:fill="E1DFDD"/>
+    </w:rPr>
+  </w:style>
 </w:styles>
 </file>
 

</xml_diff>